<commit_message>
docs: refresh product acceptance Word document
</commit_message>
<xml_diff>
--- a/docs/DC_SAAS_CRYPTO_PRODUCT_AND_ACCEPTANCE_20260829.zh-CN.docx
+++ b/docs/DC_SAAS_CRYPTO_PRODUCT_AND_ACCEPTANCE_20260829.zh-CN.docx
@@ -520,6 +520,141 @@
           <w:sz w:val="21"/>
         </w:rPr>
         <w:t>页面使用 HTTP，浏览器显示“不安全”是测试环境预期；生产必须启用 HTTPS、HSTS 和可信域名证书。</w:t>
+      </w:r>
+    </w:p>
+    <w:p>
+      <w:pPr>
+        <w:pStyle w:val="Heading2"/>
+      </w:pPr>
+      <w:r>
+        <w:rPr>
+          <w:rFonts w:ascii="Microsoft YaHei" w:hAnsi="Microsoft YaHei" w:eastAsia="Microsoft YaHei"/>
+          <w:sz w:val="28"/>
+        </w:rPr>
+        <w:t>3.1 专业交易工作区</w:t>
+      </w:r>
+    </w:p>
+    <w:p>
+      <w:r>
+        <w:rPr>
+          <w:rFonts w:ascii="Microsoft YaHei" w:hAnsi="Microsoft YaHei" w:eastAsia="Microsoft YaHei"/>
+          <w:sz w:val="21"/>
+        </w:rPr>
+        <w:t>交易端采用专业 USDT 永续合约工作区，保留本系统现有业务字段和服务接口：</w:t>
+      </w:r>
+    </w:p>
+    <w:p>
+      <w:pPr>
+        <w:pStyle w:val="ListBullet"/>
+      </w:pPr>
+      <w:r>
+        <w:rPr>
+          <w:rFonts w:ascii="Microsoft YaHei" w:hAnsi="Microsoft YaHei" w:eastAsia="Microsoft YaHei"/>
+          <w:sz w:val="21"/>
+        </w:rPr>
+        <w:t>K 线图、订单簿/最近成交、下单、持仓/委托/成交和账户资产共五类面板。</w:t>
+      </w:r>
+    </w:p>
+    <w:p>
+      <w:pPr>
+        <w:pStyle w:val="ListBullet"/>
+      </w:pPr>
+      <w:r>
+        <w:rPr>
+          <w:rFonts w:ascii="Microsoft YaHei" w:hAnsi="Microsoft YaHei" w:eastAsia="Microsoft YaHei"/>
+          <w:sz w:val="21"/>
+        </w:rPr>
+        <w:t>桌面端支持拖动、缩放和自动重排；可以锁定布局防止交易时误操作，也可以一键恢复默认布局。</w:t>
+      </w:r>
+    </w:p>
+    <w:p>
+      <w:pPr>
+        <w:pStyle w:val="ListBullet"/>
+      </w:pPr>
+      <w:r>
+        <w:rPr>
+          <w:rFonts w:ascii="Microsoft YaHei" w:hAnsi="Microsoft YaHei" w:eastAsia="Microsoft YaHei"/>
+          <w:sz w:val="21"/>
+        </w:rPr>
+        <w:t>布局按</w:t>
+      </w:r>
+      <w:r>
+        <w:rPr>
+          <w:rFonts w:ascii="Consolas" w:hAnsi="Consolas" w:eastAsia="Consolas"/>
+          <w:color w:val="171B26"/>
+          <w:sz w:val="19"/>
+        </w:rPr>
+        <w:t>location + user_id</w:t>
+      </w:r>
+      <w:r>
+        <w:rPr>
+          <w:rFonts w:ascii="Microsoft YaHei" w:hAnsi="Microsoft YaHei" w:eastAsia="Microsoft YaHei"/>
+          <w:sz w:val="21"/>
+        </w:rPr>
+        <w:t>保存在浏览器本地，刷新后恢复，不同租户和用户互不共享。</w:t>
+      </w:r>
+    </w:p>
+    <w:p>
+      <w:pPr>
+        <w:pStyle w:val="ListBullet"/>
+      </w:pPr>
+      <w:r>
+        <w:rPr>
+          <w:rFonts w:ascii="Microsoft YaHei" w:hAnsi="Microsoft YaHei" w:eastAsia="Microsoft YaHei"/>
+          <w:sz w:val="21"/>
+        </w:rPr>
+        <w:t>支持中文和英文切换；行情、下单、表头、方向、订单类型和状态随语言变化，协议标识保持原值。</w:t>
+      </w:r>
+    </w:p>
+    <w:p>
+      <w:pPr>
+        <w:pStyle w:val="ListBullet"/>
+      </w:pPr>
+      <w:r>
+        <w:rPr>
+          <w:rFonts w:ascii="Microsoft YaHei" w:hAnsi="Microsoft YaHei" w:eastAsia="Microsoft YaHei"/>
+          <w:sz w:val="21"/>
+        </w:rPr>
+        <w:t>使用深色层级、专业买卖色、紧凑表格和响应式断点，功能布局参考主流永续合约交易终端，但不复制其品牌和专有素材。</w:t>
+      </w:r>
+    </w:p>
+    <w:p>
+      <w:r>
+        <w:rPr>
+          <w:rFonts w:ascii="Microsoft YaHei" w:hAnsi="Microsoft YaHei" w:eastAsia="Microsoft YaHei"/>
+          <w:sz w:val="21"/>
+        </w:rPr>
+        <w:t>Web 源码提交为</w:t>
+      </w:r>
+      <w:r>
+        <w:rPr>
+          <w:rFonts w:ascii="Consolas" w:hAnsi="Consolas" w:eastAsia="Consolas"/>
+          <w:color w:val="171B26"/>
+          <w:sz w:val="19"/>
+        </w:rPr>
+        <w:t>d933d09</w:t>
+      </w:r>
+      <w:r>
+        <w:rPr>
+          <w:rFonts w:ascii="Microsoft YaHei" w:hAnsi="Microsoft YaHei" w:eastAsia="Microsoft YaHei"/>
+          <w:sz w:val="21"/>
+        </w:rPr>
+        <w:t>，公开镜像为</w:t>
+      </w:r>
+      <w:r>
+        <w:rPr>
+          <w:rFonts w:ascii="Consolas" w:hAnsi="Consolas" w:eastAsia="Consolas"/>
+          <w:color w:val="171B26"/>
+          <w:sz w:val="19"/>
+        </w:rPr>
+        <w:t>ghcr.io/bliplink/dc-saas-trade-web@sha256:c7511bcd35c4d30b53cba27583b0a6f764015812c87d69d0f1e388554baae5f6</w:t>
+      </w:r>
+      <w:r>
+        <w:rPr>
+          <w:rFonts w:ascii="Microsoft YaHei" w:hAnsi="Microsoft YaHei" w:eastAsia="Microsoft YaHei"/>
+          <w:sz w:val="21"/>
+        </w:rPr>
+        <w:t>。生产构建和公开拉取验证已通过；64 环境的新界面部署、浏览器自动化和截图将在本轮环境恢复后补充到最终证据。</w:t>
       </w:r>
     </w:p>
     <w:p>

</xml_diff>

<commit_message>
docs(web): publish bilingual login evidence
</commit_message>
<xml_diff>
--- a/docs/DC_SAAS_CRYPTO_PRODUCT_AND_ACCEPTANCE_20260829.zh-CN.docx
+++ b/docs/DC_SAAS_CRYPTO_PRODUCT_AND_ACCEPTANCE_20260829.zh-CN.docx
@@ -75,9 +75,9 @@
           <w:color w:val="171B26"/>
           <w:sz w:val="22"/>
         </w:rPr>
-        <w:t>版本：V1.0</w:t>
+        <w:t>版本：V1.1</w:t>
         <w:br/>
-        <w:t>基线：2026-08-29</w:t>
+        <w:t>基线：2026-08-30</w:t>
         <w:br/>
         <w:t>分支：saas-crypto</w:t>
         <w:br/>
@@ -632,7 +632,7 @@
           <w:color w:val="171B26"/>
           <w:sz w:val="19"/>
         </w:rPr>
-        <w:t>d933d09</w:t>
+        <w:t>0e71570f84ef18a6c2804fd70d980d7a133c86ea</w:t>
       </w:r>
       <w:r>
         <w:rPr>
@@ -647,14 +647,14 @@
           <w:color w:val="171B26"/>
           <w:sz w:val="19"/>
         </w:rPr>
-        <w:t>ghcr.io/bliplink/dc-saas-trade-web@sha256:c7511bcd35c4d30b53cba27583b0a6f764015812c87d69d0f1e388554baae5f6</w:t>
+        <w:t>ghcr.io/bliplink/dc-saas-trade-web@sha256:f8d6223d0f0ba8f0153a28850f76c597ffddcf9dfd93e726c85ba337143145c1</w:t>
       </w:r>
       <w:r>
         <w:rPr>
           <w:rFonts w:ascii="Microsoft YaHei" w:hAnsi="Microsoft YaHei" w:eastAsia="Microsoft YaHei"/>
           <w:sz w:val="21"/>
         </w:rPr>
-        <w:t>。生产构建和公开拉取验证已通过；64 环境的新界面部署、浏览器自动化和截图将在本轮环境恢复后补充到最终证据。</w:t>
+        <w:t>。生产构建、公开镜像构建和匿名拉取验证已通过；本地生产构建截图已归档。64 环境的新界面部署、浏览器自动化和远端截图仍需等待主机 SSH 恢复后补充，不能用本地截图替代远端验收结论。</w:t>
       </w:r>
     </w:p>
     <w:p>
@@ -8265,7 +8265,7 @@
           <w:rFonts w:ascii="Microsoft YaHei" w:hAnsi="Microsoft YaHei" w:eastAsia="Microsoft YaHei"/>
           <w:sz w:val="28"/>
         </w:rPr>
-        <w:t>13.1 Web 交易界面</w:t>
+        <w:t>13.1 新版双语登录页（本地生产构建）</w:t>
       </w:r>
     </w:p>
     <w:p>
@@ -8276,7 +8276,7 @@
       <w:r>
         <w:drawing>
           <wp:inline xmlns:a="http://schemas.openxmlformats.org/drawingml/2006/main" xmlns:pic="http://schemas.openxmlformats.org/drawingml/2006/picture">
-            <wp:extent cx="5897880" cy="3317558"/>
+            <wp:extent cx="5897880" cy="4095750"/>
             <wp:docPr id="1" name="Picture 1"/>
             <wp:cNvGraphicFramePr>
               <a:graphicFrameLocks noChangeAspect="1"/>
@@ -8285,7 +8285,7 @@
               <a:graphicData uri="http://schemas.openxmlformats.org/drawingml/2006/picture">
                 <pic:pic>
                   <pic:nvPicPr>
-                    <pic:cNvPr id="0" name="buyer-trading-flow.png"/>
+                    <pic:cNvPr id="0" name="login-professional-en.png"/>
                     <pic:cNvPicPr/>
                   </pic:nvPicPr>
                   <pic:blipFill>
@@ -8297,7 +8297,7 @@
                   <pic:spPr>
                     <a:xfrm>
                       <a:off x="0" y="0"/>
-                      <a:ext cx="5897880" cy="3317558"/>
+                      <a:ext cx="5897880" cy="4095750"/>
                     </a:xfrm>
                     <a:prstGeom prst="rect"/>
                   </pic:spPr>
@@ -8319,7 +8319,7 @@
           <w:color w:val="667085"/>
           <w:sz w:val="17"/>
         </w:rPr>
-        <w:t>图：Web 交易界面、最近成交、账户资金和下单区域</w:t>
+        <w:t>图：新版专业深色英文登录页</w:t>
       </w:r>
     </w:p>
     <w:p>
@@ -8331,7 +8331,7 @@
           <w:rFonts w:ascii="Microsoft YaHei" w:hAnsi="Microsoft YaHei" w:eastAsia="Microsoft YaHei"/>
           <w:sz w:val="28"/>
         </w:rPr>
-        <w:t>13.2 Web 第二会话/订单簿界面</w:t>
+        <w:t>13.2 Web 交易界面（64 环境历史核心验收）</w:t>
       </w:r>
     </w:p>
     <w:p>
@@ -8351,7 +8351,7 @@
               <a:graphicData uri="http://schemas.openxmlformats.org/drawingml/2006/picture">
                 <pic:pic>
                   <pic:nvPicPr>
-                    <pic:cNvPr id="0" name="seller-trade-history.png"/>
+                    <pic:cNvPr id="0" name="buyer-trading-flow.png"/>
                     <pic:cNvPicPr/>
                   </pic:nvPicPr>
                   <pic:blipFill>
@@ -8385,7 +8385,7 @@
           <w:color w:val="667085"/>
           <w:sz w:val="17"/>
         </w:rPr>
-        <w:t>图：第二用户会话与订单簿界面</w:t>
+        <w:t>图：Web 交易界面、最近成交、账户资金和下单区域</w:t>
       </w:r>
     </w:p>
     <w:p>
@@ -8397,7 +8397,73 @@
           <w:rFonts w:ascii="Microsoft YaHei" w:hAnsi="Microsoft YaHei" w:eastAsia="Microsoft YaHei"/>
           <w:sz w:val="28"/>
         </w:rPr>
-        <w:t>13.3 MySQL、ClickHouse 与容器证据</w:t>
+        <w:t>13.3 Web 第二会话/订单簿界面（64 环境历史核心验收）</w:t>
+      </w:r>
+    </w:p>
+    <w:p>
+      <w:pPr>
+        <w:keepLines/>
+        <w:jc w:val="center"/>
+      </w:pPr>
+      <w:r>
+        <w:drawing>
+          <wp:inline xmlns:a="http://schemas.openxmlformats.org/drawingml/2006/main" xmlns:pic="http://schemas.openxmlformats.org/drawingml/2006/picture">
+            <wp:extent cx="5897880" cy="3317558"/>
+            <wp:docPr id="3" name="Picture 3"/>
+            <wp:cNvGraphicFramePr>
+              <a:graphicFrameLocks noChangeAspect="1"/>
+            </wp:cNvGraphicFramePr>
+            <a:graphic>
+              <a:graphicData uri="http://schemas.openxmlformats.org/drawingml/2006/picture">
+                <pic:pic>
+                  <pic:nvPicPr>
+                    <pic:cNvPr id="0" name="seller-trade-history.png"/>
+                    <pic:cNvPicPr/>
+                  </pic:nvPicPr>
+                  <pic:blipFill>
+                    <a:blip r:embed="rId13"/>
+                    <a:stretch>
+                      <a:fillRect/>
+                    </a:stretch>
+                  </pic:blipFill>
+                  <pic:spPr>
+                    <a:xfrm>
+                      <a:off x="0" y="0"/>
+                      <a:ext cx="5897880" cy="3317558"/>
+                    </a:xfrm>
+                    <a:prstGeom prst="rect"/>
+                  </pic:spPr>
+                </pic:pic>
+              </a:graphicData>
+            </a:graphic>
+          </wp:inline>
+        </w:drawing>
+      </w:r>
+    </w:p>
+    <w:p>
+      <w:pPr>
+        <w:spacing w:after="160"/>
+        <w:jc w:val="center"/>
+      </w:pPr>
+      <w:r>
+        <w:rPr>
+          <w:rFonts w:ascii="Microsoft YaHei" w:hAnsi="Microsoft YaHei" w:eastAsia="Microsoft YaHei"/>
+          <w:color w:val="667085"/>
+          <w:sz w:val="17"/>
+        </w:rPr>
+        <w:t>图：第二用户会话与订单簿界面</w:t>
+      </w:r>
+    </w:p>
+    <w:p>
+      <w:pPr>
+        <w:pStyle w:val="Heading2"/>
+      </w:pPr>
+      <w:r>
+        <w:rPr>
+          <w:rFonts w:ascii="Microsoft YaHei" w:hAnsi="Microsoft YaHei" w:eastAsia="Microsoft YaHei"/>
+          <w:sz w:val="28"/>
+        </w:rPr>
+        <w:t>13.4 MySQL、ClickHouse 与容器证据（64 环境历史核心验收）</w:t>
       </w:r>
     </w:p>
     <w:p>
@@ -8409,7 +8475,7 @@
         <w:drawing>
           <wp:inline xmlns:a="http://schemas.openxmlformats.org/drawingml/2006/main" xmlns:pic="http://schemas.openxmlformats.org/drawingml/2006/picture">
             <wp:extent cx="5344410" cy="7498080"/>
-            <wp:docPr id="3" name="Picture 3"/>
+            <wp:docPr id="4" name="Picture 4"/>
             <wp:cNvGraphicFramePr>
               <a:graphicFrameLocks noChangeAspect="1"/>
             </wp:cNvGraphicFramePr>
@@ -8421,7 +8487,7 @@
                     <pic:cNvPicPr/>
                   </pic:nvPicPr>
                   <pic:blipFill>
-                    <a:blip r:embed="rId13"/>
+                    <a:blip r:embed="rId14"/>
                     <a:stretch>
                       <a:fillRect/>
                     </a:stretch>
@@ -8461,6 +8527,34 @@
           <w:sz w:val="21"/>
         </w:rPr>
         <w:t>证据 SHA-256：</w:t>
+      </w:r>
+    </w:p>
+    <w:p>
+      <w:pPr>
+        <w:pStyle w:val="ListBullet"/>
+      </w:pPr>
+      <w:r>
+        <w:rPr>
+          <w:rFonts w:ascii="Consolas" w:hAnsi="Consolas" w:eastAsia="Consolas"/>
+          <w:color w:val="171B26"/>
+          <w:sz w:val="19"/>
+        </w:rPr>
+        <w:t>login-professional-en.png</w:t>
+      </w:r>
+      <w:r>
+        <w:rPr>
+          <w:rFonts w:ascii="Microsoft YaHei" w:hAnsi="Microsoft YaHei" w:eastAsia="Microsoft YaHei"/>
+          <w:sz w:val="21"/>
+        </w:rPr>
+        <w:t>：</w:t>
+      </w:r>
+      <w:r>
+        <w:rPr>
+          <w:rFonts w:ascii="Consolas" w:hAnsi="Consolas" w:eastAsia="Consolas"/>
+          <w:color w:val="171B26"/>
+          <w:sz w:val="19"/>
+        </w:rPr>
+        <w:t>60ba9c4dbbb0645bf748d07ba4c6be904c526445b3f861e09a1afe8cad3e3aef</w:t>
       </w:r>
     </w:p>
     <w:p>

</xml_diff>

<commit_message>
docs(web): record hardened terminal image
</commit_message>
<xml_diff>
--- a/docs/DC_SAAS_CRYPTO_PRODUCT_AND_ACCEPTANCE_20260829.zh-CN.docx
+++ b/docs/DC_SAAS_CRYPTO_PRODUCT_AND_ACCEPTANCE_20260829.zh-CN.docx
@@ -615,6 +615,18 @@
           <w:rFonts w:ascii="Microsoft YaHei" w:hAnsi="Microsoft YaHei" w:eastAsia="Microsoft YaHei"/>
           <w:sz w:val="21"/>
         </w:rPr>
+        <w:t>顶部行情条突出展示最新成交价，并按涨跌方向着色；下单区在请求发出前校验数量、限价和触发价必须为正数。</w:t>
+      </w:r>
+    </w:p>
+    <w:p>
+      <w:pPr>
+        <w:pStyle w:val="ListBullet"/>
+      </w:pPr>
+      <w:r>
+        <w:rPr>
+          <w:rFonts w:ascii="Microsoft YaHei" w:hAnsi="Microsoft YaHei" w:eastAsia="Microsoft YaHei"/>
+          <w:sz w:val="21"/>
+        </w:rPr>
         <w:t>使用深色层级、专业买卖色、紧凑表格和响应式断点，功能布局参考主流永续合约交易终端，但不复制其品牌和专有素材。</w:t>
       </w:r>
     </w:p>
@@ -632,7 +644,7 @@
           <w:color w:val="171B26"/>
           <w:sz w:val="19"/>
         </w:rPr>
-        <w:t>0e71570f84ef18a6c2804fd70d980d7a133c86ea</w:t>
+        <w:t>b5b29ae7586ea8572cf9263458d2799a7a18ecce</w:t>
       </w:r>
       <w:r>
         <w:rPr>
@@ -647,7 +659,7 @@
           <w:color w:val="171B26"/>
           <w:sz w:val="19"/>
         </w:rPr>
-        <w:t>ghcr.io/bliplink/dc-saas-trade-web@sha256:f8d6223d0f0ba8f0153a28850f76c597ffddcf9dfd93e726c85ba337143145c1</w:t>
+        <w:t>ghcr.io/bliplink/dc-saas-trade-web@sha256:d3b51066e83ac08c74dba44cba12432c2706070f2af3e6dbd67d2e84d357fb92</w:t>
       </w:r>
       <w:r>
         <w:rPr>

</xml_diff>

<commit_message>
docs(web): record websocket lifecycle image
</commit_message>
<xml_diff>
--- a/docs/DC_SAAS_CRYPTO_PRODUCT_AND_ACCEPTANCE_20260829.zh-CN.docx
+++ b/docs/DC_SAAS_CRYPTO_PRODUCT_AND_ACCEPTANCE_20260829.zh-CN.docx
@@ -627,6 +627,18 @@
           <w:rFonts w:ascii="Microsoft YaHei" w:hAnsi="Microsoft YaHei" w:eastAsia="Microsoft YaHei"/>
           <w:sz w:val="21"/>
         </w:rPr>
+        <w:t>切换品种和离开交易页时统一释放订单、成交、持仓、资金、订单簿和行情 WebSocket 订阅，防止重复回报与无效取消订阅异常。</w:t>
+      </w:r>
+    </w:p>
+    <w:p>
+      <w:pPr>
+        <w:pStyle w:val="ListBullet"/>
+      </w:pPr>
+      <w:r>
+        <w:rPr>
+          <w:rFonts w:ascii="Microsoft YaHei" w:hAnsi="Microsoft YaHei" w:eastAsia="Microsoft YaHei"/>
+          <w:sz w:val="21"/>
+        </w:rPr>
         <w:t>使用深色层级、专业买卖色、紧凑表格和响应式断点，功能布局参考主流永续合约交易终端，但不复制其品牌和专有素材。</w:t>
       </w:r>
     </w:p>
@@ -644,7 +656,7 @@
           <w:color w:val="171B26"/>
           <w:sz w:val="19"/>
         </w:rPr>
-        <w:t>b5b29ae7586ea8572cf9263458d2799a7a18ecce</w:t>
+        <w:t>b3f278cd3aef49b1445c1e98b95e77b9481f4484</w:t>
       </w:r>
       <w:r>
         <w:rPr>
@@ -659,7 +671,7 @@
           <w:color w:val="171B26"/>
           <w:sz w:val="19"/>
         </w:rPr>
-        <w:t>ghcr.io/bliplink/dc-saas-trade-web@sha256:d3b51066e83ac08c74dba44cba12432c2706070f2af3e6dbd67d2e84d357fb92</w:t>
+        <w:t>ghcr.io/bliplink/dc-saas-trade-web@sha256:19fc4c4b4d55b29d6db75a6279a8e89993405e7d53f6f7e79140568cba161b2d</w:t>
       </w:r>
       <w:r>
         <w:rPr>

</xml_diff>

<commit_message>
docs: record searchable web release and 105 target
</commit_message>
<xml_diff>
--- a/docs/DC_SAAS_CRYPTO_PRODUCT_AND_ACCEPTANCE_20260829.zh-CN.docx
+++ b/docs/DC_SAAS_CRYPTO_PRODUCT_AND_ACCEPTANCE_20260829.zh-CN.docx
@@ -444,7 +444,7 @@
           <w:rFonts w:ascii="Microsoft YaHei" w:hAnsi="Microsoft YaHei" w:eastAsia="Microsoft YaHei"/>
           <w:sz w:val="21"/>
         </w:rPr>
-        <w:t>Web 地址：</w:t>
+        <w:t>下一验收 Web 地址：</w:t>
       </w:r>
       <w:r>
         <w:rPr>
@@ -452,7 +452,14 @@
           <w:color w:val="171B26"/>
           <w:sz w:val="19"/>
         </w:rPr>
-        <w:t>http://172.16.97.64:18088/#/login?location=CORE_E2E</w:t>
+        <w:t>http://172.16.97.105:18088/#/login?location=CORE_E2E</w:t>
+      </w:r>
+      <w:r>
+        <w:rPr>
+          <w:rFonts w:ascii="Microsoft YaHei" w:hAnsi="Microsoft YaHei" w:eastAsia="Microsoft YaHei"/>
+          <w:sz w:val="21"/>
+        </w:rPr>
+        <w:t>（部署完成后启用）</w:t>
       </w:r>
     </w:p>
     <w:p>
@@ -627,6 +634,18 @@
           <w:rFonts w:ascii="Microsoft YaHei" w:hAnsi="Microsoft YaHei" w:eastAsia="Microsoft YaHei"/>
           <w:sz w:val="21"/>
         </w:rPr>
+        <w:t>市场抽屉支持中英文搜索和空结果提示；选择品种时直接使用服务数据中的交易对代码，不依赖 DOM 文本反解析。</w:t>
+      </w:r>
+    </w:p>
+    <w:p>
+      <w:pPr>
+        <w:pStyle w:val="ListBullet"/>
+      </w:pPr>
+      <w:r>
+        <w:rPr>
+          <w:rFonts w:ascii="Microsoft YaHei" w:hAnsi="Microsoft YaHei" w:eastAsia="Microsoft YaHei"/>
+          <w:sz w:val="21"/>
+        </w:rPr>
         <w:t>切换品种和离开交易页时统一释放订单、成交、持仓、资金、订单簿和行情 WebSocket 订阅，防止重复回报与无效取消订阅异常。</w:t>
       </w:r>
     </w:p>
@@ -656,7 +675,7 @@
           <w:color w:val="171B26"/>
           <w:sz w:val="19"/>
         </w:rPr>
-        <w:t>b3f278cd3aef49b1445c1e98b95e77b9481f4484</w:t>
+        <w:t>d65a0761e0f7c6d8efc7a2153f1cdbb4bf247d41</w:t>
       </w:r>
       <w:r>
         <w:rPr>
@@ -671,14 +690,14 @@
           <w:color w:val="171B26"/>
           <w:sz w:val="19"/>
         </w:rPr>
-        <w:t>ghcr.io/bliplink/dc-saas-trade-web@sha256:19fc4c4b4d55b29d6db75a6279a8e89993405e7d53f6f7e79140568cba161b2d</w:t>
+        <w:t>ghcr.io/bliplink/dc-saas-trade-web@sha256:26eb5ec02f619398bc72da0562bdef5920f5a15de8b8a65c0f4fbdd3c7954c47</w:t>
       </w:r>
       <w:r>
         <w:rPr>
           <w:rFonts w:ascii="Microsoft YaHei" w:hAnsi="Microsoft YaHei" w:eastAsia="Microsoft YaHei"/>
           <w:sz w:val="21"/>
         </w:rPr>
-        <w:t>。生产构建、公开镜像构建和匿名拉取验证已通过；本地生产构建截图已归档。64 环境的新界面部署、浏览器自动化和远端截图仍需等待主机 SSH 恢复后补充，不能用本地截图替代远端验收结论。</w:t>
+        <w:t>。生产构建、公开镜像构建和匿名拉取验证已通过；本地生产构建截图已归档。下一步在 105 环境完成新界面部署、浏览器自动化和远端截图，不能用本地截图替代远端验收结论。</w:t>
       </w:r>
     </w:p>
     <w:p>

</xml_diff>

<commit_message>
docs(acceptance): publish production trading evidence and report
</commit_message>
<xml_diff>
--- a/docs/DC_SAAS_CRYPTO_PRODUCT_AND_ACCEPTANCE_20260829.zh-CN.docx
+++ b/docs/DC_SAAS_CRYPTO_PRODUCT_AND_ACCEPTANCE_20260829.zh-CN.docx
@@ -162,7 +162,7 @@
           <w:rFonts w:ascii="Microsoft YaHei" w:hAnsi="Microsoft YaHei" w:eastAsia="Microsoft YaHei"/>
           <w:sz w:val="21"/>
         </w:rPr>
-        <w:t>本轮在 64 环境完成 17,100 个压力订单请求、11,400 条双方执行记录和 11,400 条成交资金流水的精确核对；峰值档为 3,000 个挂单、3,000 个 maker 单、3,000 个 taker 单，32 并发，全部成功。五个核心服务共 140 项单元测试全部通过，完整主机验收退出码为 0。</w:t>
+        <w:t>本轮在生产验证环境完成峰值档 3,000 个挂单、3,000 个 maker 单、3,000 个 taker 单、并发 32 的严格压力门禁：9,000 个订单请求、6,000 条双方执行记录和 6,000 条成交资金流水全部成功并精确核对，随后重启恢复和平仓归零。五个核心服务共 154 项单元测试全部通过。该轮同时发现并修复 TradeSvr 640 MiB cgroup OOM，以及超时重试未返回首次手续费/PnL 导致 OrderSvr 状态未收敛的问题；失败轮次保留为诊断证据，不计为通过。</w:t>
       </w:r>
     </w:p>
     <w:p>
@@ -420,7 +420,7 @@
           <w:rFonts w:ascii="Microsoft YaHei" w:hAnsi="Microsoft YaHei" w:eastAsia="Microsoft YaHei"/>
           <w:sz w:val="21"/>
         </w:rPr>
-        <w:t>RobotSvr 的正式 SaaS 部署；RobotSvr 架构已规划，但不在当前 64 环境 13 个核心容器内。</w:t>
+        <w:t>RobotSvr 的正式 SaaS 部署；RobotSvr 架构已规划，但不在当前生产验证环境 13 个核心容器内。</w:t>
       </w:r>
     </w:p>
     <w:p>
@@ -444,7 +444,7 @@
           <w:rFonts w:ascii="Microsoft YaHei" w:hAnsi="Microsoft YaHei" w:eastAsia="Microsoft YaHei"/>
           <w:sz w:val="21"/>
         </w:rPr>
-        <w:t>下一验收 Web 地址：</w:t>
+        <w:t>Web 地址：</w:t>
       </w:r>
       <w:r>
         <w:rPr>
@@ -452,14 +452,7 @@
           <w:color w:val="171B26"/>
           <w:sz w:val="19"/>
         </w:rPr>
-        <w:t>http://172.16.97.105:18088/#/login?location=CORE_E2E</w:t>
-      </w:r>
-      <w:r>
-        <w:rPr>
-          <w:rFonts w:ascii="Microsoft YaHei" w:hAnsi="Microsoft YaHei" w:eastAsia="Microsoft YaHei"/>
-          <w:sz w:val="21"/>
-        </w:rPr>
-        <w:t>（部署完成后启用）</w:t>
+        <w:t>http://18.140.45.126:18088/#/login?location=POSTFIX2_E2E</w:t>
       </w:r>
     </w:p>
     <w:p>
@@ -471,7 +464,7 @@
           <w:rFonts w:ascii="Microsoft YaHei" w:hAnsi="Microsoft YaHei" w:eastAsia="Microsoft YaHei"/>
           <w:sz w:val="21"/>
         </w:rPr>
-        <w:t>用户：</w:t>
+        <w:t>验收用户：</w:t>
       </w:r>
       <w:r>
         <w:rPr>
@@ -479,7 +472,7 @@
           <w:color w:val="171B26"/>
           <w:sz w:val="19"/>
         </w:rPr>
-        <w:t>corebuyer</w:t>
+        <w:t>p2buyer</w:t>
       </w:r>
       <w:r>
         <w:rPr>
@@ -494,7 +487,7 @@
           <w:color w:val="171B26"/>
           <w:sz w:val="19"/>
         </w:rPr>
-        <w:t>coreseller</w:t>
+        <w:t>p2seller</w:t>
       </w:r>
     </w:p>
     <w:p>
@@ -506,7 +499,76 @@
           <w:rFonts w:ascii="Microsoft YaHei" w:hAnsi="Microsoft YaHei" w:eastAsia="Microsoft YaHei"/>
           <w:sz w:val="21"/>
         </w:rPr>
-        <w:t>密码：</w:t>
+        <w:t>密码：使用部署时由运维设置的验收密码；文档不保存明文凭据。</w:t>
+      </w:r>
+    </w:p>
+    <w:p>
+      <w:pPr>
+        <w:pStyle w:val="ListBullet"/>
+      </w:pPr>
+      <w:r>
+        <w:rPr>
+          <w:rFonts w:ascii="Microsoft YaHei" w:hAnsi="Microsoft YaHei" w:eastAsia="Microsoft YaHei"/>
+          <w:sz w:val="21"/>
+        </w:rPr>
+        <w:t>页面使用 HTTP，浏览器显示“不安全”是测试环境预期；生产必须启用 HTTPS、HSTS 和可信域名证书。</w:t>
+      </w:r>
+    </w:p>
+    <w:p>
+      <w:pPr>
+        <w:pStyle w:val="Heading2"/>
+      </w:pPr>
+      <w:r>
+        <w:rPr>
+          <w:rFonts w:ascii="Microsoft YaHei" w:hAnsi="Microsoft YaHei" w:eastAsia="Microsoft YaHei"/>
+          <w:sz w:val="28"/>
+        </w:rPr>
+        <w:t>3.1 专业交易工作区</w:t>
+      </w:r>
+    </w:p>
+    <w:p>
+      <w:r>
+        <w:rPr>
+          <w:rFonts w:ascii="Microsoft YaHei" w:hAnsi="Microsoft YaHei" w:eastAsia="Microsoft YaHei"/>
+          <w:sz w:val="21"/>
+        </w:rPr>
+        <w:t>交易端采用专业 USDT 永续合约工作区，保留本系统现有业务字段和服务接口：</w:t>
+      </w:r>
+    </w:p>
+    <w:p>
+      <w:pPr>
+        <w:pStyle w:val="ListBullet"/>
+      </w:pPr>
+      <w:r>
+        <w:rPr>
+          <w:rFonts w:ascii="Microsoft YaHei" w:hAnsi="Microsoft YaHei" w:eastAsia="Microsoft YaHei"/>
+          <w:sz w:val="21"/>
+        </w:rPr>
+        <w:t>K 线图、订单簿/最近成交、下单、持仓/委托/成交和账户资产共五类面板。</w:t>
+      </w:r>
+    </w:p>
+    <w:p>
+      <w:pPr>
+        <w:pStyle w:val="ListBullet"/>
+      </w:pPr>
+      <w:r>
+        <w:rPr>
+          <w:rFonts w:ascii="Microsoft YaHei" w:hAnsi="Microsoft YaHei" w:eastAsia="Microsoft YaHei"/>
+          <w:sz w:val="21"/>
+        </w:rPr>
+        <w:t>桌面端支持拖动、缩放和自动重排；可以锁定布局防止交易时误操作，也可以一键恢复默认布局。</w:t>
+      </w:r>
+    </w:p>
+    <w:p>
+      <w:pPr>
+        <w:pStyle w:val="ListBullet"/>
+      </w:pPr>
+      <w:r>
+        <w:rPr>
+          <w:rFonts w:ascii="Microsoft YaHei" w:hAnsi="Microsoft YaHei" w:eastAsia="Microsoft YaHei"/>
+          <w:sz w:val="21"/>
+        </w:rPr>
+        <w:t>布局按</w:t>
       </w:r>
       <w:r>
         <w:rPr>
@@ -514,7 +576,14 @@
           <w:color w:val="171B26"/>
           <w:sz w:val="19"/>
         </w:rPr>
-        <w:t>WebE2E!20260827</w:t>
+        <w:t>location + user_id</w:t>
+      </w:r>
+      <w:r>
+        <w:rPr>
+          <w:rFonts w:ascii="Microsoft YaHei" w:hAnsi="Microsoft YaHei" w:eastAsia="Microsoft YaHei"/>
+          <w:sz w:val="21"/>
+        </w:rPr>
+        <w:t>保存在浏览器本地，刷新后恢复，不同租户和用户互不共享。</w:t>
       </w:r>
     </w:p>
     <w:p>
@@ -526,28 +595,31 @@
           <w:rFonts w:ascii="Microsoft YaHei" w:hAnsi="Microsoft YaHei" w:eastAsia="Microsoft YaHei"/>
           <w:sz w:val="21"/>
         </w:rPr>
-        <w:t>页面使用 HTTP，浏览器显示“不安全”是测试环境预期；生产必须启用 HTTPS、HSTS 和可信域名证书。</w:t>
+        <w:t>支持中文和英文切换；行情、下单、表头、方向、订单类型和状态随语言变化，协议标识保持原值。</w:t>
       </w:r>
     </w:p>
     <w:p>
       <w:pPr>
-        <w:pStyle w:val="Heading2"/>
-      </w:pPr>
-      <w:r>
-        <w:rPr>
-          <w:rFonts w:ascii="Microsoft YaHei" w:hAnsi="Microsoft YaHei" w:eastAsia="Microsoft YaHei"/>
-          <w:sz w:val="28"/>
-        </w:rPr>
-        <w:t>3.1 专业交易工作区</w:t>
+        <w:pStyle w:val="ListBullet"/>
+      </w:pPr>
+      <w:r>
+        <w:rPr>
+          <w:rFonts w:ascii="Microsoft YaHei" w:hAnsi="Microsoft YaHei" w:eastAsia="Microsoft YaHei"/>
+          <w:sz w:val="21"/>
+        </w:rPr>
+        <w:t>顶部行情条突出展示最新成交价，并按涨跌方向着色；下单区在请求发出前校验数量、限价和触发价必须为正数。</w:t>
       </w:r>
     </w:p>
     <w:p>
+      <w:pPr>
+        <w:pStyle w:val="ListBullet"/>
+      </w:pPr>
       <w:r>
         <w:rPr>
           <w:rFonts w:ascii="Microsoft YaHei" w:hAnsi="Microsoft YaHei" w:eastAsia="Microsoft YaHei"/>
           <w:sz w:val="21"/>
         </w:rPr>
-        <w:t>交易端采用专业 USDT 永续合约工作区，保留本系统现有业务字段和服务接口：</w:t>
+        <w:t>市场抽屉支持中英文搜索和空结果提示；选择品种时直接使用服务数据中的交易对代码，不依赖 DOM 文本反解析。</w:t>
       </w:r>
     </w:p>
     <w:p>
@@ -559,7 +631,7 @@
           <w:rFonts w:ascii="Microsoft YaHei" w:hAnsi="Microsoft YaHei" w:eastAsia="Microsoft YaHei"/>
           <w:sz w:val="21"/>
         </w:rPr>
-        <w:t>K 线图、订单簿/最近成交、下单、持仓/委托/成交和账户资产共五类面板。</w:t>
+        <w:t>切换品种和离开交易页时统一释放订单、成交、持仓、资金、订单簿和行情 WebSocket 订阅，防止重复回报与无效取消订阅异常。</w:t>
       </w:r>
     </w:p>
     <w:p>
@@ -571,19 +643,16 @@
           <w:rFonts w:ascii="Microsoft YaHei" w:hAnsi="Microsoft YaHei" w:eastAsia="Microsoft YaHei"/>
           <w:sz w:val="21"/>
         </w:rPr>
-        <w:t>桌面端支持拖动、缩放和自动重排；可以锁定布局防止交易时误操作，也可以一键恢复默认布局。</w:t>
+        <w:t>使用深色层级、专业买卖色、紧凑表格和响应式断点，功能布局参考主流永续合约交易终端，但不复制其品牌和专有素材。</w:t>
       </w:r>
     </w:p>
     <w:p>
-      <w:pPr>
-        <w:pStyle w:val="ListBullet"/>
-      </w:pPr>
       <w:r>
         <w:rPr>
           <w:rFonts w:ascii="Microsoft YaHei" w:hAnsi="Microsoft YaHei" w:eastAsia="Microsoft YaHei"/>
           <w:sz w:val="21"/>
         </w:rPr>
-        <w:t>布局按</w:t>
+        <w:t>Web 源码当前部署基线为</w:t>
       </w:r>
       <w:r>
         <w:rPr>
@@ -591,83 +660,14 @@
           <w:color w:val="171B26"/>
           <w:sz w:val="19"/>
         </w:rPr>
-        <w:t>location + user_id</w:t>
+        <w:t>2ed6e68</w:t>
       </w:r>
       <w:r>
         <w:rPr>
           <w:rFonts w:ascii="Microsoft YaHei" w:hAnsi="Microsoft YaHei" w:eastAsia="Microsoft YaHei"/>
           <w:sz w:val="21"/>
         </w:rPr>
-        <w:t>保存在浏览器本地，刷新后恢复，不同租户和用户互不共享。</w:t>
-      </w:r>
-    </w:p>
-    <w:p>
-      <w:pPr>
-        <w:pStyle w:val="ListBullet"/>
-      </w:pPr>
-      <w:r>
-        <w:rPr>
-          <w:rFonts w:ascii="Microsoft YaHei" w:hAnsi="Microsoft YaHei" w:eastAsia="Microsoft YaHei"/>
-          <w:sz w:val="21"/>
-        </w:rPr>
-        <w:t>支持中文和英文切换；行情、下单、表头、方向、订单类型和状态随语言变化，协议标识保持原值。</w:t>
-      </w:r>
-    </w:p>
-    <w:p>
-      <w:pPr>
-        <w:pStyle w:val="ListBullet"/>
-      </w:pPr>
-      <w:r>
-        <w:rPr>
-          <w:rFonts w:ascii="Microsoft YaHei" w:hAnsi="Microsoft YaHei" w:eastAsia="Microsoft YaHei"/>
-          <w:sz w:val="21"/>
-        </w:rPr>
-        <w:t>顶部行情条突出展示最新成交价，并按涨跌方向着色；下单区在请求发出前校验数量、限价和触发价必须为正数。</w:t>
-      </w:r>
-    </w:p>
-    <w:p>
-      <w:pPr>
-        <w:pStyle w:val="ListBullet"/>
-      </w:pPr>
-      <w:r>
-        <w:rPr>
-          <w:rFonts w:ascii="Microsoft YaHei" w:hAnsi="Microsoft YaHei" w:eastAsia="Microsoft YaHei"/>
-          <w:sz w:val="21"/>
-        </w:rPr>
-        <w:t>市场抽屉支持中英文搜索和空结果提示；选择品种时直接使用服务数据中的交易对代码，不依赖 DOM 文本反解析。</w:t>
-      </w:r>
-    </w:p>
-    <w:p>
-      <w:pPr>
-        <w:pStyle w:val="ListBullet"/>
-      </w:pPr>
-      <w:r>
-        <w:rPr>
-          <w:rFonts w:ascii="Microsoft YaHei" w:hAnsi="Microsoft YaHei" w:eastAsia="Microsoft YaHei"/>
-          <w:sz w:val="21"/>
-        </w:rPr>
-        <w:t>切换品种和离开交易页时统一释放订单、成交、持仓、资金、订单簿和行情 WebSocket 订阅，防止重复回报与无效取消订阅异常。</w:t>
-      </w:r>
-    </w:p>
-    <w:p>
-      <w:pPr>
-        <w:pStyle w:val="ListBullet"/>
-      </w:pPr>
-      <w:r>
-        <w:rPr>
-          <w:rFonts w:ascii="Microsoft YaHei" w:hAnsi="Microsoft YaHei" w:eastAsia="Microsoft YaHei"/>
-          <w:sz w:val="21"/>
-        </w:rPr>
-        <w:t>使用深色层级、专业买卖色、紧凑表格和响应式断点，功能布局参考主流永续合约交易终端，但不复制其品牌和专有素材。</w:t>
-      </w:r>
-    </w:p>
-    <w:p>
-      <w:r>
-        <w:rPr>
-          <w:rFonts w:ascii="Microsoft YaHei" w:hAnsi="Microsoft YaHei" w:eastAsia="Microsoft YaHei"/>
-          <w:sz w:val="21"/>
-        </w:rPr>
-        <w:t>Web 源码提交为</w:t>
+        <w:t>，使用公开</w:t>
       </w:r>
       <w:r>
         <w:rPr>
@@ -675,14 +675,14 @@
           <w:color w:val="171B26"/>
           <w:sz w:val="19"/>
         </w:rPr>
-        <w:t>d65a0761e0f7c6d8efc7a2153f1cdbb4bf247d41</w:t>
+        <w:t>ghcr.io</w:t>
       </w:r>
       <w:r>
         <w:rPr>
           <w:rFonts w:ascii="Microsoft YaHei" w:hAnsi="Microsoft YaHei" w:eastAsia="Microsoft YaHei"/>
           <w:sz w:val="21"/>
         </w:rPr>
-        <w:t>，公开镜像为</w:t>
+        <w:t>镜像。生产环境已完成真实浏览器桌面英文/中文、390×844 手机英文/中文、拖动、缩放、布局持久化、市场抽屉和完整交易链路验收；本报告中的 Web 图片均来自</w:t>
       </w:r>
       <w:r>
         <w:rPr>
@@ -690,14 +690,14 @@
           <w:color w:val="171B26"/>
           <w:sz w:val="19"/>
         </w:rPr>
-        <w:t>ghcr.io/bliplink/dc-saas-trade-web@sha256:26eb5ec02f619398bc72da0562bdef5920f5a15de8b8a65c0f4fbdd3c7954c47</w:t>
+        <w:t>18.140.45.126</w:t>
       </w:r>
       <w:r>
         <w:rPr>
           <w:rFonts w:ascii="Microsoft YaHei" w:hAnsi="Microsoft YaHei" w:eastAsia="Microsoft YaHei"/>
           <w:sz w:val="21"/>
         </w:rPr>
-        <w:t>。生产构建、公开镜像构建和匿名拉取验证已通过；本地生产构建截图已归档。下一步在 105 环境完成新界面部署、浏览器自动化和远端截图，不能用本地截图替代远端验收结论。</w:t>
+        <w:t>，不是本地效果图。</w:t>
       </w:r>
     </w:p>
     <w:p>
@@ -4253,7 +4253,7 @@
           <w:rFonts w:ascii="Microsoft YaHei" w:hAnsi="Microsoft YaHei" w:eastAsia="Microsoft YaHei"/>
           <w:sz w:val="28"/>
         </w:rPr>
-        <w:t>8.3 当前环境行情限制</w:t>
+        <w:t>8.3 当前环境行情状态</w:t>
       </w:r>
     </w:p>
     <w:p>
@@ -4262,7 +4262,112 @@
           <w:rFonts w:ascii="Microsoft YaHei" w:hAnsi="Microsoft YaHei" w:eastAsia="Microsoft YaHei"/>
           <w:sz w:val="21"/>
         </w:rPr>
-        <w:t>64 环境解析</w:t>
+        <w:t>生产验证环境的 APSSvr 已能持续接收 Binance Futures ticker/bookTicker，并向 MDSvr/GW 发布。Web 自动化同时验证订单簿、最近成交、K 线持久化、Last/Mark/Index 展示；外部单一数据源可用不等于生产指数方案完成，真实资金上线仍需多源加权、中位数/异常值剔除、断源降级和偏离保护。</w:t>
+      </w:r>
+    </w:p>
+    <w:p>
+      <w:r>
+        <w:rPr>
+          <w:rFonts w:ascii="Microsoft YaHei" w:hAnsi="Microsoft YaHei" w:eastAsia="Microsoft YaHei"/>
+          <w:sz w:val="21"/>
+        </w:rPr>
+        <w:t>上线门禁：至少三个独立来源、来源权重、时间戳新鲜度、异常值剔除、中位数/加权指数、断流降级、标记价平滑、价格保护、监控和审计全部通过后，才允许真实资金交易。</w:t>
+      </w:r>
+    </w:p>
+    <w:p>
+      <w:pPr>
+        <w:pStyle w:val="Heading1"/>
+      </w:pPr>
+      <w:r>
+        <w:rPr>
+          <w:rFonts w:ascii="Microsoft YaHei" w:hAnsi="Microsoft YaHei" w:eastAsia="Microsoft YaHei"/>
+          <w:sz w:val="34"/>
+        </w:rPr>
+        <w:t>9. 端到端数据流向</w:t>
+      </w:r>
+    </w:p>
+    <w:p>
+      <w:pPr>
+        <w:pStyle w:val="Heading2"/>
+      </w:pPr>
+      <w:r>
+        <w:rPr>
+          <w:rFonts w:ascii="Microsoft YaHei" w:hAnsi="Microsoft YaHei" w:eastAsia="Microsoft YaHei"/>
+          <w:sz w:val="28"/>
+        </w:rPr>
+        <w:t>9.1 登录</w:t>
+      </w:r>
+    </w:p>
+    <w:p>
+      <w:pPr>
+        <w:pStyle w:val="ListNumber"/>
+      </w:pPr>
+      <w:r>
+        <w:rPr>
+          <w:rFonts w:ascii="Microsoft YaHei" w:hAnsi="Microsoft YaHei" w:eastAsia="Microsoft YaHei"/>
+          <w:sz w:val="21"/>
+        </w:rPr>
+        <w:t>浏览器 URL 携带 location，向 GW 发送 LoginSvr 登录请求。</w:t>
+      </w:r>
+    </w:p>
+    <w:p>
+      <w:pPr>
+        <w:pStyle w:val="ListNumber"/>
+      </w:pPr>
+      <w:r>
+        <w:rPr>
+          <w:rFonts w:ascii="Microsoft YaHei" w:hAnsi="Microsoft YaHei" w:eastAsia="Microsoft YaHei"/>
+          <w:sz w:val="21"/>
+        </w:rPr>
+        <w:t>LoginSvr 按用户和 location 校验凭据。</w:t>
+      </w:r>
+    </w:p>
+    <w:p>
+      <w:pPr>
+        <w:pStyle w:val="ListNumber"/>
+      </w:pPr>
+      <w:r>
+        <w:rPr>
+          <w:rFonts w:ascii="Microsoft YaHei" w:hAnsi="Microsoft YaHei" w:eastAsia="Microsoft YaHei"/>
+          <w:sz w:val="21"/>
+        </w:rPr>
+        <w:t>成功后建立会话并加载用户信息；错误 location 返回认证失败。</w:t>
+      </w:r>
+    </w:p>
+    <w:p>
+      <w:pPr>
+        <w:pStyle w:val="ListNumber"/>
+      </w:pPr>
+      <w:r>
+        <w:rPr>
+          <w:rFonts w:ascii="Microsoft YaHei" w:hAnsi="Microsoft YaHei" w:eastAsia="Microsoft YaHei"/>
+          <w:sz w:val="21"/>
+        </w:rPr>
+        <w:t>当前仍需后续把会话中的服务端权威 location 注入所有业务调用，彻底忽略客户端伪造值。</w:t>
+      </w:r>
+    </w:p>
+    <w:p>
+      <w:pPr>
+        <w:pStyle w:val="Heading2"/>
+      </w:pPr>
+      <w:r>
+        <w:rPr>
+          <w:rFonts w:ascii="Microsoft YaHei" w:hAnsi="Microsoft YaHei" w:eastAsia="Microsoft YaHei"/>
+          <w:sz w:val="28"/>
+        </w:rPr>
+        <w:t>9.2 下单与成交</w:t>
+      </w:r>
+    </w:p>
+    <w:p>
+      <w:pPr>
+        <w:pStyle w:val="ListNumber"/>
+      </w:pPr>
+      <w:r>
+        <w:rPr>
+          <w:rFonts w:ascii="Microsoft YaHei" w:hAnsi="Microsoft YaHei" w:eastAsia="Microsoft YaHei"/>
+          <w:sz w:val="21"/>
+        </w:rPr>
+        <w:t>Web/API -&gt; GW -&gt; OrderSvr</w:t>
       </w:r>
       <w:r>
         <w:rPr>
@@ -4270,51 +4375,42 @@
           <w:color w:val="171B26"/>
           <w:sz w:val="19"/>
         </w:rPr>
-        <w:t>fstream.binance.com</w:t>
+        <w:t>placeOrder</w:t>
       </w:r>
       <w:r>
         <w:rPr>
           <w:rFonts w:ascii="Microsoft YaHei" w:hAnsi="Microsoft YaHei" w:eastAsia="Microsoft YaHei"/>
           <w:sz w:val="21"/>
         </w:rPr>
-        <w:t>后，IPv4 和 IPv6 连接均超时/不可达，APSSvr 会持续重连并记录连接异常。核心验收通过测试标记价和本地行情链路完成，不代表生产外部指数源已可用。</w:t>
+        <w:t>。</w:t>
       </w:r>
     </w:p>
     <w:p>
+      <w:pPr>
+        <w:pStyle w:val="ListNumber"/>
+      </w:pPr>
       <w:r>
         <w:rPr>
           <w:rFonts w:ascii="Microsoft YaHei" w:hAnsi="Microsoft YaHei" w:eastAsia="Microsoft YaHei"/>
           <w:sz w:val="21"/>
         </w:rPr>
-        <w:t>上线门禁：至少三个独立来源、来源权重、时间戳新鲜度、异常值剔除、中位数/加权指数、断流降级、标记价平滑、价格保护、监控和审计全部通过后，才允许真实资金交易。</w:t>
+        <w:t>OrderSvr 校验基础字段、品种过滤器、TIF、reduceOnly、幂等和用户身份。</w:t>
       </w:r>
     </w:p>
     <w:p>
       <w:pPr>
-        <w:pStyle w:val="Heading1"/>
-      </w:pPr>
-      <w:r>
-        <w:rPr>
-          <w:rFonts w:ascii="Microsoft YaHei" w:hAnsi="Microsoft YaHei" w:eastAsia="Microsoft YaHei"/>
-          <w:sz w:val="34"/>
-        </w:rPr>
-        <w:t>9. 端到端数据流向</w:t>
+        <w:pStyle w:val="ListNumber"/>
+      </w:pPr>
+      <w:r>
+        <w:rPr>
+          <w:rFonts w:ascii="Microsoft YaHei" w:hAnsi="Microsoft YaHei" w:eastAsia="Microsoft YaHei"/>
+          <w:sz w:val="21"/>
+        </w:rPr>
+        <w:t>OrderSvr -&gt; TradeSvr 预冻结保证金/手续费并检查风险档位。</w:t>
       </w:r>
     </w:p>
     <w:p>
       <w:pPr>
-        <w:pStyle w:val="Heading2"/>
-      </w:pPr>
-      <w:r>
-        <w:rPr>
-          <w:rFonts w:ascii="Microsoft YaHei" w:hAnsi="Microsoft YaHei" w:eastAsia="Microsoft YaHei"/>
-          <w:sz w:val="28"/>
-        </w:rPr>
-        <w:t>9.1 登录</w:t>
-      </w:r>
-    </w:p>
-    <w:p>
-      <w:pPr>
         <w:pStyle w:val="ListNumber"/>
       </w:pPr>
       <w:r>
@@ -4322,67 +4418,7 @@
           <w:rFonts w:ascii="Microsoft YaHei" w:hAnsi="Microsoft YaHei" w:eastAsia="Microsoft YaHei"/>
           <w:sz w:val="21"/>
         </w:rPr>
-        <w:t>浏览器 URL 携带 location，向 GW 发送 LoginSvr 登录请求。</w:t>
-      </w:r>
-    </w:p>
-    <w:p>
-      <w:pPr>
-        <w:pStyle w:val="ListNumber"/>
-      </w:pPr>
-      <w:r>
-        <w:rPr>
-          <w:rFonts w:ascii="Microsoft YaHei" w:hAnsi="Microsoft YaHei" w:eastAsia="Microsoft YaHei"/>
-          <w:sz w:val="21"/>
-        </w:rPr>
-        <w:t>LoginSvr 按用户和 location 校验凭据。</w:t>
-      </w:r>
-    </w:p>
-    <w:p>
-      <w:pPr>
-        <w:pStyle w:val="ListNumber"/>
-      </w:pPr>
-      <w:r>
-        <w:rPr>
-          <w:rFonts w:ascii="Microsoft YaHei" w:hAnsi="Microsoft YaHei" w:eastAsia="Microsoft YaHei"/>
-          <w:sz w:val="21"/>
-        </w:rPr>
-        <w:t>成功后建立会话并加载用户信息；错误 location 返回认证失败。</w:t>
-      </w:r>
-    </w:p>
-    <w:p>
-      <w:pPr>
-        <w:pStyle w:val="ListNumber"/>
-      </w:pPr>
-      <w:r>
-        <w:rPr>
-          <w:rFonts w:ascii="Microsoft YaHei" w:hAnsi="Microsoft YaHei" w:eastAsia="Microsoft YaHei"/>
-          <w:sz w:val="21"/>
-        </w:rPr>
-        <w:t>当前仍需后续把会话中的服务端权威 location 注入所有业务调用，彻底忽略客户端伪造值。</w:t>
-      </w:r>
-    </w:p>
-    <w:p>
-      <w:pPr>
-        <w:pStyle w:val="Heading2"/>
-      </w:pPr>
-      <w:r>
-        <w:rPr>
-          <w:rFonts w:ascii="Microsoft YaHei" w:hAnsi="Microsoft YaHei" w:eastAsia="Microsoft YaHei"/>
-          <w:sz w:val="28"/>
-        </w:rPr>
-        <w:t>9.2 下单与成交</w:t>
-      </w:r>
-    </w:p>
-    <w:p>
-      <w:pPr>
-        <w:pStyle w:val="ListNumber"/>
-      </w:pPr>
-      <w:r>
-        <w:rPr>
-          <w:rFonts w:ascii="Microsoft YaHei" w:hAnsi="Microsoft YaHei" w:eastAsia="Microsoft YaHei"/>
-          <w:sz w:val="21"/>
-        </w:rPr>
-        <w:t>Web/API -&gt; GW -&gt; OrderSvr</w:t>
+        <w:t>接受的订单进入</w:t>
       </w:r>
       <w:r>
         <w:rPr>
@@ -4390,14 +4426,14 @@
           <w:color w:val="171B26"/>
           <w:sz w:val="19"/>
         </w:rPr>
-        <w:t>placeOrder</w:t>
+        <w:t>location + market + symbol</w:t>
       </w:r>
       <w:r>
         <w:rPr>
           <w:rFonts w:ascii="Microsoft YaHei" w:hAnsi="Microsoft YaHei" w:eastAsia="Microsoft YaHei"/>
           <w:sz w:val="21"/>
         </w:rPr>
-        <w:t>。</w:t>
+        <w:t>单写撮合序列。</w:t>
       </w:r>
     </w:p>
     <w:p>
@@ -4409,7 +4445,7 @@
           <w:rFonts w:ascii="Microsoft YaHei" w:hAnsi="Microsoft YaHei" w:eastAsia="Microsoft YaHei"/>
           <w:sz w:val="21"/>
         </w:rPr>
-        <w:t>OrderSvr 校验基础字段、品种过滤器、TIF、reduceOnly、幂等和用户身份。</w:t>
+        <w:t>撮合按价格时间优先生成 maker/taker 两方 ExecOrder；未成交余量按 TIF 挂单或取消。</w:t>
       </w:r>
     </w:p>
     <w:p>
@@ -4421,7 +4457,7 @@
           <w:rFonts w:ascii="Microsoft YaHei" w:hAnsi="Microsoft YaHei" w:eastAsia="Microsoft YaHei"/>
           <w:sz w:val="21"/>
         </w:rPr>
-        <w:t>OrderSvr -&gt; TradeSvr 预冻结保证金/手续费并检查风险档位。</w:t>
+        <w:t>ExecOrder -&gt; TradeSvr：扣费、更新余额/持仓/保证金、生成流水并持久化。</w:t>
       </w:r>
     </w:p>
     <w:p>
@@ -4433,7 +4469,256 @@
           <w:rFonts w:ascii="Microsoft YaHei" w:hAnsi="Microsoft YaHei" w:eastAsia="Microsoft YaHei"/>
           <w:sz w:val="21"/>
         </w:rPr>
-        <w:t>接受的订单进入</w:t>
+        <w:t>订单/执行 -&gt; MDSvr：生成独立租户盘口、最近成交和 K 线。</w:t>
+      </w:r>
+    </w:p>
+    <w:p>
+      <w:pPr>
+        <w:pStyle w:val="ListNumber"/>
+      </w:pPr>
+      <w:r>
+        <w:rPr>
+          <w:rFonts w:ascii="Microsoft YaHei" w:hAnsi="Microsoft YaHei" w:eastAsia="Microsoft YaHei"/>
+          <w:sz w:val="21"/>
+        </w:rPr>
+        <w:t>OrderSvr/TradeSvr/MDSvr -&gt; GW Topic -&gt; Web：刷新委托、成交、持仓、资金和行情。</w:t>
+      </w:r>
+    </w:p>
+    <w:p>
+      <w:pPr>
+        <w:pStyle w:val="Heading2"/>
+      </w:pPr>
+      <w:r>
+        <w:rPr>
+          <w:rFonts w:ascii="Microsoft YaHei" w:hAnsi="Microsoft YaHei" w:eastAsia="Microsoft YaHei"/>
+          <w:sz w:val="28"/>
+        </w:rPr>
+        <w:t>9.3 撤单</w:t>
+      </w:r>
+    </w:p>
+    <w:p>
+      <w:pPr>
+        <w:pStyle w:val="ListNumber"/>
+      </w:pPr>
+      <w:r>
+        <w:rPr>
+          <w:rFonts w:ascii="Microsoft YaHei" w:hAnsi="Microsoft YaHei" w:eastAsia="Microsoft YaHei"/>
+          <w:sz w:val="21"/>
+        </w:rPr>
+        <w:t>Web/API -&gt; GW -&gt; OrderSvr cancel/batch/mass cancel。</w:t>
+      </w:r>
+    </w:p>
+    <w:p>
+      <w:pPr>
+        <w:pStyle w:val="ListNumber"/>
+      </w:pPr>
+      <w:r>
+        <w:rPr>
+          <w:rFonts w:ascii="Microsoft YaHei" w:hAnsi="Microsoft YaHei" w:eastAsia="Microsoft YaHei"/>
+          <w:sz w:val="21"/>
+        </w:rPr>
+        <w:t>OrderSvr 在订单身份边界内将活动单转为 PendingCancel/Cancelled 并移出订单簿。</w:t>
+      </w:r>
+    </w:p>
+    <w:p>
+      <w:pPr>
+        <w:pStyle w:val="ListNumber"/>
+      </w:pPr>
+      <w:r>
+        <w:rPr>
+          <w:rFonts w:ascii="Microsoft YaHei" w:hAnsi="Microsoft YaHei" w:eastAsia="Microsoft YaHei"/>
+          <w:sz w:val="21"/>
+        </w:rPr>
+        <w:t>撤单事件 -&gt; TradeSvr 释放冻结保证金和手续费。</w:t>
+      </w:r>
+    </w:p>
+    <w:p>
+      <w:pPr>
+        <w:pStyle w:val="ListNumber"/>
+      </w:pPr>
+      <w:r>
+        <w:rPr>
+          <w:rFonts w:ascii="Microsoft YaHei" w:hAnsi="Microsoft YaHei" w:eastAsia="Microsoft YaHei"/>
+          <w:sz w:val="21"/>
+        </w:rPr>
+        <w:t>即使取消事件先于迟到 Newing 到达，TradeSvr 也以终态为准，不再二次冻结。</w:t>
+      </w:r>
+    </w:p>
+    <w:p>
+      <w:pPr>
+        <w:pStyle w:val="Heading2"/>
+      </w:pPr>
+      <w:r>
+        <w:rPr>
+          <w:rFonts w:ascii="Microsoft YaHei" w:hAnsi="Microsoft YaHei" w:eastAsia="Microsoft YaHei"/>
+          <w:sz w:val="28"/>
+        </w:rPr>
+        <w:t>9.4 强平与 ADL</w:t>
+      </w:r>
+    </w:p>
+    <w:p>
+      <w:pPr>
+        <w:pStyle w:val="ListNumber"/>
+      </w:pPr>
+      <w:r>
+        <w:rPr>
+          <w:rFonts w:ascii="Microsoft YaHei" w:hAnsi="Microsoft YaHei" w:eastAsia="Microsoft YaHei"/>
+          <w:sz w:val="21"/>
+        </w:rPr>
+        <w:t>APSSvr/MDSvr -&gt; LiqSvr：按 location 提供标记价。</w:t>
+      </w:r>
+    </w:p>
+    <w:p>
+      <w:pPr>
+        <w:pStyle w:val="ListNumber"/>
+      </w:pPr>
+      <w:r>
+        <w:rPr>
+          <w:rFonts w:ascii="Microsoft YaHei" w:hAnsi="Microsoft YaHei" w:eastAsia="Microsoft YaHei"/>
+          <w:sz w:val="21"/>
+        </w:rPr>
+        <w:t>TradeSvr -&gt; LiqSvr：提供同 location 持仓快照。</w:t>
+      </w:r>
+    </w:p>
+    <w:p>
+      <w:pPr>
+        <w:pStyle w:val="ListNumber"/>
+      </w:pPr>
+      <w:r>
+        <w:rPr>
+          <w:rFonts w:ascii="Microsoft YaHei" w:hAnsi="Microsoft YaHei" w:eastAsia="Microsoft YaHei"/>
+          <w:sz w:val="21"/>
+        </w:rPr>
+        <w:t>LiqSvr 比较标记价和强平价，取消活动单并向 OrderSvr 发部分/最终强平单。</w:t>
+      </w:r>
+    </w:p>
+    <w:p>
+      <w:pPr>
+        <w:pStyle w:val="ListNumber"/>
+      </w:pPr>
+      <w:r>
+        <w:rPr>
+          <w:rFonts w:ascii="Microsoft YaHei" w:hAnsi="Microsoft YaHei" w:eastAsia="Microsoft YaHei"/>
+          <w:sz w:val="21"/>
+        </w:rPr>
+        <w:t>OrderSvr 实际撮合；ExecOrder 回到 TradeSvr。</w:t>
+      </w:r>
+    </w:p>
+    <w:p>
+      <w:pPr>
+        <w:pStyle w:val="ListNumber"/>
+      </w:pPr>
+      <w:r>
+        <w:rPr>
+          <w:rFonts w:ascii="Microsoft YaHei" w:hAnsi="Microsoft YaHei" w:eastAsia="Microsoft YaHei"/>
+          <w:sz w:val="21"/>
+        </w:rPr>
+        <w:t>TradeSvr 结算已实现盈亏、费用和剩余保证金。</w:t>
+      </w:r>
+    </w:p>
+    <w:p>
+      <w:pPr>
+        <w:pStyle w:val="ListNumber"/>
+      </w:pPr>
+      <w:r>
+        <w:rPr>
+          <w:rFonts w:ascii="Microsoft YaHei" w:hAnsi="Microsoft YaHei" w:eastAsia="Microsoft YaHei"/>
+          <w:sz w:val="21"/>
+        </w:rPr>
+        <w:t>最终负余额先扣租户保险基金，再筛选同租户反向盈利持仓并执行 ADL。</w:t>
+      </w:r>
+    </w:p>
+    <w:p>
+      <w:pPr>
+        <w:pStyle w:val="ListNumber"/>
+      </w:pPr>
+      <w:r>
+        <w:rPr>
+          <w:rFonts w:ascii="Microsoft YaHei" w:hAnsi="Microsoft YaHei" w:eastAsia="Microsoft YaHei"/>
+          <w:sz w:val="21"/>
+        </w:rPr>
+        <w:t>MySQL 事务提交 deficit/event/ledger/posting/balance/position；GW 向相关用户发布更新。</w:t>
+      </w:r>
+    </w:p>
+    <w:p>
+      <w:pPr>
+        <w:pStyle w:val="Heading1"/>
+      </w:pPr>
+      <w:r>
+        <w:rPr>
+          <w:rFonts w:ascii="Microsoft YaHei" w:hAnsi="Microsoft YaHei" w:eastAsia="Microsoft YaHei"/>
+          <w:sz w:val="34"/>
+        </w:rPr>
+        <w:t>10. 多租户产品规划</w:t>
+      </w:r>
+    </w:p>
+    <w:p>
+      <w:r>
+        <w:rPr>
+          <w:rFonts w:ascii="Microsoft YaHei" w:hAnsi="Microsoft YaHei" w:eastAsia="Microsoft YaHei"/>
+          <w:sz w:val="21"/>
+        </w:rPr>
+        <w:t>核心交易规则完成后进入多租户控制面，建议分为平台端、租户端和交易端三层。</w:t>
+      </w:r>
+    </w:p>
+    <w:p>
+      <w:pPr>
+        <w:pStyle w:val="Heading2"/>
+      </w:pPr>
+      <w:r>
+        <w:rPr>
+          <w:rFonts w:ascii="Microsoft YaHei" w:hAnsi="Microsoft YaHei" w:eastAsia="Microsoft YaHei"/>
+          <w:sz w:val="28"/>
+        </w:rPr>
+        <w:t>10.1 试用申请与审批</w:t>
+      </w:r>
+    </w:p>
+    <w:p>
+      <w:pPr>
+        <w:pStyle w:val="ListBullet"/>
+      </w:pPr>
+      <w:r>
+        <w:rPr>
+          <w:rFonts w:ascii="Microsoft YaHei" w:hAnsi="Microsoft YaHei" w:eastAsia="Microsoft YaHei"/>
+          <w:sz w:val="21"/>
+        </w:rPr>
+        <w:t>官网提交企业/团队、联系人、用途、预计用户数、交易品种和试用周期。</w:t>
+      </w:r>
+    </w:p>
+    <w:p>
+      <w:pPr>
+        <w:pStyle w:val="ListBullet"/>
+      </w:pPr>
+      <w:r>
+        <w:rPr>
+          <w:rFonts w:ascii="Microsoft YaHei" w:hAnsi="Microsoft YaHei" w:eastAsia="Microsoft YaHei"/>
+          <w:sz w:val="21"/>
+        </w:rPr>
+        <w:t>ManagerSvr 平台运营查看材料、风控评分、审批、拒绝、补充材料、到期和续期。</w:t>
+      </w:r>
+    </w:p>
+    <w:p>
+      <w:pPr>
+        <w:pStyle w:val="ListBullet"/>
+      </w:pPr>
+      <w:r>
+        <w:rPr>
+          <w:rFonts w:ascii="Microsoft YaHei" w:hAnsi="Microsoft YaHei" w:eastAsia="Microsoft YaHei"/>
+          <w:sz w:val="21"/>
+        </w:rPr>
+        <w:t>审批通过后创建 location、租户管理员、默认品种/费率/风控模板和独立 URL。</w:t>
+      </w:r>
+    </w:p>
+    <w:p>
+      <w:pPr>
+        <w:pStyle w:val="ListBullet"/>
+      </w:pPr>
+      <w:r>
+        <w:rPr>
+          <w:rFonts w:ascii="Microsoft YaHei" w:hAnsi="Microsoft YaHei" w:eastAsia="Microsoft YaHei"/>
+          <w:sz w:val="21"/>
+        </w:rPr>
+        <w:t>URL 可采用</w:t>
       </w:r>
       <w:r>
         <w:rPr>
@@ -4441,299 +4726,14 @@
           <w:color w:val="171B26"/>
           <w:sz w:val="19"/>
         </w:rPr>
-        <w:t>location + market + symbol</w:t>
+        <w:t>tenant.example.com</w:t>
       </w:r>
       <w:r>
         <w:rPr>
           <w:rFonts w:ascii="Microsoft YaHei" w:hAnsi="Microsoft YaHei" w:eastAsia="Microsoft YaHei"/>
           <w:sz w:val="21"/>
         </w:rPr>
-        <w:t>单写撮合序列。</w:t>
-      </w:r>
-    </w:p>
-    <w:p>
-      <w:pPr>
-        <w:pStyle w:val="ListNumber"/>
-      </w:pPr>
-      <w:r>
-        <w:rPr>
-          <w:rFonts w:ascii="Microsoft YaHei" w:hAnsi="Microsoft YaHei" w:eastAsia="Microsoft YaHei"/>
-          <w:sz w:val="21"/>
-        </w:rPr>
-        <w:t>撮合按价格时间优先生成 maker/taker 两方 ExecOrder；未成交余量按 TIF 挂单或取消。</w:t>
-      </w:r>
-    </w:p>
-    <w:p>
-      <w:pPr>
-        <w:pStyle w:val="ListNumber"/>
-      </w:pPr>
-      <w:r>
-        <w:rPr>
-          <w:rFonts w:ascii="Microsoft YaHei" w:hAnsi="Microsoft YaHei" w:eastAsia="Microsoft YaHei"/>
-          <w:sz w:val="21"/>
-        </w:rPr>
-        <w:t>ExecOrder -&gt; TradeSvr：扣费、更新余额/持仓/保证金、生成流水并持久化。</w:t>
-      </w:r>
-    </w:p>
-    <w:p>
-      <w:pPr>
-        <w:pStyle w:val="ListNumber"/>
-      </w:pPr>
-      <w:r>
-        <w:rPr>
-          <w:rFonts w:ascii="Microsoft YaHei" w:hAnsi="Microsoft YaHei" w:eastAsia="Microsoft YaHei"/>
-          <w:sz w:val="21"/>
-        </w:rPr>
-        <w:t>订单/执行 -&gt; MDSvr：生成独立租户盘口、最近成交和 K 线。</w:t>
-      </w:r>
-    </w:p>
-    <w:p>
-      <w:pPr>
-        <w:pStyle w:val="ListNumber"/>
-      </w:pPr>
-      <w:r>
-        <w:rPr>
-          <w:rFonts w:ascii="Microsoft YaHei" w:hAnsi="Microsoft YaHei" w:eastAsia="Microsoft YaHei"/>
-          <w:sz w:val="21"/>
-        </w:rPr>
-        <w:t>OrderSvr/TradeSvr/MDSvr -&gt; GW Topic -&gt; Web：刷新委托、成交、持仓、资金和行情。</w:t>
-      </w:r>
-    </w:p>
-    <w:p>
-      <w:pPr>
-        <w:pStyle w:val="Heading2"/>
-      </w:pPr>
-      <w:r>
-        <w:rPr>
-          <w:rFonts w:ascii="Microsoft YaHei" w:hAnsi="Microsoft YaHei" w:eastAsia="Microsoft YaHei"/>
-          <w:sz w:val="28"/>
-        </w:rPr>
-        <w:t>9.3 撤单</w:t>
-      </w:r>
-    </w:p>
-    <w:p>
-      <w:pPr>
-        <w:pStyle w:val="ListNumber"/>
-      </w:pPr>
-      <w:r>
-        <w:rPr>
-          <w:rFonts w:ascii="Microsoft YaHei" w:hAnsi="Microsoft YaHei" w:eastAsia="Microsoft YaHei"/>
-          <w:sz w:val="21"/>
-        </w:rPr>
-        <w:t>Web/API -&gt; GW -&gt; OrderSvr cancel/batch/mass cancel。</w:t>
-      </w:r>
-    </w:p>
-    <w:p>
-      <w:pPr>
-        <w:pStyle w:val="ListNumber"/>
-      </w:pPr>
-      <w:r>
-        <w:rPr>
-          <w:rFonts w:ascii="Microsoft YaHei" w:hAnsi="Microsoft YaHei" w:eastAsia="Microsoft YaHei"/>
-          <w:sz w:val="21"/>
-        </w:rPr>
-        <w:t>OrderSvr 在订单身份边界内将活动单转为 PendingCancel/Cancelled 并移出订单簿。</w:t>
-      </w:r>
-    </w:p>
-    <w:p>
-      <w:pPr>
-        <w:pStyle w:val="ListNumber"/>
-      </w:pPr>
-      <w:r>
-        <w:rPr>
-          <w:rFonts w:ascii="Microsoft YaHei" w:hAnsi="Microsoft YaHei" w:eastAsia="Microsoft YaHei"/>
-          <w:sz w:val="21"/>
-        </w:rPr>
-        <w:t>撤单事件 -&gt; TradeSvr 释放冻结保证金和手续费。</w:t>
-      </w:r>
-    </w:p>
-    <w:p>
-      <w:pPr>
-        <w:pStyle w:val="ListNumber"/>
-      </w:pPr>
-      <w:r>
-        <w:rPr>
-          <w:rFonts w:ascii="Microsoft YaHei" w:hAnsi="Microsoft YaHei" w:eastAsia="Microsoft YaHei"/>
-          <w:sz w:val="21"/>
-        </w:rPr>
-        <w:t>即使取消事件先于迟到 Newing 到达，TradeSvr 也以终态为准，不再二次冻结。</w:t>
-      </w:r>
-    </w:p>
-    <w:p>
-      <w:pPr>
-        <w:pStyle w:val="Heading2"/>
-      </w:pPr>
-      <w:r>
-        <w:rPr>
-          <w:rFonts w:ascii="Microsoft YaHei" w:hAnsi="Microsoft YaHei" w:eastAsia="Microsoft YaHei"/>
-          <w:sz w:val="28"/>
-        </w:rPr>
-        <w:t>9.4 强平与 ADL</w:t>
-      </w:r>
-    </w:p>
-    <w:p>
-      <w:pPr>
-        <w:pStyle w:val="ListNumber"/>
-      </w:pPr>
-      <w:r>
-        <w:rPr>
-          <w:rFonts w:ascii="Microsoft YaHei" w:hAnsi="Microsoft YaHei" w:eastAsia="Microsoft YaHei"/>
-          <w:sz w:val="21"/>
-        </w:rPr>
-        <w:t>APSSvr/MDSvr -&gt; LiqSvr：按 location 提供标记价。</w:t>
-      </w:r>
-    </w:p>
-    <w:p>
-      <w:pPr>
-        <w:pStyle w:val="ListNumber"/>
-      </w:pPr>
-      <w:r>
-        <w:rPr>
-          <w:rFonts w:ascii="Microsoft YaHei" w:hAnsi="Microsoft YaHei" w:eastAsia="Microsoft YaHei"/>
-          <w:sz w:val="21"/>
-        </w:rPr>
-        <w:t>TradeSvr -&gt; LiqSvr：提供同 location 持仓快照。</w:t>
-      </w:r>
-    </w:p>
-    <w:p>
-      <w:pPr>
-        <w:pStyle w:val="ListNumber"/>
-      </w:pPr>
-      <w:r>
-        <w:rPr>
-          <w:rFonts w:ascii="Microsoft YaHei" w:hAnsi="Microsoft YaHei" w:eastAsia="Microsoft YaHei"/>
-          <w:sz w:val="21"/>
-        </w:rPr>
-        <w:t>LiqSvr 比较标记价和强平价，取消活动单并向 OrderSvr 发部分/最终强平单。</w:t>
-      </w:r>
-    </w:p>
-    <w:p>
-      <w:pPr>
-        <w:pStyle w:val="ListNumber"/>
-      </w:pPr>
-      <w:r>
-        <w:rPr>
-          <w:rFonts w:ascii="Microsoft YaHei" w:hAnsi="Microsoft YaHei" w:eastAsia="Microsoft YaHei"/>
-          <w:sz w:val="21"/>
-        </w:rPr>
-        <w:t>OrderSvr 实际撮合；ExecOrder 回到 TradeSvr。</w:t>
-      </w:r>
-    </w:p>
-    <w:p>
-      <w:pPr>
-        <w:pStyle w:val="ListNumber"/>
-      </w:pPr>
-      <w:r>
-        <w:rPr>
-          <w:rFonts w:ascii="Microsoft YaHei" w:hAnsi="Microsoft YaHei" w:eastAsia="Microsoft YaHei"/>
-          <w:sz w:val="21"/>
-        </w:rPr>
-        <w:t>TradeSvr 结算已实现盈亏、费用和剩余保证金。</w:t>
-      </w:r>
-    </w:p>
-    <w:p>
-      <w:pPr>
-        <w:pStyle w:val="ListNumber"/>
-      </w:pPr>
-      <w:r>
-        <w:rPr>
-          <w:rFonts w:ascii="Microsoft YaHei" w:hAnsi="Microsoft YaHei" w:eastAsia="Microsoft YaHei"/>
-          <w:sz w:val="21"/>
-        </w:rPr>
-        <w:t>最终负余额先扣租户保险基金，再筛选同租户反向盈利持仓并执行 ADL。</w:t>
-      </w:r>
-    </w:p>
-    <w:p>
-      <w:pPr>
-        <w:pStyle w:val="ListNumber"/>
-      </w:pPr>
-      <w:r>
-        <w:rPr>
-          <w:rFonts w:ascii="Microsoft YaHei" w:hAnsi="Microsoft YaHei" w:eastAsia="Microsoft YaHei"/>
-          <w:sz w:val="21"/>
-        </w:rPr>
-        <w:t>MySQL 事务提交 deficit/event/ledger/posting/balance/position；GW 向相关用户发布更新。</w:t>
-      </w:r>
-    </w:p>
-    <w:p>
-      <w:pPr>
-        <w:pStyle w:val="Heading1"/>
-      </w:pPr>
-      <w:r>
-        <w:rPr>
-          <w:rFonts w:ascii="Microsoft YaHei" w:hAnsi="Microsoft YaHei" w:eastAsia="Microsoft YaHei"/>
-          <w:sz w:val="34"/>
-        </w:rPr>
-        <w:t>10. 多租户产品规划</w:t>
-      </w:r>
-    </w:p>
-    <w:p>
-      <w:r>
-        <w:rPr>
-          <w:rFonts w:ascii="Microsoft YaHei" w:hAnsi="Microsoft YaHei" w:eastAsia="Microsoft YaHei"/>
-          <w:sz w:val="21"/>
-        </w:rPr>
-        <w:t>核心交易规则完成后进入多租户控制面，建议分为平台端、租户端和交易端三层。</w:t>
-      </w:r>
-    </w:p>
-    <w:p>
-      <w:pPr>
-        <w:pStyle w:val="Heading2"/>
-      </w:pPr>
-      <w:r>
-        <w:rPr>
-          <w:rFonts w:ascii="Microsoft YaHei" w:hAnsi="Microsoft YaHei" w:eastAsia="Microsoft YaHei"/>
-          <w:sz w:val="28"/>
-        </w:rPr>
-        <w:t>10.1 试用申请与审批</w:t>
-      </w:r>
-    </w:p>
-    <w:p>
-      <w:pPr>
-        <w:pStyle w:val="ListBullet"/>
-      </w:pPr>
-      <w:r>
-        <w:rPr>
-          <w:rFonts w:ascii="Microsoft YaHei" w:hAnsi="Microsoft YaHei" w:eastAsia="Microsoft YaHei"/>
-          <w:sz w:val="21"/>
-        </w:rPr>
-        <w:t>官网提交企业/团队、联系人、用途、预计用户数、交易品种和试用周期。</w:t>
-      </w:r>
-    </w:p>
-    <w:p>
-      <w:pPr>
-        <w:pStyle w:val="ListBullet"/>
-      </w:pPr>
-      <w:r>
-        <w:rPr>
-          <w:rFonts w:ascii="Microsoft YaHei" w:hAnsi="Microsoft YaHei" w:eastAsia="Microsoft YaHei"/>
-          <w:sz w:val="21"/>
-        </w:rPr>
-        <w:t>ManagerSvr 平台运营查看材料、风控评分、审批、拒绝、补充材料、到期和续期。</w:t>
-      </w:r>
-    </w:p>
-    <w:p>
-      <w:pPr>
-        <w:pStyle w:val="ListBullet"/>
-      </w:pPr>
-      <w:r>
-        <w:rPr>
-          <w:rFonts w:ascii="Microsoft YaHei" w:hAnsi="Microsoft YaHei" w:eastAsia="Microsoft YaHei"/>
-          <w:sz w:val="21"/>
-        </w:rPr>
-        <w:t>审批通过后创建 location、租户管理员、默认品种/费率/风控模板和独立 URL。</w:t>
-      </w:r>
-    </w:p>
-    <w:p>
-      <w:pPr>
-        <w:pStyle w:val="ListBullet"/>
-      </w:pPr>
-      <w:r>
-        <w:rPr>
-          <w:rFonts w:ascii="Microsoft YaHei" w:hAnsi="Microsoft YaHei" w:eastAsia="Microsoft YaHei"/>
-          <w:sz w:val="21"/>
-        </w:rPr>
-        <w:t>URL 可采用</w:t>
+        <w:t>或</w:t>
       </w:r>
       <w:r>
         <w:rPr>
@@ -4741,21 +4741,6 @@
           <w:color w:val="171B26"/>
           <w:sz w:val="19"/>
         </w:rPr>
-        <w:t>tenant.example.com</w:t>
-      </w:r>
-      <w:r>
-        <w:rPr>
-          <w:rFonts w:ascii="Microsoft YaHei" w:hAnsi="Microsoft YaHei" w:eastAsia="Microsoft YaHei"/>
-          <w:sz w:val="21"/>
-        </w:rPr>
-        <w:t>或</w:t>
-      </w:r>
-      <w:r>
-        <w:rPr>
-          <w:rFonts w:ascii="Consolas" w:hAnsi="Consolas" w:eastAsia="Consolas"/>
-          <w:color w:val="171B26"/>
-          <w:sz w:val="19"/>
-        </w:rPr>
         <w:t>/t/{tenantCode}</w:t>
       </w:r>
       <w:r>
@@ -5003,7 +4988,7 @@
           <w:rFonts w:ascii="Microsoft YaHei" w:hAnsi="Microsoft YaHei" w:eastAsia="Microsoft YaHei"/>
           <w:sz w:val="34"/>
         </w:rPr>
-        <w:t>11. 64 环境部署与运维</w:t>
+        <w:t>11. 生产验证环境部署与运维</w:t>
       </w:r>
     </w:p>
     <w:p>
@@ -5184,7 +5169,7 @@
                 <w:color w:val="171B26"/>
                 <w:sz w:val="17"/>
               </w:rPr>
-              <w:t>512 MiB</w:t>
+              <w:t>256 MiB</w:t>
             </w:r>
           </w:p>
         </w:tc>
@@ -5210,7 +5195,7 @@
                 <w:color w:val="171B26"/>
                 <w:sz w:val="17"/>
               </w:rPr>
-              <w:t>768 MiB</w:t>
+              <w:t>384 MiB</w:t>
             </w:r>
           </w:p>
         </w:tc>
@@ -5266,7 +5251,7 @@
                 <w:color w:val="171B26"/>
                 <w:sz w:val="17"/>
               </w:rPr>
-              <w:t>768 MiB</w:t>
+              <w:t>448 MiB</w:t>
             </w:r>
           </w:p>
         </w:tc>
@@ -5293,7 +5278,7 @@
                 <w:color w:val="171B26"/>
                 <w:sz w:val="17"/>
               </w:rPr>
-              <w:t>1 GiB</w:t>
+              <w:t>640 MiB</w:t>
             </w:r>
           </w:p>
         </w:tc>
@@ -5347,7 +5332,7 @@
                 <w:color w:val="171B26"/>
                 <w:sz w:val="17"/>
               </w:rPr>
-              <w:t>640 MiB</w:t>
+              <w:t>384 MiB</w:t>
             </w:r>
           </w:p>
         </w:tc>
@@ -5456,7 +5441,7 @@
                 <w:color w:val="171B26"/>
                 <w:sz w:val="17"/>
               </w:rPr>
-              <w:t>2 GiB</w:t>
+              <w:t>1.5 GiB</w:t>
             </w:r>
           </w:p>
         </w:tc>
@@ -5536,7 +5521,7 @@
                 <w:color w:val="171B26"/>
                 <w:sz w:val="17"/>
               </w:rPr>
-              <w:t>3 GiB</w:t>
+              <w:t>2 GiB</w:t>
             </w:r>
           </w:p>
         </w:tc>
@@ -5619,7 +5604,7 @@
                 <w:color w:val="171B26"/>
                 <w:sz w:val="17"/>
               </w:rPr>
-              <w:t>512 MiB</w:t>
+              <w:t>384 MiB</w:t>
             </w:r>
           </w:p>
         </w:tc>
@@ -5699,7 +5684,7 @@
                 <w:color w:val="171B26"/>
                 <w:sz w:val="17"/>
               </w:rPr>
-              <w:t>512 MiB</w:t>
+              <w:t>256 MiB</w:t>
             </w:r>
           </w:p>
         </w:tc>
@@ -5740,7 +5725,7 @@
           <w:rFonts w:ascii="Microsoft YaHei" w:hAnsi="Microsoft YaHei" w:eastAsia="Microsoft YaHei"/>
           <w:sz w:val="21"/>
         </w:rPr>
-        <w:t>root cron 每 5 分钟运行</w:t>
+        <w:t>SaaS 部署目录为</w:t>
       </w:r>
       <w:r>
         <w:rPr>
@@ -5748,14 +5733,29 @@
           <w:color w:val="171B26"/>
           <w:sz w:val="19"/>
         </w:rPr>
-        <w:t>/root/dc-saas-deploy/auto-update-saas.sh</w:t>
+        <w:t>/home/ec2-user/dc-saas-deploy</w:t>
       </w:r>
       <w:r>
         <w:rPr>
           <w:rFonts w:ascii="Microsoft YaHei" w:hAnsi="Microsoft YaHei" w:eastAsia="Microsoft YaHei"/>
           <w:sz w:val="21"/>
         </w:rPr>
-        <w:t>。</w:t>
+        <w:t>，运行数据为</w:t>
+      </w:r>
+      <w:r>
+        <w:rPr>
+          <w:rFonts w:ascii="Consolas" w:hAnsi="Consolas" w:eastAsia="Consolas"/>
+          <w:color w:val="171B26"/>
+          <w:sz w:val="19"/>
+        </w:rPr>
+        <w:t>/data/dc-saas-runtime</w:t>
+      </w:r>
+      <w:r>
+        <w:rPr>
+          <w:rFonts w:ascii="Microsoft YaHei" w:hAnsi="Microsoft YaHei" w:eastAsia="Microsoft YaHei"/>
+          <w:sz w:val="21"/>
+        </w:rPr>
+        <w:t>；与同机量化 Compose 项目和数据目录分离。</w:t>
       </w:r>
     </w:p>
     <w:p>
@@ -5767,7 +5767,52 @@
           <w:rFonts w:ascii="Microsoft YaHei" w:hAnsi="Microsoft YaHei" w:eastAsia="Microsoft YaHei"/>
           <w:sz w:val="21"/>
         </w:rPr>
-        <w:t>只从公开 GHCR 拉取应用镜像，不自动更新 MySQL、ClickHouse、ZooKeeper。</w:t>
+        <w:t>root cron 已安装为每 5 分钟执行</w:t>
+      </w:r>
+      <w:r>
+        <w:rPr>
+          <w:rFonts w:ascii="Consolas" w:hAnsi="Consolas" w:eastAsia="Consolas"/>
+          <w:color w:val="171B26"/>
+          <w:sz w:val="19"/>
+        </w:rPr>
+        <w:t>/home/ec2-user/dc-saas-deploy/auto-update-saas.sh</w:t>
+      </w:r>
+      <w:r>
+        <w:rPr>
+          <w:rFonts w:ascii="Microsoft YaHei" w:hAnsi="Microsoft YaHei" w:eastAsia="Microsoft YaHei"/>
+          <w:sz w:val="21"/>
+        </w:rPr>
+        <w:t>，只管理 Compose 项目</w:t>
+      </w:r>
+      <w:r>
+        <w:rPr>
+          <w:rFonts w:ascii="Consolas" w:hAnsi="Consolas" w:eastAsia="Consolas"/>
+          <w:color w:val="171B26"/>
+          <w:sz w:val="19"/>
+        </w:rPr>
+        <w:t>dc-saas</w:t>
+      </w:r>
+      <w:r>
+        <w:rPr>
+          <w:rFonts w:ascii="Microsoft YaHei" w:hAnsi="Microsoft YaHei" w:eastAsia="Microsoft YaHei"/>
+          <w:sz w:val="21"/>
+        </w:rPr>
+        <w:t>，日志位于</w:t>
+      </w:r>
+      <w:r>
+        <w:rPr>
+          <w:rFonts w:ascii="Consolas" w:hAnsi="Consolas" w:eastAsia="Consolas"/>
+          <w:color w:val="171B26"/>
+          <w:sz w:val="19"/>
+        </w:rPr>
+        <w:t>/data/dc-saas-runtime/log/auto-update-saas.log</w:t>
+      </w:r>
+      <w:r>
+        <w:rPr>
+          <w:rFonts w:ascii="Microsoft YaHei" w:hAnsi="Microsoft YaHei" w:eastAsia="Microsoft YaHei"/>
+          <w:sz w:val="21"/>
+        </w:rPr>
+        <w:t>。</w:t>
       </w:r>
     </w:p>
     <w:p>
@@ -5779,7 +5824,7 @@
           <w:rFonts w:ascii="Microsoft YaHei" w:hAnsi="Microsoft YaHei" w:eastAsia="Microsoft YaHei"/>
           <w:sz w:val="21"/>
         </w:rPr>
-        <w:t>新镜像需要稳定窗口后成组部署；失败自动恢复上一组镜像。</w:t>
+        <w:t>只从公开 GHCR 拉取应用镜像，不自动更新 MySQL、ClickHouse、ZooKeeper。</w:t>
       </w:r>
     </w:p>
     <w:p>
@@ -5791,7 +5836,61 @@
           <w:rFonts w:ascii="Microsoft YaHei" w:hAnsi="Microsoft YaHei" w:eastAsia="Microsoft YaHei"/>
           <w:sz w:val="21"/>
         </w:rPr>
-        <w:t>验收阶段 OrderSvr/TradeSvr 使用完整 sha 标签固定版本，防止 mutable tag 在测试中漂移。</w:t>
+        <w:t>新镜像需要稳定窗口后成组部署；失败自动恢复上一组镜像。</w:t>
+      </w:r>
+    </w:p>
+    <w:p>
+      <w:pPr>
+        <w:pStyle w:val="ListBullet"/>
+      </w:pPr>
+      <w:r>
+        <w:rPr>
+          <w:rFonts w:ascii="Microsoft YaHei" w:hAnsi="Microsoft YaHei" w:eastAsia="Microsoft YaHei"/>
+          <w:sz w:val="21"/>
+        </w:rPr>
+        <w:t>验收报告记录每个运行容器的不可变 image ID；自动更新以整组远端 digest 指纹和稳定窗口判定发布，测试过程中不允许版本漂移。</w:t>
+      </w:r>
+    </w:p>
+    <w:p>
+      <w:pPr>
+        <w:pStyle w:val="ListBullet"/>
+      </w:pPr>
+      <w:r>
+        <w:rPr>
+          <w:rFonts w:ascii="Microsoft YaHei" w:hAnsi="Microsoft YaHei" w:eastAsia="Microsoft YaHei"/>
+          <w:sz w:val="21"/>
+        </w:rPr>
+        <w:t>Web 固定为</w:t>
+      </w:r>
+      <w:r>
+        <w:rPr>
+          <w:rFonts w:ascii="Consolas" w:hAnsi="Consolas" w:eastAsia="Consolas"/>
+          <w:color w:val="171B26"/>
+          <w:sz w:val="19"/>
+        </w:rPr>
+        <w:t>source-2ed6e68f3ad45a65cb184b5397abc9f752719721</w:t>
+      </w:r>
+      <w:r>
+        <w:rPr>
+          <w:rFonts w:ascii="Microsoft YaHei" w:hAnsi="Microsoft YaHei" w:eastAsia="Microsoft YaHei"/>
+          <w:sz w:val="21"/>
+        </w:rPr>
+        <w:t>，自动更新 dry-run 已确认</w:t>
+      </w:r>
+      <w:r>
+        <w:rPr>
+          <w:rFonts w:ascii="Consolas" w:hAnsi="Consolas" w:eastAsia="Consolas"/>
+          <w:color w:val="171B26"/>
+          <w:sz w:val="19"/>
+        </w:rPr>
+        <w:t>runtime_drift=false</w:t>
+      </w:r>
+      <w:r>
+        <w:rPr>
+          <w:rFonts w:ascii="Microsoft YaHei" w:hAnsi="Microsoft YaHei" w:eastAsia="Microsoft YaHei"/>
+          <w:sz w:val="21"/>
+        </w:rPr>
+        <w:t>，不会把验收版本替换为旧 mutable tag。</w:t>
       </w:r>
     </w:p>
     <w:p>
@@ -6003,7 +6102,7 @@
                 <w:color w:val="171B26"/>
                 <w:sz w:val="17"/>
               </w:rPr>
-              <w:t>47</w:t>
+              <w:t>49</w:t>
             </w:r>
           </w:p>
         </w:tc>
@@ -6111,7 +6210,7 @@
                 <w:color w:val="171B26"/>
                 <w:sz w:val="17"/>
               </w:rPr>
-              <w:t>55</w:t>
+              <w:t>62</w:t>
             </w:r>
           </w:p>
         </w:tc>
@@ -6327,7 +6426,7 @@
                 <w:color w:val="171B26"/>
                 <w:sz w:val="17"/>
               </w:rPr>
-              <w:t>7</w:t>
+              <w:t>12</w:t>
             </w:r>
           </w:p>
         </w:tc>
@@ -6543,7 +6642,7 @@
                 <w:color w:val="171B26"/>
                 <w:sz w:val="17"/>
               </w:rPr>
-              <w:t>140</w:t>
+              <w:t>154</w:t>
             </w:r>
           </w:p>
         </w:tc>
@@ -7036,7 +7135,7 @@
                 <w:color w:val="171B26"/>
                 <w:sz w:val="17"/>
               </w:rPr>
-              <w:t>POSTBATCH1000</w:t>
+              <w:t>PROD-1000×16</w:t>
             </w:r>
           </w:p>
         </w:tc>
@@ -7198,7 +7297,7 @@
                 <w:color w:val="171B26"/>
                 <w:sz w:val="17"/>
               </w:rPr>
-              <w:t>约 77.0/72.1/78.6 req/s；p99 710/1023/767 ms</w:t>
+              <w:t>挂单/maker/taker 81.6/144.9/146.8 req/s；p99 814/206/326 ms</w:t>
             </w:r>
           </w:p>
         </w:tc>
@@ -7226,7 +7325,7 @@
                 <w:color w:val="171B26"/>
                 <w:sz w:val="17"/>
               </w:rPr>
-              <w:t>POSTBATCH3000</w:t>
+              <w:t>PROD-3000×32</w:t>
             </w:r>
           </w:p>
         </w:tc>
@@ -7382,7 +7481,7 @@
                 <w:color w:val="171B26"/>
                 <w:sz w:val="17"/>
               </w:rPr>
-              <w:t>约 92.1/98.1/80.2 req/s；p99 1088/1562/1765 ms；最大 2.03 s</w:t>
+              <w:t>挂单/maker/taker 143.9/214.5/232.6 req/s；p99 803/311/310 ms；最大 1.60 s</w:t>
             </w:r>
           </w:p>
         </w:tc>
@@ -8153,19 +8252,28 @@
       </w:r>
     </w:p>
     <w:p>
-      <w:pPr>
-        <w:pStyle w:val="Heading2"/>
-      </w:pPr>
-      <w:r>
-        <w:rPr>
-          <w:rFonts w:ascii="Microsoft YaHei" w:hAnsi="Microsoft YaHei" w:eastAsia="Microsoft YaHei"/>
-          <w:sz w:val="28"/>
-        </w:rPr>
-        <w:t>12.3 完整业务验收</w:t>
+      <w:r>
+        <w:rPr>
+          <w:rFonts w:ascii="Microsoft YaHei" w:hAnsi="Microsoft YaHei" w:eastAsia="Microsoft YaHei"/>
+          <w:sz w:val="21"/>
+        </w:rPr>
+        <w:t>生产高压先后执行了两类失败注入式诊断：原 640 MiB TradeSvr 在约第 1,960 笔 taker 成交时被 cgroup OOM；增加受控堆外余量后，首次 3000×32 得到订单 9000/9000、流水 6000/6000，但 OrderSvr 成交回报仅 5229/6000。根因分别修复为 896 MiB 容器上限/原生内存约束/成功路径降噪，以及 TradeSvr 幂等重试返回首次完整 PResult。最终独立 location 重跑达到 9000/6000/6000、0 重启、0 OOM。失败结果与修复后结果均保留日志，避免只报告成功轮次。</w:t>
       </w:r>
     </w:p>
     <w:p>
       <w:pPr>
+        <w:pStyle w:val="Heading2"/>
+      </w:pPr>
+      <w:r>
+        <w:rPr>
+          <w:rFonts w:ascii="Microsoft YaHei" w:hAnsi="Microsoft YaHei" w:eastAsia="Microsoft YaHei"/>
+          <w:sz w:val="28"/>
+        </w:rPr>
+        <w:t>12.3 完整业务验收</w:t>
+      </w:r>
+    </w:p>
+    <w:p>
+      <w:pPr>
         <w:pStyle w:val="ListBullet"/>
       </w:pPr>
       <w:r>
@@ -8173,7 +8281,7 @@
           <w:rFonts w:ascii="Microsoft YaHei" w:hAnsi="Microsoft YaHei" w:eastAsia="Microsoft YaHei"/>
           <w:sz w:val="21"/>
         </w:rPr>
-        <w:t>13 个核心容器、34 张 MySQL 表、21 张带 location 的业务表和 Web 健康：PASS。</w:t>
+        <w:t>13 个核心容器、40 张 MySQL 表、26 个 location 字段和 Web 健康：PASS。</w:t>
       </w:r>
     </w:p>
     <w:p>
@@ -8277,7 +8385,22 @@
           <w:color w:val="171B26"/>
           <w:sz w:val="19"/>
         </w:rPr>
-        <w:t>/root/core-trading-acceptance-FINALCORE-R2-20260829045001.log</w:t>
+        <w:t>/data/dc-saas-runtime/e2e-artifacts/core-full-acceptance-postfix.log</w:t>
+      </w:r>
+      <w:r>
+        <w:rPr>
+          <w:rFonts w:ascii="Microsoft YaHei" w:hAnsi="Microsoft YaHei" w:eastAsia="Microsoft YaHei"/>
+          <w:sz w:val="21"/>
+        </w:rPr>
+        <w:t>；3000×32 日志：</w:t>
+      </w:r>
+      <w:r>
+        <w:rPr>
+          <w:rFonts w:ascii="Consolas" w:hAnsi="Consolas" w:eastAsia="Consolas"/>
+          <w:color w:val="171B26"/>
+          <w:sz w:val="19"/>
+        </w:rPr>
+        <w:t>core-stress-3000x32-retry.log</w:t>
       </w:r>
       <w:r>
         <w:rPr>
@@ -8308,7 +8431,7 @@
           <w:rFonts w:ascii="Microsoft YaHei" w:hAnsi="Microsoft YaHei" w:eastAsia="Microsoft YaHei"/>
           <w:sz w:val="28"/>
         </w:rPr>
-        <w:t>13.1 新版双语登录页（本地生产构建）</w:t>
+        <w:t>13.1 生产环境桌面交易工作区</w:t>
       </w:r>
     </w:p>
     <w:p>
@@ -8319,7 +8442,7 @@
       <w:r>
         <w:drawing>
           <wp:inline xmlns:a="http://schemas.openxmlformats.org/drawingml/2006/main" xmlns:pic="http://schemas.openxmlformats.org/drawingml/2006/picture">
-            <wp:extent cx="5897880" cy="4095750"/>
+            <wp:extent cx="5897880" cy="3317558"/>
             <wp:docPr id="1" name="Picture 1"/>
             <wp:cNvGraphicFramePr>
               <a:graphicFrameLocks noChangeAspect="1"/>
@@ -8328,7 +8451,7 @@
               <a:graphicData uri="http://schemas.openxmlformats.org/drawingml/2006/picture">
                 <pic:pic>
                   <pic:nvPicPr>
-                    <pic:cNvPr id="0" name="login-professional-en.png"/>
+                    <pic:cNvPr id="0" name="workspace-en.png"/>
                     <pic:cNvPicPr/>
                   </pic:nvPicPr>
                   <pic:blipFill>
@@ -8340,7 +8463,7 @@
                   <pic:spPr>
                     <a:xfrm>
                       <a:off x="0" y="0"/>
-                      <a:ext cx="5897880" cy="4095750"/>
+                      <a:ext cx="5897880" cy="3317558"/>
                     </a:xfrm>
                     <a:prstGeom prst="rect"/>
                   </pic:spPr>
@@ -8362,19 +8485,7 @@
           <w:color w:val="667085"/>
           <w:sz w:val="17"/>
         </w:rPr>
-        <w:t>图：新版专业深色英文登录页</w:t>
-      </w:r>
-    </w:p>
-    <w:p>
-      <w:pPr>
-        <w:pStyle w:val="Heading2"/>
-      </w:pPr>
-      <w:r>
-        <w:rPr>
-          <w:rFonts w:ascii="Microsoft YaHei" w:hAnsi="Microsoft YaHei" w:eastAsia="Microsoft YaHei"/>
-          <w:sz w:val="28"/>
-        </w:rPr>
-        <w:t>13.2 Web 交易界面（64 环境历史核心验收）</w:t>
+        <w:t>图：生产环境英文桌面交易工作区</w:t>
       </w:r>
     </w:p>
     <w:p>
@@ -8394,7 +8505,7 @@
               <a:graphicData uri="http://schemas.openxmlformats.org/drawingml/2006/picture">
                 <pic:pic>
                   <pic:nvPicPr>
-                    <pic:cNvPr id="0" name="buyer-trading-flow.png"/>
+                    <pic:cNvPr id="0" name="workspace-zh.png"/>
                     <pic:cNvPicPr/>
                   </pic:nvPicPr>
                   <pic:blipFill>
@@ -8428,7 +8539,7 @@
           <w:color w:val="667085"/>
           <w:sz w:val="17"/>
         </w:rPr>
-        <w:t>图：Web 交易界面、最近成交、账户资金和下单区域</w:t>
+        <w:t>图：生产环境中文桌面交易工作区</w:t>
       </w:r>
     </w:p>
     <w:p>
@@ -8440,7 +8551,7 @@
           <w:rFonts w:ascii="Microsoft YaHei" w:hAnsi="Microsoft YaHei" w:eastAsia="Microsoft YaHei"/>
           <w:sz w:val="28"/>
         </w:rPr>
-        <w:t>13.3 Web 第二会话/订单簿界面（64 环境历史核心验收）</w:t>
+        <w:t>13.2 生产环境完整 Web 交易链路</w:t>
       </w:r>
     </w:p>
     <w:p>
@@ -8460,7 +8571,7 @@
               <a:graphicData uri="http://schemas.openxmlformats.org/drawingml/2006/picture">
                 <pic:pic>
                   <pic:nvPicPr>
-                    <pic:cNvPr id="0" name="seller-trade-history.png"/>
+                    <pic:cNvPr id="0" name="buyer-trading-flow.png"/>
                     <pic:cNvPicPr/>
                   </pic:nvPicPr>
                   <pic:blipFill>
@@ -8494,31 +8605,259 @@
           <w:color w:val="667085"/>
           <w:sz w:val="17"/>
         </w:rPr>
-        <w:t>图：第二用户会话与订单簿界面</w:t>
+        <w:t>图：Web 交易界面、最近成交、账户资金和下单区域</w:t>
       </w:r>
     </w:p>
     <w:p>
       <w:pPr>
-        <w:pStyle w:val="Heading2"/>
-      </w:pPr>
-      <w:r>
-        <w:rPr>
-          <w:rFonts w:ascii="Microsoft YaHei" w:hAnsi="Microsoft YaHei" w:eastAsia="Microsoft YaHei"/>
-          <w:sz w:val="28"/>
-        </w:rPr>
-        <w:t>13.4 MySQL、ClickHouse 与容器证据（64 环境历史核心验收）</w:t>
+        <w:keepLines/>
+        <w:jc w:val="center"/>
+      </w:pPr>
+      <w:r>
+        <w:drawing>
+          <wp:inline xmlns:a="http://schemas.openxmlformats.org/drawingml/2006/main" xmlns:pic="http://schemas.openxmlformats.org/drawingml/2006/picture">
+            <wp:extent cx="5897880" cy="3317558"/>
+            <wp:docPr id="4" name="Picture 4"/>
+            <wp:cNvGraphicFramePr>
+              <a:graphicFrameLocks noChangeAspect="1"/>
+            </wp:cNvGraphicFramePr>
+            <a:graphic>
+              <a:graphicData uri="http://schemas.openxmlformats.org/drawingml/2006/picture">
+                <pic:pic>
+                  <pic:nvPicPr>
+                    <pic:cNvPr id="0" name="seller-trade-history.png"/>
+                    <pic:cNvPicPr/>
+                  </pic:nvPicPr>
+                  <pic:blipFill>
+                    <a:blip r:embed="rId14"/>
+                    <a:stretch>
+                      <a:fillRect/>
+                    </a:stretch>
+                  </pic:blipFill>
+                  <pic:spPr>
+                    <a:xfrm>
+                      <a:off x="0" y="0"/>
+                      <a:ext cx="5897880" cy="3317558"/>
+                    </a:xfrm>
+                    <a:prstGeom prst="rect"/>
+                  </pic:spPr>
+                </pic:pic>
+              </a:graphicData>
+            </a:graphic>
+          </wp:inline>
+        </w:drawing>
       </w:r>
     </w:p>
     <w:p>
       <w:pPr>
+        <w:spacing w:after="160"/>
+        <w:jc w:val="center"/>
+      </w:pPr>
+      <w:r>
+        <w:rPr>
+          <w:rFonts w:ascii="Microsoft YaHei" w:hAnsi="Microsoft YaHei" w:eastAsia="Microsoft YaHei"/>
+          <w:color w:val="667085"/>
+          <w:sz w:val="17"/>
+        </w:rPr>
+        <w:t>图：第二用户成交历史与账户状态</w:t>
+      </w:r>
+    </w:p>
+    <w:p>
+      <w:pPr>
         <w:keepLines/>
         <w:jc w:val="center"/>
       </w:pPr>
       <w:r>
         <w:drawing>
           <wp:inline xmlns:a="http://schemas.openxmlformats.org/drawingml/2006/main" xmlns:pic="http://schemas.openxmlformats.org/drawingml/2006/picture">
-            <wp:extent cx="5344410" cy="7498080"/>
-            <wp:docPr id="4" name="Picture 4"/>
+            <wp:extent cx="5897880" cy="3317558"/>
+            <wp:docPr id="5" name="Picture 5"/>
+            <wp:cNvGraphicFramePr>
+              <a:graphicFrameLocks noChangeAspect="1"/>
+            </wp:cNvGraphicFramePr>
+            <a:graphic>
+              <a:graphicData uri="http://schemas.openxmlformats.org/drawingml/2006/picture">
+                <pic:pic>
+                  <pic:nvPicPr>
+                    <pic:cNvPr id="0" name="web-market-data.png"/>
+                    <pic:cNvPicPr/>
+                  </pic:nvPicPr>
+                  <pic:blipFill>
+                    <a:blip r:embed="rId15"/>
+                    <a:stretch>
+                      <a:fillRect/>
+                    </a:stretch>
+                  </pic:blipFill>
+                  <pic:spPr>
+                    <a:xfrm>
+                      <a:off x="0" y="0"/>
+                      <a:ext cx="5897880" cy="3317558"/>
+                    </a:xfrm>
+                    <a:prstGeom prst="rect"/>
+                  </pic:spPr>
+                </pic:pic>
+              </a:graphicData>
+            </a:graphic>
+          </wp:inline>
+        </w:drawing>
+      </w:r>
+    </w:p>
+    <w:p>
+      <w:pPr>
+        <w:spacing w:after="160"/>
+        <w:jc w:val="center"/>
+      </w:pPr>
+      <w:r>
+        <w:rPr>
+          <w:rFonts w:ascii="Microsoft YaHei" w:hAnsi="Microsoft YaHei" w:eastAsia="Microsoft YaHei"/>
+          <w:color w:val="667085"/>
+          <w:sz w:val="17"/>
+        </w:rPr>
+        <w:t>图：订单簿、最近成交、K 线和 Last/Mark/Index 行情</w:t>
+      </w:r>
+    </w:p>
+    <w:p>
+      <w:pPr>
+        <w:pStyle w:val="Heading2"/>
+      </w:pPr>
+      <w:r>
+        <w:rPr>
+          <w:rFonts w:ascii="Microsoft YaHei" w:hAnsi="Microsoft YaHei" w:eastAsia="Microsoft YaHei"/>
+          <w:sz w:val="28"/>
+        </w:rPr>
+        <w:t>13.3 生产环境手机交易工作区</w:t>
+      </w:r>
+    </w:p>
+    <w:p>
+      <w:pPr>
+        <w:keepLines/>
+        <w:jc w:val="center"/>
+      </w:pPr>
+      <w:r>
+        <w:drawing>
+          <wp:inline xmlns:a="http://schemas.openxmlformats.org/drawingml/2006/main" xmlns:pic="http://schemas.openxmlformats.org/drawingml/2006/picture">
+            <wp:extent cx="3464752" cy="7498079"/>
+            <wp:docPr id="6" name="Picture 6"/>
+            <wp:cNvGraphicFramePr>
+              <a:graphicFrameLocks noChangeAspect="1"/>
+            </wp:cNvGraphicFramePr>
+            <a:graphic>
+              <a:graphicData uri="http://schemas.openxmlformats.org/drawingml/2006/picture">
+                <pic:pic>
+                  <pic:nvPicPr>
+                    <pic:cNvPr id="0" name="workspace-mobile-en.png"/>
+                    <pic:cNvPicPr/>
+                  </pic:nvPicPr>
+                  <pic:blipFill>
+                    <a:blip r:embed="rId16"/>
+                    <a:stretch>
+                      <a:fillRect/>
+                    </a:stretch>
+                  </pic:blipFill>
+                  <pic:spPr>
+                    <a:xfrm>
+                      <a:off x="0" y="0"/>
+                      <a:ext cx="3464752" cy="7498079"/>
+                    </a:xfrm>
+                    <a:prstGeom prst="rect"/>
+                  </pic:spPr>
+                </pic:pic>
+              </a:graphicData>
+            </a:graphic>
+          </wp:inline>
+        </w:drawing>
+      </w:r>
+    </w:p>
+    <w:p>
+      <w:pPr>
+        <w:spacing w:after="160"/>
+        <w:jc w:val="center"/>
+      </w:pPr>
+      <w:r>
+        <w:rPr>
+          <w:rFonts w:ascii="Microsoft YaHei" w:hAnsi="Microsoft YaHei" w:eastAsia="Microsoft YaHei"/>
+          <w:color w:val="667085"/>
+          <w:sz w:val="17"/>
+        </w:rPr>
+        <w:t>图：390×844 英文手机交易工作区</w:t>
+      </w:r>
+    </w:p>
+    <w:p>
+      <w:pPr>
+        <w:keepLines/>
+        <w:jc w:val="center"/>
+      </w:pPr>
+      <w:r>
+        <w:drawing>
+          <wp:inline xmlns:a="http://schemas.openxmlformats.org/drawingml/2006/main" xmlns:pic="http://schemas.openxmlformats.org/drawingml/2006/picture">
+            <wp:extent cx="3464752" cy="7498079"/>
+            <wp:docPr id="7" name="Picture 7"/>
+            <wp:cNvGraphicFramePr>
+              <a:graphicFrameLocks noChangeAspect="1"/>
+            </wp:cNvGraphicFramePr>
+            <a:graphic>
+              <a:graphicData uri="http://schemas.openxmlformats.org/drawingml/2006/picture">
+                <pic:pic>
+                  <pic:nvPicPr>
+                    <pic:cNvPr id="0" name="workspace-mobile-zh.png"/>
+                    <pic:cNvPicPr/>
+                  </pic:nvPicPr>
+                  <pic:blipFill>
+                    <a:blip r:embed="rId17"/>
+                    <a:stretch>
+                      <a:fillRect/>
+                    </a:stretch>
+                  </pic:blipFill>
+                  <pic:spPr>
+                    <a:xfrm>
+                      <a:off x="0" y="0"/>
+                      <a:ext cx="3464752" cy="7498079"/>
+                    </a:xfrm>
+                    <a:prstGeom prst="rect"/>
+                  </pic:spPr>
+                </pic:pic>
+              </a:graphicData>
+            </a:graphic>
+          </wp:inline>
+        </w:drawing>
+      </w:r>
+    </w:p>
+    <w:p>
+      <w:pPr>
+        <w:spacing w:after="160"/>
+        <w:jc w:val="center"/>
+      </w:pPr>
+      <w:r>
+        <w:rPr>
+          <w:rFonts w:ascii="Microsoft YaHei" w:hAnsi="Microsoft YaHei" w:eastAsia="Microsoft YaHei"/>
+          <w:color w:val="667085"/>
+          <w:sz w:val="17"/>
+        </w:rPr>
+        <w:t>图：390×844 中文手机交易工作区</w:t>
+      </w:r>
+    </w:p>
+    <w:p>
+      <w:pPr>
+        <w:pStyle w:val="Heading2"/>
+      </w:pPr>
+      <w:r>
+        <w:rPr>
+          <w:rFonts w:ascii="Microsoft YaHei" w:hAnsi="Microsoft YaHei" w:eastAsia="Microsoft YaHei"/>
+          <w:sz w:val="28"/>
+        </w:rPr>
+        <w:t>13.4 MySQL、ClickHouse 与容器证据（生产环境）</w:t>
+      </w:r>
+    </w:p>
+    <w:p>
+      <w:pPr>
+        <w:keepLines/>
+        <w:jc w:val="center"/>
+      </w:pPr>
+      <w:r>
+        <w:drawing>
+          <wp:inline xmlns:a="http://schemas.openxmlformats.org/drawingml/2006/main" xmlns:pic="http://schemas.openxmlformats.org/drawingml/2006/picture">
+            <wp:extent cx="5139442" cy="7498079"/>
+            <wp:docPr id="8" name="Picture 8"/>
             <wp:cNvGraphicFramePr>
               <a:graphicFrameLocks noChangeAspect="1"/>
             </wp:cNvGraphicFramePr>
@@ -8530,7 +8869,7 @@
                     <pic:cNvPicPr/>
                   </pic:nvPicPr>
                   <pic:blipFill>
-                    <a:blip r:embed="rId14"/>
+                    <a:blip r:embed="rId18"/>
                     <a:stretch>
                       <a:fillRect/>
                     </a:stretch>
@@ -8538,7 +8877,7 @@
                   <pic:spPr>
                     <a:xfrm>
                       <a:off x="0" y="0"/>
-                      <a:ext cx="5344410" cy="7498080"/>
+                      <a:ext cx="5139442" cy="7498079"/>
                     </a:xfrm>
                     <a:prstGeom prst="rect"/>
                   </pic:spPr>
@@ -8582,7 +8921,7 @@
           <w:color w:val="171B26"/>
           <w:sz w:val="19"/>
         </w:rPr>
-        <w:t>login-professional-en.png</w:t>
+        <w:t>buyer-trading-flow.png</w:t>
       </w:r>
       <w:r>
         <w:rPr>
@@ -8597,7 +8936,7 @@
           <w:color w:val="171B26"/>
           <w:sz w:val="19"/>
         </w:rPr>
-        <w:t>60ba9c4dbbb0645bf748d07ba4c6be904c526445b3f861e09a1afe8cad3e3aef</w:t>
+        <w:t>19712c9c9c23982daa26f75d0ba66246227e0492b91dd278c549d1d2e9137a7d</w:t>
       </w:r>
     </w:p>
     <w:p>
@@ -8610,7 +8949,7 @@
           <w:color w:val="171B26"/>
           <w:sz w:val="19"/>
         </w:rPr>
-        <w:t>buyer-trading-flow.png</w:t>
+        <w:t>seller-trade-history.png</w:t>
       </w:r>
       <w:r>
         <w:rPr>
@@ -8625,7 +8964,7 @@
           <w:color w:val="171B26"/>
           <w:sz w:val="19"/>
         </w:rPr>
-        <w:t>7ab70d9a29fcf9e87faf7c73e6532394daade4d304bcd07c44ebcc2d8a4ef3f2</w:t>
+        <w:t>33035bf00a3835e25da14bcc5c9f8fa617093637941b52cac32ffa21f4147ecc</w:t>
       </w:r>
     </w:p>
     <w:p>
@@ -8638,7 +8977,7 @@
           <w:color w:val="171B26"/>
           <w:sz w:val="19"/>
         </w:rPr>
-        <w:t>seller-trade-history.png</w:t>
+        <w:t>web-market-data.png</w:t>
       </w:r>
       <w:r>
         <w:rPr>
@@ -8653,7 +8992,7 @@
           <w:color w:val="171B26"/>
           <w:sz w:val="19"/>
         </w:rPr>
-        <w:t>fde33445d2c9fb351fbe9c035e3017d27455c3f3e081cbaf1e0aa3e98894bd60</w:t>
+        <w:t>130c8669ce9badbfe8dec6c53e7b55fa6ec2adcb10234dbdc0b7d921f6b2155e</w:t>
       </w:r>
     </w:p>
     <w:p>
@@ -8666,7 +9005,7 @@
           <w:color w:val="171B26"/>
           <w:sz w:val="19"/>
         </w:rPr>
-        <w:t>database-evidence.png</w:t>
+        <w:t>workspace-en.png</w:t>
       </w:r>
       <w:r>
         <w:rPr>
@@ -8681,7 +9020,119 @@
           <w:color w:val="171B26"/>
           <w:sz w:val="19"/>
         </w:rPr>
-        <w:t>6d94892d0f94661ed08bd5c5d0b2635bd8486974c0ac359f4e35eb55271fbdbe</w:t>
+        <w:t>7891a7b143caed914b358a7350eef32c7273ba29cdf490f27263503059b00667</w:t>
+      </w:r>
+    </w:p>
+    <w:p>
+      <w:pPr>
+        <w:pStyle w:val="ListBullet"/>
+      </w:pPr>
+      <w:r>
+        <w:rPr>
+          <w:rFonts w:ascii="Consolas" w:hAnsi="Consolas" w:eastAsia="Consolas"/>
+          <w:color w:val="171B26"/>
+          <w:sz w:val="19"/>
+        </w:rPr>
+        <w:t>workspace-zh.png</w:t>
+      </w:r>
+      <w:r>
+        <w:rPr>
+          <w:rFonts w:ascii="Microsoft YaHei" w:hAnsi="Microsoft YaHei" w:eastAsia="Microsoft YaHei"/>
+          <w:sz w:val="21"/>
+        </w:rPr>
+        <w:t>：</w:t>
+      </w:r>
+      <w:r>
+        <w:rPr>
+          <w:rFonts w:ascii="Consolas" w:hAnsi="Consolas" w:eastAsia="Consolas"/>
+          <w:color w:val="171B26"/>
+          <w:sz w:val="19"/>
+        </w:rPr>
+        <w:t>88b1c9c926e86b2837b862cc2a525a1d29e1984e79ddefe696103300055b906d</w:t>
+      </w:r>
+    </w:p>
+    <w:p>
+      <w:pPr>
+        <w:pStyle w:val="ListBullet"/>
+      </w:pPr>
+      <w:r>
+        <w:rPr>
+          <w:rFonts w:ascii="Consolas" w:hAnsi="Consolas" w:eastAsia="Consolas"/>
+          <w:color w:val="171B26"/>
+          <w:sz w:val="19"/>
+        </w:rPr>
+        <w:t>workspace-mobile-en.png</w:t>
+      </w:r>
+      <w:r>
+        <w:rPr>
+          <w:rFonts w:ascii="Microsoft YaHei" w:hAnsi="Microsoft YaHei" w:eastAsia="Microsoft YaHei"/>
+          <w:sz w:val="21"/>
+        </w:rPr>
+        <w:t>：</w:t>
+      </w:r>
+      <w:r>
+        <w:rPr>
+          <w:rFonts w:ascii="Consolas" w:hAnsi="Consolas" w:eastAsia="Consolas"/>
+          <w:color w:val="171B26"/>
+          <w:sz w:val="19"/>
+        </w:rPr>
+        <w:t>ded9008f1509462f02820a7e6d10c87263f3c599c5f597e151736bd56705a693</w:t>
+      </w:r>
+    </w:p>
+    <w:p>
+      <w:pPr>
+        <w:pStyle w:val="ListBullet"/>
+      </w:pPr>
+      <w:r>
+        <w:rPr>
+          <w:rFonts w:ascii="Consolas" w:hAnsi="Consolas" w:eastAsia="Consolas"/>
+          <w:color w:val="171B26"/>
+          <w:sz w:val="19"/>
+        </w:rPr>
+        <w:t>workspace-mobile-zh.png</w:t>
+      </w:r>
+      <w:r>
+        <w:rPr>
+          <w:rFonts w:ascii="Microsoft YaHei" w:hAnsi="Microsoft YaHei" w:eastAsia="Microsoft YaHei"/>
+          <w:sz w:val="21"/>
+        </w:rPr>
+        <w:t>：</w:t>
+      </w:r>
+      <w:r>
+        <w:rPr>
+          <w:rFonts w:ascii="Consolas" w:hAnsi="Consolas" w:eastAsia="Consolas"/>
+          <w:color w:val="171B26"/>
+          <w:sz w:val="19"/>
+        </w:rPr>
+        <w:t>b3978c5a7dc17c8222c8d37b0c5b850b67a1707f0aa562f8ace0e85196471cf1</w:t>
+      </w:r>
+    </w:p>
+    <w:p>
+      <w:pPr>
+        <w:pStyle w:val="ListBullet"/>
+      </w:pPr>
+      <w:r>
+        <w:rPr>
+          <w:rFonts w:ascii="Consolas" w:hAnsi="Consolas" w:eastAsia="Consolas"/>
+          <w:color w:val="171B26"/>
+          <w:sz w:val="19"/>
+        </w:rPr>
+        <w:t>database-evidence.png</w:t>
+      </w:r>
+      <w:r>
+        <w:rPr>
+          <w:rFonts w:ascii="Microsoft YaHei" w:hAnsi="Microsoft YaHei" w:eastAsia="Microsoft YaHei"/>
+          <w:sz w:val="21"/>
+        </w:rPr>
+        <w:t>：</w:t>
+      </w:r>
+      <w:r>
+        <w:rPr>
+          <w:rFonts w:ascii="Consolas" w:hAnsi="Consolas" w:eastAsia="Consolas"/>
+          <w:color w:val="171B26"/>
+          <w:sz w:val="19"/>
+        </w:rPr>
+        <w:t>13ae3ced4d100e095d751b8a295468964d4c2da8224097affa6ba2bfe1e7d267</w:t>
       </w:r>
     </w:p>
     <w:p>
@@ -9085,7 +9536,7 @@
                 <w:color w:val="171B26"/>
                 <w:sz w:val="17"/>
               </w:rPr>
-              <w:t>APS 无法连接 Binance</w:t>
+              <w:t>APS 当前仅验证单一外部源</w:t>
             </w:r>
           </w:p>
         </w:tc>
@@ -9111,7 +9562,7 @@
                 <w:color w:val="171B26"/>
                 <w:sz w:val="17"/>
               </w:rPr>
-              <w:t>64 环境网络不可达，核心测试使用受控标记价</w:t>
+              <w:t>Binance Futures 实时 ticker/bookTicker 和 Web Mark/Index 已通过</w:t>
             </w:r>
           </w:p>
         </w:tc>
@@ -9137,7 +9588,7 @@
                 <w:color w:val="171B26"/>
                 <w:sz w:val="17"/>
               </w:rPr>
-              <w:t>修复出站网络并建设多源指数/异常剔除</w:t>
+              <w:t>建设多源指数、异常剔除、断源降级与偏离保护</w:t>
             </w:r>
           </w:p>
         </w:tc>
@@ -9327,7 +9778,7 @@
                 <w:color w:val="171B26"/>
                 <w:sz w:val="17"/>
               </w:rPr>
-              <w:t>实测峰值约 98 req/s，p99 最高 1.77 s</w:t>
+              <w:t>3000×32 实测 taker 232.6 req/s；挂单阶段 p99 803 ms</w:t>
             </w:r>
           </w:p>
         </w:tc>
@@ -9897,14 +10348,29 @@
           <w:color w:val="171B26"/>
           <w:sz w:val="19"/>
         </w:rPr>
-        <w:t>corebuyer / WebE2E!20260827</w:t>
+        <w:t>p2buyer</w:t>
       </w:r>
       <w:r>
         <w:rPr>
           <w:rFonts w:ascii="Microsoft YaHei" w:hAnsi="Microsoft YaHei" w:eastAsia="Microsoft YaHei"/>
           <w:sz w:val="21"/>
         </w:rPr>
-        <w:t>登录。</w:t>
+        <w:t>或</w:t>
+      </w:r>
+      <w:r>
+        <w:rPr>
+          <w:rFonts w:ascii="Consolas" w:hAnsi="Consolas" w:eastAsia="Consolas"/>
+          <w:color w:val="171B26"/>
+          <w:sz w:val="19"/>
+        </w:rPr>
+        <w:t>p2seller</w:t>
+      </w:r>
+      <w:r>
+        <w:rPr>
+          <w:rFonts w:ascii="Microsoft YaHei" w:hAnsi="Microsoft YaHei" w:eastAsia="Microsoft YaHei"/>
+          <w:sz w:val="21"/>
+        </w:rPr>
+        <w:t>及运维提供的验收密码登录。</w:t>
       </w:r>
     </w:p>
     <w:p>
@@ -9940,7 +10406,37 @@
           <w:rFonts w:ascii="Microsoft YaHei" w:hAnsi="Microsoft YaHei" w:eastAsia="Microsoft YaHei"/>
           <w:sz w:val="21"/>
         </w:rPr>
-        <w:t>使用两个无痕浏览器分别登录 corebuyer 和 coreseller，以相同价格、相同数量提交相反订单。</w:t>
+        <w:t>使用两个无痕浏览器分别登录</w:t>
+      </w:r>
+      <w:r>
+        <w:rPr>
+          <w:rFonts w:ascii="Consolas" w:hAnsi="Consolas" w:eastAsia="Consolas"/>
+          <w:color w:val="171B26"/>
+          <w:sz w:val="19"/>
+        </w:rPr>
+        <w:t>p2buyer</w:t>
+      </w:r>
+      <w:r>
+        <w:rPr>
+          <w:rFonts w:ascii="Microsoft YaHei" w:hAnsi="Microsoft YaHei" w:eastAsia="Microsoft YaHei"/>
+          <w:sz w:val="21"/>
+        </w:rPr>
+        <w:t>和</w:t>
+      </w:r>
+      <w:r>
+        <w:rPr>
+          <w:rFonts w:ascii="Consolas" w:hAnsi="Consolas" w:eastAsia="Consolas"/>
+          <w:color w:val="171B26"/>
+          <w:sz w:val="19"/>
+        </w:rPr>
+        <w:t>p2seller</w:t>
+      </w:r>
+      <w:r>
+        <w:rPr>
+          <w:rFonts w:ascii="Microsoft YaHei" w:hAnsi="Microsoft YaHei" w:eastAsia="Microsoft YaHei"/>
+          <w:sz w:val="21"/>
+        </w:rPr>
+        <w:t>，以相同价格、相同数量提交相反订单。</w:t>
       </w:r>
     </w:p>
     <w:p>

</xml_diff>

<commit_message>
docs(saas): publish tenant production acceptance
</commit_message>
<xml_diff>
--- a/docs/DC_SAAS_CRYPTO_PRODUCT_AND_ACCEPTANCE_20260829.zh-CN.docx
+++ b/docs/DC_SAAS_CRYPTO_PRODUCT_AND_ACCEPTANCE_20260829.zh-CN.docx
@@ -75,13 +75,13 @@
           <w:color w:val="171B26"/>
           <w:sz w:val="22"/>
         </w:rPr>
-        <w:t>版本：V1.1</w:t>
+        <w:t>版本：V1.3</w:t>
         <w:br/>
         <w:t>基线：2026-08-30</w:t>
         <w:br/>
         <w:t>分支：saas-crypto</w:t>
         <w:br/>
-        <w:t>验收环境：172.16.97.64 / CORE_E2E</w:t>
+        <w:t>验收环境：18.140.45.126 / dc-saas</w:t>
       </w:r>
     </w:p>
     <w:p>
@@ -171,7 +171,16 @@
           <w:rFonts w:ascii="Microsoft YaHei" w:hAnsi="Microsoft YaHei" w:eastAsia="Microsoft YaHei"/>
           <w:sz w:val="21"/>
         </w:rPr>
-        <w:t>当前结论是“核心交易功能可供产品验收和继续开发”，不是“可直接承载真实用户资金”。真实资金上线前仍必须完成服务端权威租户、不可变复式账本/持久化事件、生产指数和标记价、私有流、限流、安全合规、高可用、灾备和更高容量门禁。</w:t>
+        <w:t>2026-08-30 又完成了 SaaS 控制面生产验收：公开试用申请、平台审批、租户初始化、独立 URL、租户内注册、租户管理员、同名用户隔离、品种规则、API Key、流动性 Robot 配置、交易记录、租户设置与审计、暂停和恢复均已形成真实 Web/GW/服务/MySQL 闭环。最终浏览器回归覆盖桌面端和 390×844 手机端。</w:t>
+      </w:r>
+    </w:p>
+    <w:p>
+      <w:r>
+        <w:rPr>
+          <w:rFonts w:ascii="Microsoft YaHei" w:hAnsi="Microsoft YaHei" w:eastAsia="Microsoft YaHei"/>
+          <w:sz w:val="21"/>
+        </w:rPr>
+        <w:t>当前结论是“核心交易功能和第一阶段多租户控制面可供产品验收和继续开发”，不是“可直接承载真实用户资金”。真实资金上线前仍必须完成不可变复式账本/持久化事件、生产指数和标记价、私有流、限流、安全合规、高可用、灾备和更高容量门禁；还需继续对 OrderSvr、TradeSvr、MDSvr、LiqSvr 的全部请求、Topic、缓存、锁和持久化键执行系统性跨租户攻击测试。</w:t>
       </w:r>
     </w:p>
     <w:p>
@@ -408,7 +417,7 @@
           <w:rFonts w:ascii="Microsoft YaHei" w:hAnsi="Microsoft YaHei" w:eastAsia="Microsoft YaHei"/>
           <w:sz w:val="21"/>
         </w:rPr>
-        <w:t>已产品化的租户申请、审批、独立域名、租户管理员和 RBAC 控制台。</w:t>
+        <w:t>自定义域名自动解析、证书自动签发、套餐计费、完整平台 RBAC、KYC 和租户配额计费；当前已交付 location 独立 URL 与第一阶段平台/租户管理控制台。</w:t>
       </w:r>
     </w:p>
     <w:p>
@@ -660,14 +669,14 @@
           <w:color w:val="171B26"/>
           <w:sz w:val="19"/>
         </w:rPr>
-        <w:t>2ed6e68</w:t>
+        <w:t>97b3afe88928fe0c6b26a8564d88ae5168556dba</w:t>
       </w:r>
       <w:r>
         <w:rPr>
           <w:rFonts w:ascii="Microsoft YaHei" w:hAnsi="Microsoft YaHei" w:eastAsia="Microsoft YaHei"/>
           <w:sz w:val="21"/>
         </w:rPr>
-        <w:t>，使用公开</w:t>
+        <w:t>，运行不可变公开镜像</w:t>
       </w:r>
       <w:r>
         <w:rPr>
@@ -675,14 +684,14 @@
           <w:color w:val="171B26"/>
           <w:sz w:val="19"/>
         </w:rPr>
-        <w:t>ghcr.io</w:t>
+        <w:t>source-97b3afe88928fe0c6b26a8564d88ae5168556dba</w:t>
       </w:r>
       <w:r>
         <w:rPr>
           <w:rFonts w:ascii="Microsoft YaHei" w:hAnsi="Microsoft YaHei" w:eastAsia="Microsoft YaHei"/>
           <w:sz w:val="21"/>
         </w:rPr>
-        <w:t>镜像。生产环境已完成真实浏览器桌面英文/中文、390×844 手机英文/中文、拖动、缩放、布局持久化、市场抽屉和完整交易链路验收；本报告中的 Web 图片均来自</w:t>
+        <w:t>。生产环境已完成真实浏览器桌面英文/中文、390×844 手机英文/中文、拖动、缩放、布局持久化、市场抽屉、完整交易链路、租户申请/注册和平台/租户管理验收；本报告中的 Web 图片均来自</w:t>
       </w:r>
       <w:r>
         <w:rPr>
@@ -723,7 +732,7 @@
           <w:color w:val="171B26"/>
           <w:sz w:val="17"/>
         </w:rPr>
-        <w:t>Web / API / RobotSvr(规划)</w:t>
+        <w:t>Web / API / RobotSvr</w:t>
         <w:br/>
         <w:t xml:space="preserve">          |</w:t>
         <w:br/>
@@ -992,7 +1001,7 @@
                 <w:color w:val="171B26"/>
                 <w:sz w:val="17"/>
               </w:rPr>
-              <w:t>用户登录和认证</w:t>
+              <w:t>用户注册、登录、会话、租户生命周期校验和 API Key</w:t>
             </w:r>
           </w:p>
         </w:tc>
@@ -1019,7 +1028,7 @@
                 <w:color w:val="171B26"/>
                 <w:sz w:val="17"/>
               </w:rPr>
-              <w:t>用户凭据与 location 绑定；错误 location 登录已验收拒绝</w:t>
+              <w:t>用户凭据与 location 绑定；错误 location、暂停租户、错误密码已验收拒绝</w:t>
             </w:r>
           </w:p>
         </w:tc>
@@ -1425,7 +1434,7 @@
                 <w:color w:val="171B26"/>
                 <w:sz w:val="17"/>
               </w:rPr>
-              <w:t>未来需按租户的指数方案和配置生成数据</w:t>
+              <w:t>当前生产验证单一 Binance Futures 外部源；后续按租户指数方案配置多源计算</w:t>
             </w:r>
           </w:p>
         </w:tc>
@@ -1481,7 +1490,7 @@
                 <w:color w:val="171B26"/>
                 <w:sz w:val="17"/>
               </w:rPr>
-              <w:t>向 Web 提供管理类接口</w:t>
+              <w:t>面向 Web 的租户管理接口：用户、品种、API Key、Robot、交易记录、设置和审计</w:t>
             </w:r>
           </w:p>
         </w:tc>
@@ -1508,7 +1517,7 @@
                 <w:color w:val="171B26"/>
                 <w:sz w:val="17"/>
               </w:rPr>
-              <w:t>未来承载租户管理员前台接口</w:t>
+              <w:t>location 取自认证会话；跨 location 和非管理员访问已验收拒绝</w:t>
             </w:r>
           </w:p>
         </w:tc>
@@ -1562,7 +1571,7 @@
                 <w:color w:val="171B26"/>
                 <w:sz w:val="17"/>
               </w:rPr>
-              <w:t>后台运营管理</w:t>
+              <w:t>平台运营：申请、审批、初始化、生命周期、独立 URL</w:t>
             </w:r>
           </w:p>
         </w:tc>
@@ -1588,7 +1597,7 @@
                 <w:color w:val="171B26"/>
                 <w:sz w:val="17"/>
               </w:rPr>
-              <w:t>未来承载平台审批、租户配置和审计</w:t>
+              <w:t>仅 PLATFORM 角色可审批和变更租户；操作写审计</w:t>
             </w:r>
           </w:p>
         </w:tc>
@@ -1644,7 +1653,7 @@
                 <w:color w:val="171B26"/>
                 <w:sz w:val="17"/>
               </w:rPr>
-              <w:t>规划中的租户策略/流动性服务：使用租户 API key 报单，订阅 APSSvr，按 ticker 报价档位并做外部反向对冲</w:t>
+              <w:t>租户策略/流动性服务：使用租户 API Key 报单，订阅 APSSvr，按 ticker 报价档位并做外部反向对冲</w:t>
             </w:r>
           </w:p>
         </w:tc>
@@ -1671,7 +1680,7 @@
                 <w:color w:val="171B26"/>
                 <w:sz w:val="17"/>
               </w:rPr>
-              <w:t>必须按租户、API key、品种和策略实例隔离；当前未部署验收</w:t>
+              <w:t>配置控制面已交付；RobotSvr 运行容器和真实外部对冲仍未纳入本轮生产验收</w:t>
             </w:r>
           </w:p>
         </w:tc>
@@ -4649,7 +4658,7 @@
           <w:rFonts w:ascii="Microsoft YaHei" w:hAnsi="Microsoft YaHei" w:eastAsia="Microsoft YaHei"/>
           <w:sz w:val="34"/>
         </w:rPr>
-        <w:t>10. 多租户产品规划</w:t>
+        <w:t>10. 多租户控制面</w:t>
       </w:r>
     </w:p>
     <w:p>
@@ -4658,67 +4667,7 @@
           <w:rFonts w:ascii="Microsoft YaHei" w:hAnsi="Microsoft YaHei" w:eastAsia="Microsoft YaHei"/>
           <w:sz w:val="21"/>
         </w:rPr>
-        <w:t>核心交易规则完成后进入多租户控制面，建议分为平台端、租户端和交易端三层。</w:t>
-      </w:r>
-    </w:p>
-    <w:p>
-      <w:pPr>
-        <w:pStyle w:val="Heading2"/>
-      </w:pPr>
-      <w:r>
-        <w:rPr>
-          <w:rFonts w:ascii="Microsoft YaHei" w:hAnsi="Microsoft YaHei" w:eastAsia="Microsoft YaHei"/>
-          <w:sz w:val="28"/>
-        </w:rPr>
-        <w:t>10.1 试用申请与审批</w:t>
-      </w:r>
-    </w:p>
-    <w:p>
-      <w:pPr>
-        <w:pStyle w:val="ListBullet"/>
-      </w:pPr>
-      <w:r>
-        <w:rPr>
-          <w:rFonts w:ascii="Microsoft YaHei" w:hAnsi="Microsoft YaHei" w:eastAsia="Microsoft YaHei"/>
-          <w:sz w:val="21"/>
-        </w:rPr>
-        <w:t>官网提交企业/团队、联系人、用途、预计用户数、交易品种和试用周期。</w:t>
-      </w:r>
-    </w:p>
-    <w:p>
-      <w:pPr>
-        <w:pStyle w:val="ListBullet"/>
-      </w:pPr>
-      <w:r>
-        <w:rPr>
-          <w:rFonts w:ascii="Microsoft YaHei" w:hAnsi="Microsoft YaHei" w:eastAsia="Microsoft YaHei"/>
-          <w:sz w:val="21"/>
-        </w:rPr>
-        <w:t>ManagerSvr 平台运营查看材料、风控评分、审批、拒绝、补充材料、到期和续期。</w:t>
-      </w:r>
-    </w:p>
-    <w:p>
-      <w:pPr>
-        <w:pStyle w:val="ListBullet"/>
-      </w:pPr>
-      <w:r>
-        <w:rPr>
-          <w:rFonts w:ascii="Microsoft YaHei" w:hAnsi="Microsoft YaHei" w:eastAsia="Microsoft YaHei"/>
-          <w:sz w:val="21"/>
-        </w:rPr>
-        <w:t>审批通过后创建 location、租户管理员、默认品种/费率/风控模板和独立 URL。</w:t>
-      </w:r>
-    </w:p>
-    <w:p>
-      <w:pPr>
-        <w:pStyle w:val="ListBullet"/>
-      </w:pPr>
-      <w:r>
-        <w:rPr>
-          <w:rFonts w:ascii="Microsoft YaHei" w:hAnsi="Microsoft YaHei" w:eastAsia="Microsoft YaHei"/>
-          <w:sz w:val="21"/>
-        </w:rPr>
-        <w:t>URL 可采用</w:t>
+        <w:t>第一阶段多租户控制面已经落地并完成生产双租户验收，分为平台端、租户端和交易端三层。</w:t>
       </w:r>
       <w:r>
         <w:rPr>
@@ -4726,14 +4675,74 @@
           <w:color w:val="171B26"/>
           <w:sz w:val="19"/>
         </w:rPr>
-        <w:t>tenant.example.com</w:t>
+        <w:t>location</w:t>
       </w:r>
       <w:r>
         <w:rPr>
           <w:rFonts w:ascii="Microsoft YaHei" w:hAnsi="Microsoft YaHei" w:eastAsia="Microsoft YaHei"/>
           <w:sz w:val="21"/>
         </w:rPr>
-        <w:t>或</w:t>
+        <w:t>是租户唯一边界；GW 保持通用路由和 Topic 转发能力，认证、管理和各业务服务负责校验自身请求与 snapshot。</w:t>
+      </w:r>
+    </w:p>
+    <w:p>
+      <w:pPr>
+        <w:pStyle w:val="Heading2"/>
+      </w:pPr>
+      <w:r>
+        <w:rPr>
+          <w:rFonts w:ascii="Microsoft YaHei" w:hAnsi="Microsoft YaHei" w:eastAsia="Microsoft YaHei"/>
+          <w:sz w:val="28"/>
+        </w:rPr>
+        <w:t>10.1 试用申请与审批</w:t>
+      </w:r>
+    </w:p>
+    <w:p>
+      <w:pPr>
+        <w:pStyle w:val="ListBullet"/>
+      </w:pPr>
+      <w:r>
+        <w:rPr>
+          <w:rFonts w:ascii="Microsoft YaHei" w:hAnsi="Microsoft YaHei" w:eastAsia="Microsoft YaHei"/>
+          <w:sz w:val="21"/>
+        </w:rPr>
+        <w:t>公开页面提交企业/团队、租户代码、联系人、用途、预计用户数、交易品种和试用周期；申请 ID 可用于查询状态。</w:t>
+      </w:r>
+    </w:p>
+    <w:p>
+      <w:pPr>
+        <w:pStyle w:val="ListBullet"/>
+      </w:pPr>
+      <w:r>
+        <w:rPr>
+          <w:rFonts w:ascii="Microsoft YaHei" w:hAnsi="Microsoft YaHei" w:eastAsia="Microsoft YaHei"/>
+          <w:sz w:val="21"/>
+        </w:rPr>
+        <w:t>ManagerSvr 平台运营审批或拒绝申请，重复请求凭证不会重复创建租户。</w:t>
+      </w:r>
+    </w:p>
+    <w:p>
+      <w:pPr>
+        <w:pStyle w:val="ListBullet"/>
+      </w:pPr>
+      <w:r>
+        <w:rPr>
+          <w:rFonts w:ascii="Microsoft YaHei" w:hAnsi="Microsoft YaHei" w:eastAsia="Microsoft YaHei"/>
+          <w:sz w:val="21"/>
+        </w:rPr>
+        <w:t>审批通过后事务内创建 location、租户管理员、默认账户/配置、品种规则、试用期限和独立 URL。</w:t>
+      </w:r>
+    </w:p>
+    <w:p>
+      <w:pPr>
+        <w:pStyle w:val="ListBullet"/>
+      </w:pPr>
+      <w:r>
+        <w:rPr>
+          <w:rFonts w:ascii="Microsoft YaHei" w:hAnsi="Microsoft YaHei" w:eastAsia="Microsoft YaHei"/>
+          <w:sz w:val="21"/>
+        </w:rPr>
+        <w:t>当前独立 URL 使用</w:t>
       </w:r>
       <w:r>
         <w:rPr>
@@ -4741,14 +4750,14 @@
           <w:color w:val="171B26"/>
           <w:sz w:val="19"/>
         </w:rPr>
-        <w:t>/t/{tenantCode}</w:t>
+        <w:t>/#/login?location={LOCATION}</w:t>
       </w:r>
       <w:r>
         <w:rPr>
           <w:rFonts w:ascii="Microsoft YaHei" w:hAnsi="Microsoft YaHei" w:eastAsia="Microsoft YaHei"/>
           <w:sz w:val="21"/>
         </w:rPr>
-        <w:t>；域名、证书、品牌和状态由平台管理。</w:t>
+        <w:t>；自定义域名、自动 DNS 和证书属于下一阶段。</w:t>
       </w:r>
     </w:p>
     <w:p>
@@ -4760,7 +4769,22 @@
           <w:rFonts w:ascii="Microsoft YaHei" w:hAnsi="Microsoft YaHei" w:eastAsia="Microsoft YaHei"/>
           <w:sz w:val="21"/>
         </w:rPr>
-        <w:t>租户禁用或到期后，登录、交易、API key、Robot 和订阅统一停用，但历史数据保留审计。</w:t>
+        <w:t>生命周期覆盖</w:t>
+      </w:r>
+      <w:r>
+        <w:rPr>
+          <w:rFonts w:ascii="Consolas" w:hAnsi="Consolas" w:eastAsia="Consolas"/>
+          <w:color w:val="171B26"/>
+          <w:sz w:val="19"/>
+        </w:rPr>
+        <w:t>TRIAL / ACTIVE / SUSPENDED / EXPIRED</w:t>
+      </w:r>
+      <w:r>
+        <w:rPr>
+          <w:rFonts w:ascii="Microsoft YaHei" w:hAnsi="Microsoft YaHei" w:eastAsia="Microsoft YaHei"/>
+          <w:sz w:val="21"/>
+        </w:rPr>
+        <w:t>。暂停或到期后注册、普通用户登录和交易入口被拒绝；历史数据与审计保留，恢复 ACTIVE 后重新开放。</w:t>
       </w:r>
     </w:p>
     <w:p>
@@ -4784,7 +4808,7 @@
           <w:rFonts w:ascii="Microsoft YaHei" w:hAnsi="Microsoft YaHei" w:eastAsia="Microsoft YaHei"/>
           <w:sz w:val="21"/>
         </w:rPr>
-        <w:t>用户：注册开关、邀请、启停、重置 2FA、角色和子账户。</w:t>
+        <w:t>用户：租户内注册、管理员创建、启停和重置初始密码；同一用户名可在不同租户独立存在。</w:t>
       </w:r>
     </w:p>
     <w:p>
@@ -4796,7 +4820,7 @@
           <w:rFonts w:ascii="Microsoft YaHei" w:hAnsi="Microsoft YaHei" w:eastAsia="Microsoft YaHei"/>
           <w:sz w:val="21"/>
         </w:rPr>
-        <w:t>品种：交易对、交易状态、精度、最小金额、风险档位、杠杆、费率和资金费周期。</w:t>
+        <w:t>品种：交易状态、精度、最小/最大数量、最小名义金额、价格上限、手续费、资金费周期和风险档位。</w:t>
       </w:r>
     </w:p>
     <w:p>
@@ -4808,7 +4832,7 @@
           <w:rFonts w:ascii="Microsoft YaHei" w:hAnsi="Microsoft YaHei" w:eastAsia="Microsoft YaHei"/>
           <w:sz w:val="21"/>
         </w:rPr>
-        <w:t>交易：活动单、历史单、成交、持仓、强平和 ADL 查询/导出。</w:t>
+        <w:t>API Key：创建、列出和撤销；Secret 只在创建时显示一次。</w:t>
       </w:r>
     </w:p>
     <w:p>
@@ -4820,7 +4844,7 @@
           <w:rFonts w:ascii="Microsoft YaHei" w:hAnsi="Microsoft YaHei" w:eastAsia="Microsoft YaHei"/>
           <w:sz w:val="21"/>
         </w:rPr>
-        <w:t>资金：余额、流水、人工调账审批、保险基金和对账异常。</w:t>
+        <w:t>Robot：报价档位、价差、数量、库存上限、外部对冲配置、启停和熔断参数的控制面。</w:t>
       </w:r>
     </w:p>
     <w:p>
@@ -4832,7 +4856,7 @@
           <w:rFonts w:ascii="Microsoft YaHei" w:hAnsi="Microsoft YaHei" w:eastAsia="Microsoft YaHei"/>
           <w:sz w:val="21"/>
         </w:rPr>
-        <w:t>Robot：API key、报价档位、价差、数量、库存上限、启停、外部对冲账户和熔断。</w:t>
+        <w:t>交易：按本租户查询订单、成交和相关交易记录。</w:t>
       </w:r>
     </w:p>
     <w:p>
@@ -4844,7 +4868,7 @@
           <w:rFonts w:ascii="Microsoft YaHei" w:hAnsi="Microsoft YaHei" w:eastAsia="Microsoft YaHei"/>
           <w:sz w:val="21"/>
         </w:rPr>
-        <w:t>风控：用户/品种限额、最大活动单、价格偏离、频率、IP/设备和黑白名单。</w:t>
+        <w:t>设置：注册/交易开关、默认语言和品牌参数。</w:t>
       </w:r>
     </w:p>
     <w:p>
@@ -4856,7 +4880,7 @@
           <w:rFonts w:ascii="Microsoft YaHei" w:hAnsi="Microsoft YaHei" w:eastAsia="Microsoft YaHei"/>
           <w:sz w:val="21"/>
         </w:rPr>
-        <w:t>审计：管理员登录、配置变更、资金操作、API key 和数据导出全留痕。</w:t>
+        <w:t>审计：用户、品种、API Key、Robot 和设置变更留痕；资金人工调账审批、2FA、角色细分和导出审批仍属后续。</w:t>
       </w:r>
     </w:p>
     <w:p>
@@ -4880,7 +4904,7 @@
           <w:rFonts w:ascii="Microsoft YaHei" w:hAnsi="Microsoft YaHei" w:eastAsia="Microsoft YaHei"/>
           <w:sz w:val="21"/>
         </w:rPr>
-        <w:t>租户申请审批、套餐、配额、到期、独立域名和镜像版本。</w:t>
+        <w:t>已交付申请审批、租户初始化、试用到期、注册/交易开关、状态切换、location URL 和审计。</w:t>
       </w:r>
     </w:p>
     <w:p>
@@ -4892,7 +4916,22 @@
           <w:rFonts w:ascii="Microsoft YaHei" w:hAnsi="Microsoft YaHei" w:eastAsia="Microsoft YaHei"/>
           <w:sz w:val="21"/>
         </w:rPr>
-        <w:t>跨租户健康和容量视图，但业务查询必须经过授权并写审计。</w:t>
+        <w:t>平台运营使用独立</w:t>
+      </w:r>
+      <w:r>
+        <w:rPr>
+          <w:rFonts w:ascii="Consolas" w:hAnsi="Consolas" w:eastAsia="Consolas"/>
+          <w:color w:val="171B26"/>
+          <w:sz w:val="19"/>
+        </w:rPr>
+        <w:t>PLATFORM</w:t>
+      </w:r>
+      <w:r>
+        <w:rPr>
+          <w:rFonts w:ascii="Microsoft YaHei" w:hAnsi="Microsoft YaHei" w:eastAsia="Microsoft YaHei"/>
+          <w:sz w:val="21"/>
+        </w:rPr>
+        <w:t>账号；普通租户管理员和交易用户无审批权限。</w:t>
       </w:r>
     </w:p>
     <w:p>
@@ -4904,31 +4943,31 @@
           <w:rFonts w:ascii="Microsoft YaHei" w:hAnsi="Microsoft YaHei" w:eastAsia="Microsoft YaHei"/>
           <w:sz w:val="21"/>
         </w:rPr>
-        <w:t>模板化品种、费率、风控和品牌配置；支持灰度发布和回滚。</w:t>
+        <w:t>套餐计费、配额、独立域名、跨租户健康容量视图、灰度发布和平台角色细分仍属后续。</w:t>
       </w:r>
     </w:p>
     <w:p>
       <w:pPr>
-        <w:pStyle w:val="ListBullet"/>
-      </w:pPr>
-      <w:r>
-        <w:rPr>
-          <w:rFonts w:ascii="Microsoft YaHei" w:hAnsi="Microsoft YaHei" w:eastAsia="Microsoft YaHei"/>
-          <w:sz w:val="21"/>
-        </w:rPr>
-        <w:t>平台客服、财务、风控、审计员与超级管理员分权。</w:t>
+        <w:pStyle w:val="Heading2"/>
+      </w:pPr>
+      <w:r>
+        <w:rPr>
+          <w:rFonts w:ascii="Microsoft YaHei" w:hAnsi="Microsoft YaHei" w:eastAsia="Microsoft YaHei"/>
+          <w:sz w:val="28"/>
+        </w:rPr>
+        <w:t>10.4 location 强制边界实施原则</w:t>
       </w:r>
     </w:p>
     <w:p>
       <w:pPr>
-        <w:pStyle w:val="Heading2"/>
-      </w:pPr>
-      <w:r>
-        <w:rPr>
-          <w:rFonts w:ascii="Microsoft YaHei" w:hAnsi="Microsoft YaHei" w:eastAsia="Microsoft YaHei"/>
-          <w:sz w:val="28"/>
-        </w:rPr>
-        <w:t>10.4 location 强制边界实施原则</w:t>
+        <w:pStyle w:val="ListBullet"/>
+      </w:pPr>
+      <w:r>
+        <w:rPr>
+          <w:rFonts w:ascii="Microsoft YaHei" w:hAnsi="Microsoft YaHei" w:eastAsia="Microsoft YaHei"/>
+          <w:sz w:val="21"/>
+        </w:rPr>
+        <w:t>用户已决定暂不直接改 GW；先由每个业务服务完成 snapshot/请求身份校验，同时设计 GW 的可选租户插件，保证通用 GW 仍可用于非多租户系统。</w:t>
       </w:r>
     </w:p>
     <w:p>
@@ -4940,19 +4979,7 @@
           <w:rFonts w:ascii="Microsoft YaHei" w:hAnsi="Microsoft YaHei" w:eastAsia="Microsoft YaHei"/>
           <w:sz w:val="21"/>
         </w:rPr>
-        <w:t>用户已决定暂不直接改 GW；先由每个业务服务完成 snapshot/请求身份校验，同时设计 GW 的可选租户插件，保证通用 GW 仍可用于非多租户系统。</w:t>
-      </w:r>
-    </w:p>
-    <w:p>
-      <w:pPr>
-        <w:pStyle w:val="ListBullet"/>
-      </w:pPr>
-      <w:r>
-        <w:rPr>
-          <w:rFonts w:ascii="Microsoft YaHei" w:hAnsi="Microsoft YaHei" w:eastAsia="Microsoft YaHei"/>
-          <w:sz w:val="21"/>
-        </w:rPr>
-        <w:t>最终形态由 LoginSvr/会话产生服务端权威 location；启用 SaaS 插件时 GW 注入并拒绝冲突字段，未启用时保持普通透传。</w:t>
+        <w:t>LoginSvr 登录会话产生权威 location；AdminSvr 和 ManagerSvr 已使用认证上下文并拒绝越权 location。后续如启用可选 SaaS GW 插件，GW 可注入并拒绝冲突字段；未启用时保持普通透传。</w:t>
       </w:r>
     </w:p>
     <w:p>
@@ -5868,29 +5895,14 @@
           <w:color w:val="171B26"/>
           <w:sz w:val="19"/>
         </w:rPr>
-        <w:t>source-2ed6e68f3ad45a65cb184b5397abc9f752719721</w:t>
+        <w:t>source-97b3afe88928fe0c6b26a8564d88ae5168556dba</w:t>
       </w:r>
       <w:r>
         <w:rPr>
           <w:rFonts w:ascii="Microsoft YaHei" w:hAnsi="Microsoft YaHei" w:eastAsia="Microsoft YaHei"/>
           <w:sz w:val="21"/>
         </w:rPr>
-        <w:t>，自动更新 dry-run 已确认</w:t>
-      </w:r>
-      <w:r>
-        <w:rPr>
-          <w:rFonts w:ascii="Consolas" w:hAnsi="Consolas" w:eastAsia="Consolas"/>
-          <w:color w:val="171B26"/>
-          <w:sz w:val="19"/>
-        </w:rPr>
-        <w:t>runtime_drift=false</w:t>
-      </w:r>
-      <w:r>
-        <w:rPr>
-          <w:rFonts w:ascii="Microsoft YaHei" w:hAnsi="Microsoft YaHei" w:eastAsia="Microsoft YaHei"/>
-          <w:sz w:val="21"/>
-        </w:rPr>
-        <w:t>，不会把验收版本替换为旧 mutable tag。</w:t>
+        <w:t>；自动更新只替换发生不可变镜像变更的服务，本轮 Web 更新未重启核心交易服务。</w:t>
       </w:r>
     </w:p>
     <w:p>
@@ -6615,7 +6627,7 @@
                 <w:color w:val="171B26"/>
                 <w:sz w:val="17"/>
               </w:rPr>
-              <w:t>合计</w:t>
+              <w:t>AdminSvr</w:t>
             </w:r>
           </w:p>
         </w:tc>
@@ -6642,7 +6654,7 @@
                 <w:color w:val="171B26"/>
                 <w:sz w:val="17"/>
               </w:rPr>
-              <w:t>154</w:t>
+              <w:t>13</w:t>
             </w:r>
           </w:p>
         </w:tc>
@@ -6701,11 +6713,357 @@
           </w:p>
         </w:tc>
       </w:tr>
+      <w:tr>
+        <w:tc>
+          <w:tcPr>
+            <w:tcW w:type="dxa" w:w="2438"/>
+            <w:vAlign w:val="center"/>
+            <w:tcMar>
+              <w:top w:w="90" w:type="dxa"/>
+              <w:start w:w="90" w:type="dxa"/>
+              <w:bottom w:w="90" w:type="dxa"/>
+              <w:end w:w="90" w:type="dxa"/>
+            </w:tcMar>
+          </w:tcPr>
+          <w:p>
+            <w:pPr>
+              <w:spacing w:after="0"/>
+            </w:pPr>
+            <w:r>
+              <w:rPr>
+                <w:rFonts w:ascii="Microsoft YaHei" w:hAnsi="Microsoft YaHei" w:eastAsia="Microsoft YaHei"/>
+                <w:b w:val="0"/>
+                <w:color w:val="171B26"/>
+                <w:sz w:val="17"/>
+              </w:rPr>
+              <w:t>ManagerSvr</w:t>
+            </w:r>
+          </w:p>
+        </w:tc>
+        <w:tc>
+          <w:tcPr>
+            <w:tcW w:type="dxa" w:w="2438"/>
+            <w:vAlign w:val="center"/>
+            <w:tcMar>
+              <w:top w:w="90" w:type="dxa"/>
+              <w:start w:w="90" w:type="dxa"/>
+              <w:bottom w:w="90" w:type="dxa"/>
+              <w:end w:w="90" w:type="dxa"/>
+            </w:tcMar>
+          </w:tcPr>
+          <w:p>
+            <w:pPr>
+              <w:spacing w:after="0"/>
+            </w:pPr>
+            <w:r>
+              <w:rPr>
+                <w:rFonts w:ascii="Microsoft YaHei" w:hAnsi="Microsoft YaHei" w:eastAsia="Microsoft YaHei"/>
+                <w:b w:val="0"/>
+                <w:color w:val="171B26"/>
+                <w:sz w:val="17"/>
+              </w:rPr>
+              <w:t>7</w:t>
+            </w:r>
+          </w:p>
+        </w:tc>
+        <w:tc>
+          <w:tcPr>
+            <w:tcW w:type="dxa" w:w="2438"/>
+            <w:vAlign w:val="center"/>
+            <w:tcMar>
+              <w:top w:w="90" w:type="dxa"/>
+              <w:start w:w="90" w:type="dxa"/>
+              <w:bottom w:w="90" w:type="dxa"/>
+              <w:end w:w="90" w:type="dxa"/>
+            </w:tcMar>
+          </w:tcPr>
+          <w:p>
+            <w:pPr>
+              <w:spacing w:after="0"/>
+            </w:pPr>
+            <w:r>
+              <w:rPr>
+                <w:rFonts w:ascii="Microsoft YaHei" w:hAnsi="Microsoft YaHei" w:eastAsia="Microsoft YaHei"/>
+                <w:b w:val="0"/>
+                <w:color w:val="171B26"/>
+                <w:sz w:val="17"/>
+              </w:rPr>
+              <w:t>0</w:t>
+            </w:r>
+          </w:p>
+        </w:tc>
+        <w:tc>
+          <w:tcPr>
+            <w:tcW w:type="dxa" w:w="2438"/>
+            <w:vAlign w:val="center"/>
+            <w:tcMar>
+              <w:top w:w="90" w:type="dxa"/>
+              <w:start w:w="90" w:type="dxa"/>
+              <w:bottom w:w="90" w:type="dxa"/>
+              <w:end w:w="90" w:type="dxa"/>
+            </w:tcMar>
+          </w:tcPr>
+          <w:p>
+            <w:pPr>
+              <w:spacing w:after="0"/>
+            </w:pPr>
+            <w:r>
+              <w:rPr>
+                <w:rFonts w:ascii="Microsoft YaHei" w:hAnsi="Microsoft YaHei" w:eastAsia="Microsoft YaHei"/>
+                <w:b w:val="0"/>
+                <w:color w:val="171B26"/>
+                <w:sz w:val="17"/>
+              </w:rPr>
+              <w:t>0</w:t>
+            </w:r>
+          </w:p>
+        </w:tc>
+      </w:tr>
+      <w:tr>
+        <w:tc>
+          <w:tcPr>
+            <w:tcW w:type="dxa" w:w="2438"/>
+            <w:vAlign w:val="center"/>
+            <w:tcMar>
+              <w:top w:w="90" w:type="dxa"/>
+              <w:start w:w="90" w:type="dxa"/>
+              <w:bottom w:w="90" w:type="dxa"/>
+              <w:end w:w="90" w:type="dxa"/>
+            </w:tcMar>
+            <w:shd w:fill="F2F4F7"/>
+          </w:tcPr>
+          <w:p>
+            <w:pPr>
+              <w:spacing w:after="0"/>
+            </w:pPr>
+            <w:r>
+              <w:rPr>
+                <w:rFonts w:ascii="Microsoft YaHei" w:hAnsi="Microsoft YaHei" w:eastAsia="Microsoft YaHei"/>
+                <w:b w:val="0"/>
+                <w:color w:val="171B26"/>
+                <w:sz w:val="17"/>
+              </w:rPr>
+              <w:t>LoginSvr</w:t>
+            </w:r>
+          </w:p>
+        </w:tc>
+        <w:tc>
+          <w:tcPr>
+            <w:tcW w:type="dxa" w:w="2438"/>
+            <w:vAlign w:val="center"/>
+            <w:tcMar>
+              <w:top w:w="90" w:type="dxa"/>
+              <w:start w:w="90" w:type="dxa"/>
+              <w:bottom w:w="90" w:type="dxa"/>
+              <w:end w:w="90" w:type="dxa"/>
+            </w:tcMar>
+            <w:shd w:fill="F2F4F7"/>
+          </w:tcPr>
+          <w:p>
+            <w:pPr>
+              <w:spacing w:after="0"/>
+            </w:pPr>
+            <w:r>
+              <w:rPr>
+                <w:rFonts w:ascii="Microsoft YaHei" w:hAnsi="Microsoft YaHei" w:eastAsia="Microsoft YaHei"/>
+                <w:b w:val="0"/>
+                <w:color w:val="171B26"/>
+                <w:sz w:val="17"/>
+              </w:rPr>
+              <w:t>5</w:t>
+            </w:r>
+          </w:p>
+        </w:tc>
+        <w:tc>
+          <w:tcPr>
+            <w:tcW w:type="dxa" w:w="2438"/>
+            <w:vAlign w:val="center"/>
+            <w:tcMar>
+              <w:top w:w="90" w:type="dxa"/>
+              <w:start w:w="90" w:type="dxa"/>
+              <w:bottom w:w="90" w:type="dxa"/>
+              <w:end w:w="90" w:type="dxa"/>
+            </w:tcMar>
+            <w:shd w:fill="F2F4F7"/>
+          </w:tcPr>
+          <w:p>
+            <w:pPr>
+              <w:spacing w:after="0"/>
+            </w:pPr>
+            <w:r>
+              <w:rPr>
+                <w:rFonts w:ascii="Microsoft YaHei" w:hAnsi="Microsoft YaHei" w:eastAsia="Microsoft YaHei"/>
+                <w:b w:val="0"/>
+                <w:color w:val="171B26"/>
+                <w:sz w:val="17"/>
+              </w:rPr>
+              <w:t>0</w:t>
+            </w:r>
+          </w:p>
+        </w:tc>
+        <w:tc>
+          <w:tcPr>
+            <w:tcW w:type="dxa" w:w="2438"/>
+            <w:vAlign w:val="center"/>
+            <w:tcMar>
+              <w:top w:w="90" w:type="dxa"/>
+              <w:start w:w="90" w:type="dxa"/>
+              <w:bottom w:w="90" w:type="dxa"/>
+              <w:end w:w="90" w:type="dxa"/>
+            </w:tcMar>
+            <w:shd w:fill="F2F4F7"/>
+          </w:tcPr>
+          <w:p>
+            <w:pPr>
+              <w:spacing w:after="0"/>
+            </w:pPr>
+            <w:r>
+              <w:rPr>
+                <w:rFonts w:ascii="Microsoft YaHei" w:hAnsi="Microsoft YaHei" w:eastAsia="Microsoft YaHei"/>
+                <w:b w:val="0"/>
+                <w:color w:val="171B26"/>
+                <w:sz w:val="17"/>
+              </w:rPr>
+              <w:t>0</w:t>
+            </w:r>
+          </w:p>
+        </w:tc>
+      </w:tr>
+      <w:tr>
+        <w:tc>
+          <w:tcPr>
+            <w:tcW w:type="dxa" w:w="2438"/>
+            <w:vAlign w:val="center"/>
+            <w:tcMar>
+              <w:top w:w="90" w:type="dxa"/>
+              <w:start w:w="90" w:type="dxa"/>
+              <w:bottom w:w="90" w:type="dxa"/>
+              <w:end w:w="90" w:type="dxa"/>
+            </w:tcMar>
+          </w:tcPr>
+          <w:p>
+            <w:pPr>
+              <w:spacing w:after="0"/>
+            </w:pPr>
+            <w:r>
+              <w:rPr>
+                <w:rFonts w:ascii="Microsoft YaHei" w:hAnsi="Microsoft YaHei" w:eastAsia="Microsoft YaHei"/>
+                <w:b w:val="0"/>
+                <w:color w:val="171B26"/>
+                <w:sz w:val="17"/>
+              </w:rPr>
+              <w:t>合计</w:t>
+            </w:r>
+          </w:p>
+        </w:tc>
+        <w:tc>
+          <w:tcPr>
+            <w:tcW w:type="dxa" w:w="2438"/>
+            <w:vAlign w:val="center"/>
+            <w:tcMar>
+              <w:top w:w="90" w:type="dxa"/>
+              <w:start w:w="90" w:type="dxa"/>
+              <w:bottom w:w="90" w:type="dxa"/>
+              <w:end w:w="90" w:type="dxa"/>
+            </w:tcMar>
+          </w:tcPr>
+          <w:p>
+            <w:pPr>
+              <w:spacing w:after="0"/>
+            </w:pPr>
+            <w:r>
+              <w:rPr>
+                <w:rFonts w:ascii="Microsoft YaHei" w:hAnsi="Microsoft YaHei" w:eastAsia="Microsoft YaHei"/>
+                <w:b w:val="0"/>
+                <w:color w:val="171B26"/>
+                <w:sz w:val="17"/>
+              </w:rPr>
+              <w:t>179</w:t>
+            </w:r>
+          </w:p>
+        </w:tc>
+        <w:tc>
+          <w:tcPr>
+            <w:tcW w:type="dxa" w:w="2438"/>
+            <w:vAlign w:val="center"/>
+            <w:tcMar>
+              <w:top w:w="90" w:type="dxa"/>
+              <w:start w:w="90" w:type="dxa"/>
+              <w:bottom w:w="90" w:type="dxa"/>
+              <w:end w:w="90" w:type="dxa"/>
+            </w:tcMar>
+          </w:tcPr>
+          <w:p>
+            <w:pPr>
+              <w:spacing w:after="0"/>
+            </w:pPr>
+            <w:r>
+              <w:rPr>
+                <w:rFonts w:ascii="Microsoft YaHei" w:hAnsi="Microsoft YaHei" w:eastAsia="Microsoft YaHei"/>
+                <w:b w:val="0"/>
+                <w:color w:val="171B26"/>
+                <w:sz w:val="17"/>
+              </w:rPr>
+              <w:t>0</w:t>
+            </w:r>
+          </w:p>
+        </w:tc>
+        <w:tc>
+          <w:tcPr>
+            <w:tcW w:type="dxa" w:w="2438"/>
+            <w:vAlign w:val="center"/>
+            <w:tcMar>
+              <w:top w:w="90" w:type="dxa"/>
+              <w:start w:w="90" w:type="dxa"/>
+              <w:bottom w:w="90" w:type="dxa"/>
+              <w:end w:w="90" w:type="dxa"/>
+            </w:tcMar>
+          </w:tcPr>
+          <w:p>
+            <w:pPr>
+              <w:spacing w:after="0"/>
+            </w:pPr>
+            <w:r>
+              <w:rPr>
+                <w:rFonts w:ascii="Microsoft YaHei" w:hAnsi="Microsoft YaHei" w:eastAsia="Microsoft YaHei"/>
+                <w:b w:val="0"/>
+                <w:color w:val="171B26"/>
+                <w:sz w:val="17"/>
+              </w:rPr>
+              <w:t>0</w:t>
+            </w:r>
+          </w:p>
+        </w:tc>
+      </w:tr>
     </w:tbl>
     <w:p>
       <w:pPr>
         <w:spacing w:after="20"/>
       </w:pPr>
+    </w:p>
+    <w:p>
+      <w:r>
+        <w:rPr>
+          <w:rFonts w:ascii="Microsoft YaHei" w:hAnsi="Microsoft YaHei" w:eastAsia="Microsoft YaHei"/>
+          <w:sz w:val="21"/>
+        </w:rPr>
+        <w:t>Trade Web 同期执行</w:t>
+      </w:r>
+      <w:r>
+        <w:rPr>
+          <w:rFonts w:ascii="Consolas" w:hAnsi="Consolas" w:eastAsia="Consolas"/>
+          <w:color w:val="171B26"/>
+          <w:sz w:val="19"/>
+        </w:rPr>
+        <w:t>npm run build-prod</w:t>
+      </w:r>
+      <w:r>
+        <w:rPr>
+          <w:rFonts w:ascii="Microsoft YaHei" w:hAnsi="Microsoft YaHei" w:eastAsia="Microsoft YaHei"/>
+          <w:sz w:val="21"/>
+        </w:rPr>
+        <w:t>成功；AdminSvr、ManagerSvr、LoginSvr 使用受控小内存 Maven 参数完整运行测试，未通过跳过测试生成镜像。</w:t>
+      </w:r>
     </w:p>
     <w:p>
       <w:pPr>
@@ -8412,6 +8770,195 @@
     </w:p>
     <w:p>
       <w:pPr>
+        <w:pStyle w:val="Heading2"/>
+      </w:pPr>
+      <w:r>
+        <w:rPr>
+          <w:rFonts w:ascii="Microsoft YaHei" w:hAnsi="Microsoft YaHei" w:eastAsia="Microsoft YaHei"/>
+          <w:sz w:val="28"/>
+        </w:rPr>
+        <w:t>12.4 多租户控制面生产验收</w:t>
+      </w:r>
+    </w:p>
+    <w:p>
+      <w:r>
+        <w:rPr>
+          <w:rFonts w:ascii="Microsoft YaHei" w:hAnsi="Microsoft YaHei" w:eastAsia="Microsoft YaHei"/>
+          <w:sz w:val="21"/>
+        </w:rPr>
+        <w:t>最终自动化在公开 Web/GW、真实 ManagerSvr、AdminSvr、LoginSvr 和 MySQL 上创建两套独立租户</w:t>
+      </w:r>
+      <w:r>
+        <w:rPr>
+          <w:rFonts w:ascii="Consolas" w:hAnsi="Consolas" w:eastAsia="Consolas"/>
+          <w:color w:val="171B26"/>
+          <w:sz w:val="19"/>
+        </w:rPr>
+        <w:t>SAASA_E2E_0830160159</w:t>
+      </w:r>
+      <w:r>
+        <w:rPr>
+          <w:rFonts w:ascii="Microsoft YaHei" w:hAnsi="Microsoft YaHei" w:eastAsia="Microsoft YaHei"/>
+          <w:sz w:val="21"/>
+        </w:rPr>
+        <w:t>与</w:t>
+      </w:r>
+      <w:r>
+        <w:rPr>
+          <w:rFonts w:ascii="Consolas" w:hAnsi="Consolas" w:eastAsia="Consolas"/>
+          <w:color w:val="171B26"/>
+          <w:sz w:val="19"/>
+        </w:rPr>
+        <w:t>SAASB_E2E_0830160159</w:t>
+      </w:r>
+      <w:r>
+        <w:rPr>
+          <w:rFonts w:ascii="Microsoft YaHei" w:hAnsi="Microsoft YaHei" w:eastAsia="Microsoft YaHei"/>
+          <w:sz w:val="21"/>
+        </w:rPr>
+        <w:t>，完成以下断言：</w:t>
+      </w:r>
+    </w:p>
+    <w:p>
+      <w:pPr>
+        <w:pStyle w:val="ListBullet"/>
+      </w:pPr>
+      <w:r>
+        <w:rPr>
+          <w:rFonts w:ascii="Microsoft YaHei" w:hAnsi="Microsoft YaHei" w:eastAsia="Microsoft YaHei"/>
+          <w:sz w:val="21"/>
+        </w:rPr>
+        <w:t>公开申请、状态查询、PLATFORM 审批、location/独立 URL 和租户管理员初始化：PASS。</w:t>
+      </w:r>
+    </w:p>
+    <w:p>
+      <w:pPr>
+        <w:pStyle w:val="ListBullet"/>
+      </w:pPr>
+      <w:r>
+        <w:rPr>
+          <w:rFonts w:ascii="Microsoft YaHei" w:hAnsi="Microsoft YaHei" w:eastAsia="Microsoft YaHei"/>
+          <w:sz w:val="21"/>
+        </w:rPr>
+        <w:t>同一用户名在两个 location 注册得到不同 user_id；错租户密码和错误 location 登录：拒绝。</w:t>
+      </w:r>
+    </w:p>
+    <w:p>
+      <w:pPr>
+        <w:pStyle w:val="ListBullet"/>
+      </w:pPr>
+      <w:r>
+        <w:rPr>
+          <w:rFonts w:ascii="Microsoft YaHei" w:hAnsi="Microsoft YaHei" w:eastAsia="Microsoft YaHei"/>
+          <w:sz w:val="21"/>
+        </w:rPr>
+        <w:t>普通用户调用平台审批、交易用户调用租户管理、A 租户管理员访问 B 租户数据：拒绝。</w:t>
+      </w:r>
+    </w:p>
+    <w:p>
+      <w:pPr>
+        <w:pStyle w:val="ListBullet"/>
+      </w:pPr>
+      <w:r>
+        <w:rPr>
+          <w:rFonts w:ascii="Microsoft YaHei" w:hAnsi="Microsoft YaHei" w:eastAsia="Microsoft YaHei"/>
+          <w:sz w:val="21"/>
+        </w:rPr>
+        <w:t>租户管理员创建用户、品种查询与 UPSERT、交易记录、设置和审计：PASS。</w:t>
+      </w:r>
+    </w:p>
+    <w:p>
+      <w:pPr>
+        <w:pStyle w:val="ListBullet"/>
+      </w:pPr>
+      <w:r>
+        <w:rPr>
+          <w:rFonts w:ascii="Microsoft YaHei" w:hAnsi="Microsoft YaHei" w:eastAsia="Microsoft YaHei"/>
+          <w:sz w:val="21"/>
+        </w:rPr>
+        <w:t>租户暂停后登录受阻，恢复 ACTIVE 后重新登录：PASS。</w:t>
+      </w:r>
+    </w:p>
+    <w:p>
+      <w:pPr>
+        <w:pStyle w:val="ListBullet"/>
+      </w:pPr>
+      <w:r>
+        <w:rPr>
+          <w:rFonts w:ascii="Microsoft YaHei" w:hAnsi="Microsoft YaHei" w:eastAsia="Microsoft YaHei"/>
+          <w:sz w:val="21"/>
+        </w:rPr>
+        <w:t>桌面申请页、桌面平台运营页、桌面租户管理页、390×844 注册页和租户管理页：真实浏览器 PASS。</w:t>
+      </w:r>
+    </w:p>
+    <w:p>
+      <w:pPr>
+        <w:pStyle w:val="ListBullet"/>
+      </w:pPr>
+      <w:r>
+        <w:rPr>
+          <w:rFonts w:ascii="Microsoft YaHei" w:hAnsi="Microsoft YaHei" w:eastAsia="Microsoft YaHei"/>
+          <w:sz w:val="21"/>
+        </w:rPr>
+        <w:t>测试产物：</w:t>
+      </w:r>
+      <w:r>
+        <w:rPr>
+          <w:rFonts w:ascii="Consolas" w:hAnsi="Consolas" w:eastAsia="Consolas"/>
+          <w:color w:val="171B26"/>
+          <w:sz w:val="19"/>
+        </w:rPr>
+        <w:t>/data/dc-saas-runtime/e2e-artifacts/tenant-0830160159</w:t>
+      </w:r>
+      <w:r>
+        <w:rPr>
+          <w:rFonts w:ascii="Microsoft YaHei" w:hAnsi="Microsoft YaHei" w:eastAsia="Microsoft YaHei"/>
+          <w:sz w:val="21"/>
+        </w:rPr>
+        <w:t>。证据租户按审计要求保留，未执行未经授权的数据删除。</w:t>
+      </w:r>
+    </w:p>
+    <w:p>
+      <w:r>
+        <w:rPr>
+          <w:rFonts w:ascii="Microsoft YaHei" w:hAnsi="Microsoft YaHei" w:eastAsia="Microsoft YaHei"/>
+          <w:sz w:val="21"/>
+        </w:rPr>
+        <w:t>自动化曾在真实 MySQL 暴露历史</w:t>
+      </w:r>
+      <w:r>
+        <w:rPr>
+          <w:rFonts w:ascii="Consolas" w:hAnsi="Consolas" w:eastAsia="Consolas"/>
+          <w:color w:val="171B26"/>
+          <w:sz w:val="19"/>
+        </w:rPr>
+        <w:t>dc_symbol</w:t>
+      </w:r>
+      <w:r>
+        <w:rPr>
+          <w:rFonts w:ascii="Microsoft YaHei" w:hAnsi="Microsoft YaHei" w:eastAsia="Microsoft YaHei"/>
+          <w:sz w:val="21"/>
+        </w:rPr>
+        <w:t>数字列包含空字符串，审批复制到 DECIMAL 失败；ManagerSvr 与 AdminSvr 已统一通过</w:t>
+      </w:r>
+      <w:r>
+        <w:rPr>
+          <w:rFonts w:ascii="Consolas" w:hAnsi="Consolas" w:eastAsia="Consolas"/>
+          <w:color w:val="171B26"/>
+          <w:sz w:val="19"/>
+        </w:rPr>
+        <w:t>TRIM / NULLIF / CAST</w:t>
+      </w:r>
+      <w:r>
+        <w:rPr>
+          <w:rFonts w:ascii="Microsoft YaHei" w:hAnsi="Microsoft YaHei" w:eastAsia="Microsoft YaHei"/>
+          <w:sz w:val="21"/>
+        </w:rPr>
+        <w:t>规范化旧规则。部署预检还发现运行中主机不应按 8 GiB 可用内存拒绝增量更新，现已拆分总内存 7.5 GiB 与可用内存 2 GiB 门禁。修复后重新构建公开镜像并完成全链路回归。</w:t>
+      </w:r>
+    </w:p>
+    <w:p>
+      <w:pPr>
         <w:pStyle w:val="Heading1"/>
       </w:pPr>
       <w:r>
@@ -8903,6 +9450,288 @@
       </w:r>
     </w:p>
     <w:p>
+      <w:pPr>
+        <w:pStyle w:val="Heading2"/>
+      </w:pPr>
+      <w:r>
+        <w:rPr>
+          <w:rFonts w:ascii="Microsoft YaHei" w:hAnsi="Microsoft YaHei" w:eastAsia="Microsoft YaHei"/>
+          <w:sz w:val="28"/>
+        </w:rPr>
+        <w:t>13.5 多租户申请、注册与管理证据（生产环境）</w:t>
+      </w:r>
+    </w:p>
+    <w:p>
+      <w:pPr>
+        <w:keepLines/>
+        <w:jc w:val="center"/>
+      </w:pPr>
+      <w:r>
+        <w:drawing>
+          <wp:inline xmlns:a="http://schemas.openxmlformats.org/drawingml/2006/main" xmlns:pic="http://schemas.openxmlformats.org/drawingml/2006/picture">
+            <wp:extent cx="5897880" cy="3686175"/>
+            <wp:docPr id="9" name="Picture 9"/>
+            <wp:cNvGraphicFramePr>
+              <a:graphicFrameLocks noChangeAspect="1"/>
+            </wp:cNvGraphicFramePr>
+            <a:graphic>
+              <a:graphicData uri="http://schemas.openxmlformats.org/drawingml/2006/picture">
+                <pic:pic>
+                  <pic:nvPicPr>
+                    <pic:cNvPr id="0" name="tenant-application-en.png"/>
+                    <pic:cNvPicPr/>
+                  </pic:nvPicPr>
+                  <pic:blipFill>
+                    <a:blip r:embed="rId19"/>
+                    <a:stretch>
+                      <a:fillRect/>
+                    </a:stretch>
+                  </pic:blipFill>
+                  <pic:spPr>
+                    <a:xfrm>
+                      <a:off x="0" y="0"/>
+                      <a:ext cx="5897880" cy="3686175"/>
+                    </a:xfrm>
+                    <a:prstGeom prst="rect"/>
+                  </pic:spPr>
+                </pic:pic>
+              </a:graphicData>
+            </a:graphic>
+          </wp:inline>
+        </w:drawing>
+      </w:r>
+    </w:p>
+    <w:p>
+      <w:pPr>
+        <w:spacing w:after="160"/>
+        <w:jc w:val="center"/>
+      </w:pPr>
+      <w:r>
+        <w:rPr>
+          <w:rFonts w:ascii="Microsoft YaHei" w:hAnsi="Microsoft YaHei" w:eastAsia="Microsoft YaHei"/>
+          <w:color w:val="667085"/>
+          <w:sz w:val="17"/>
+        </w:rPr>
+        <w:t>图：公开 SaaS 试用申请</w:t>
+      </w:r>
+    </w:p>
+    <w:p>
+      <w:pPr>
+        <w:keepLines/>
+        <w:jc w:val="center"/>
+      </w:pPr>
+      <w:r>
+        <w:drawing>
+          <wp:inline xmlns:a="http://schemas.openxmlformats.org/drawingml/2006/main" xmlns:pic="http://schemas.openxmlformats.org/drawingml/2006/picture">
+            <wp:extent cx="3349657" cy="7498078"/>
+            <wp:docPr id="10" name="Picture 10"/>
+            <wp:cNvGraphicFramePr>
+              <a:graphicFrameLocks noChangeAspect="1"/>
+            </wp:cNvGraphicFramePr>
+            <a:graphic>
+              <a:graphicData uri="http://schemas.openxmlformats.org/drawingml/2006/picture">
+                <pic:pic>
+                  <pic:nvPicPr>
+                    <pic:cNvPr id="0" name="tenant-registration-mobile-en.png"/>
+                    <pic:cNvPicPr/>
+                  </pic:nvPicPr>
+                  <pic:blipFill>
+                    <a:blip r:embed="rId20"/>
+                    <a:stretch>
+                      <a:fillRect/>
+                    </a:stretch>
+                  </pic:blipFill>
+                  <pic:spPr>
+                    <a:xfrm>
+                      <a:off x="0" y="0"/>
+                      <a:ext cx="3349657" cy="7498078"/>
+                    </a:xfrm>
+                    <a:prstGeom prst="rect"/>
+                  </pic:spPr>
+                </pic:pic>
+              </a:graphicData>
+            </a:graphic>
+          </wp:inline>
+        </w:drawing>
+      </w:r>
+    </w:p>
+    <w:p>
+      <w:pPr>
+        <w:spacing w:after="160"/>
+        <w:jc w:val="center"/>
+      </w:pPr>
+      <w:r>
+        <w:rPr>
+          <w:rFonts w:ascii="Microsoft YaHei" w:hAnsi="Microsoft YaHei" w:eastAsia="Microsoft YaHei"/>
+          <w:color w:val="667085"/>
+          <w:sz w:val="17"/>
+        </w:rPr>
+        <w:t>图：390×844 租户内注册</w:t>
+      </w:r>
+    </w:p>
+    <w:p>
+      <w:pPr>
+        <w:keepLines/>
+        <w:jc w:val="center"/>
+      </w:pPr>
+      <w:r>
+        <w:drawing>
+          <wp:inline xmlns:a="http://schemas.openxmlformats.org/drawingml/2006/main" xmlns:pic="http://schemas.openxmlformats.org/drawingml/2006/picture">
+            <wp:extent cx="5897880" cy="6539274"/>
+            <wp:docPr id="11" name="Picture 11"/>
+            <wp:cNvGraphicFramePr>
+              <a:graphicFrameLocks noChangeAspect="1"/>
+            </wp:cNvGraphicFramePr>
+            <a:graphic>
+              <a:graphicData uri="http://schemas.openxmlformats.org/drawingml/2006/picture">
+                <pic:pic>
+                  <pic:nvPicPr>
+                    <pic:cNvPr id="0" name="platform-tenant-operations-en.png"/>
+                    <pic:cNvPicPr/>
+                  </pic:nvPicPr>
+                  <pic:blipFill>
+                    <a:blip r:embed="rId21"/>
+                    <a:stretch>
+                      <a:fillRect/>
+                    </a:stretch>
+                  </pic:blipFill>
+                  <pic:spPr>
+                    <a:xfrm>
+                      <a:off x="0" y="0"/>
+                      <a:ext cx="5897880" cy="6539274"/>
+                    </a:xfrm>
+                    <a:prstGeom prst="rect"/>
+                  </pic:spPr>
+                </pic:pic>
+              </a:graphicData>
+            </a:graphic>
+          </wp:inline>
+        </w:drawing>
+      </w:r>
+    </w:p>
+    <w:p>
+      <w:pPr>
+        <w:spacing w:after="160"/>
+        <w:jc w:val="center"/>
+      </w:pPr>
+      <w:r>
+        <w:rPr>
+          <w:rFonts w:ascii="Microsoft YaHei" w:hAnsi="Microsoft YaHei" w:eastAsia="Microsoft YaHei"/>
+          <w:color w:val="667085"/>
+          <w:sz w:val="17"/>
+        </w:rPr>
+        <w:t>图：平台租户运营与生命周期</w:t>
+      </w:r>
+    </w:p>
+    <w:p>
+      <w:pPr>
+        <w:keepLines/>
+        <w:jc w:val="center"/>
+      </w:pPr>
+      <w:r>
+        <w:drawing>
+          <wp:inline xmlns:a="http://schemas.openxmlformats.org/drawingml/2006/main" xmlns:pic="http://schemas.openxmlformats.org/drawingml/2006/picture">
+            <wp:extent cx="5897880" cy="3693547"/>
+            <wp:docPr id="12" name="Picture 12"/>
+            <wp:cNvGraphicFramePr>
+              <a:graphicFrameLocks noChangeAspect="1"/>
+            </wp:cNvGraphicFramePr>
+            <a:graphic>
+              <a:graphicData uri="http://schemas.openxmlformats.org/drawingml/2006/picture">
+                <pic:pic>
+                  <pic:nvPicPr>
+                    <pic:cNvPr id="0" name="tenant-administration-en.png"/>
+                    <pic:cNvPicPr/>
+                  </pic:nvPicPr>
+                  <pic:blipFill>
+                    <a:blip r:embed="rId22"/>
+                    <a:stretch>
+                      <a:fillRect/>
+                    </a:stretch>
+                  </pic:blipFill>
+                  <pic:spPr>
+                    <a:xfrm>
+                      <a:off x="0" y="0"/>
+                      <a:ext cx="5897880" cy="3693547"/>
+                    </a:xfrm>
+                    <a:prstGeom prst="rect"/>
+                  </pic:spPr>
+                </pic:pic>
+              </a:graphicData>
+            </a:graphic>
+          </wp:inline>
+        </w:drawing>
+      </w:r>
+    </w:p>
+    <w:p>
+      <w:pPr>
+        <w:spacing w:after="160"/>
+        <w:jc w:val="center"/>
+      </w:pPr>
+      <w:r>
+        <w:rPr>
+          <w:rFonts w:ascii="Microsoft YaHei" w:hAnsi="Microsoft YaHei" w:eastAsia="Microsoft YaHei"/>
+          <w:color w:val="667085"/>
+          <w:sz w:val="17"/>
+        </w:rPr>
+        <w:t>图：租户管理员桌面控制台</w:t>
+      </w:r>
+    </w:p>
+    <w:p>
+      <w:pPr>
+        <w:keepLines/>
+        <w:jc w:val="center"/>
+      </w:pPr>
+      <w:r>
+        <w:drawing>
+          <wp:inline xmlns:a="http://schemas.openxmlformats.org/drawingml/2006/main" xmlns:pic="http://schemas.openxmlformats.org/drawingml/2006/picture">
+            <wp:extent cx="3456561" cy="7498078"/>
+            <wp:docPr id="13" name="Picture 13"/>
+            <wp:cNvGraphicFramePr>
+              <a:graphicFrameLocks noChangeAspect="1"/>
+            </wp:cNvGraphicFramePr>
+            <a:graphic>
+              <a:graphicData uri="http://schemas.openxmlformats.org/drawingml/2006/picture">
+                <pic:pic>
+                  <pic:nvPicPr>
+                    <pic:cNvPr id="0" name="tenant-administration-mobile-en.png"/>
+                    <pic:cNvPicPr/>
+                  </pic:nvPicPr>
+                  <pic:blipFill>
+                    <a:blip r:embed="rId23"/>
+                    <a:stretch>
+                      <a:fillRect/>
+                    </a:stretch>
+                  </pic:blipFill>
+                  <pic:spPr>
+                    <a:xfrm>
+                      <a:off x="0" y="0"/>
+                      <a:ext cx="3456561" cy="7498078"/>
+                    </a:xfrm>
+                    <a:prstGeom prst="rect"/>
+                  </pic:spPr>
+                </pic:pic>
+              </a:graphicData>
+            </a:graphic>
+          </wp:inline>
+        </w:drawing>
+      </w:r>
+    </w:p>
+    <w:p>
+      <w:pPr>
+        <w:spacing w:after="160"/>
+        <w:jc w:val="center"/>
+      </w:pPr>
+      <w:r>
+        <w:rPr>
+          <w:rFonts w:ascii="Microsoft YaHei" w:hAnsi="Microsoft YaHei" w:eastAsia="Microsoft YaHei"/>
+          <w:color w:val="667085"/>
+          <w:sz w:val="17"/>
+        </w:rPr>
+        <w:t>图：390×844 租户管理员控制台</w:t>
+      </w:r>
+    </w:p>
+    <w:p>
       <w:r>
         <w:rPr>
           <w:rFonts w:ascii="Microsoft YaHei" w:hAnsi="Microsoft YaHei" w:eastAsia="Microsoft YaHei"/>
@@ -9133,6 +9962,146 @@
           <w:sz w:val="19"/>
         </w:rPr>
         <w:t>13ae3ced4d100e095d751b8a295468964d4c2da8224097affa6ba2bfe1e7d267</w:t>
+      </w:r>
+    </w:p>
+    <w:p>
+      <w:pPr>
+        <w:pStyle w:val="ListBullet"/>
+      </w:pPr>
+      <w:r>
+        <w:rPr>
+          <w:rFonts w:ascii="Consolas" w:hAnsi="Consolas" w:eastAsia="Consolas"/>
+          <w:color w:val="171B26"/>
+          <w:sz w:val="19"/>
+        </w:rPr>
+        <w:t>tenant-application-en.png</w:t>
+      </w:r>
+      <w:r>
+        <w:rPr>
+          <w:rFonts w:ascii="Microsoft YaHei" w:hAnsi="Microsoft YaHei" w:eastAsia="Microsoft YaHei"/>
+          <w:sz w:val="21"/>
+        </w:rPr>
+        <w:t>：</w:t>
+      </w:r>
+      <w:r>
+        <w:rPr>
+          <w:rFonts w:ascii="Consolas" w:hAnsi="Consolas" w:eastAsia="Consolas"/>
+          <w:color w:val="171B26"/>
+          <w:sz w:val="19"/>
+        </w:rPr>
+        <w:t>a0661d1cf673862fe7369274fa664b3d5905f410d00b239e1f53fb7a56e9abb7</w:t>
+      </w:r>
+    </w:p>
+    <w:p>
+      <w:pPr>
+        <w:pStyle w:val="ListBullet"/>
+      </w:pPr>
+      <w:r>
+        <w:rPr>
+          <w:rFonts w:ascii="Consolas" w:hAnsi="Consolas" w:eastAsia="Consolas"/>
+          <w:color w:val="171B26"/>
+          <w:sz w:val="19"/>
+        </w:rPr>
+        <w:t>tenant-registration-mobile-en.png</w:t>
+      </w:r>
+      <w:r>
+        <w:rPr>
+          <w:rFonts w:ascii="Microsoft YaHei" w:hAnsi="Microsoft YaHei" w:eastAsia="Microsoft YaHei"/>
+          <w:sz w:val="21"/>
+        </w:rPr>
+        <w:t>：</w:t>
+      </w:r>
+      <w:r>
+        <w:rPr>
+          <w:rFonts w:ascii="Consolas" w:hAnsi="Consolas" w:eastAsia="Consolas"/>
+          <w:color w:val="171B26"/>
+          <w:sz w:val="19"/>
+        </w:rPr>
+        <w:t>f66a33ba34fab0fd3203381daefe00af8f073d7c24e599d7986174482e15071d</w:t>
+      </w:r>
+    </w:p>
+    <w:p>
+      <w:pPr>
+        <w:pStyle w:val="ListBullet"/>
+      </w:pPr>
+      <w:r>
+        <w:rPr>
+          <w:rFonts w:ascii="Consolas" w:hAnsi="Consolas" w:eastAsia="Consolas"/>
+          <w:color w:val="171B26"/>
+          <w:sz w:val="19"/>
+        </w:rPr>
+        <w:t>platform-tenant-operations-en.png</w:t>
+      </w:r>
+      <w:r>
+        <w:rPr>
+          <w:rFonts w:ascii="Microsoft YaHei" w:hAnsi="Microsoft YaHei" w:eastAsia="Microsoft YaHei"/>
+          <w:sz w:val="21"/>
+        </w:rPr>
+        <w:t>：</w:t>
+      </w:r>
+      <w:r>
+        <w:rPr>
+          <w:rFonts w:ascii="Consolas" w:hAnsi="Consolas" w:eastAsia="Consolas"/>
+          <w:color w:val="171B26"/>
+          <w:sz w:val="19"/>
+        </w:rPr>
+        <w:t>1b72269c80aa2c17ac1ac91467f1d2fb7f4088cd5d0819fb53fac4949866c55a</w:t>
+      </w:r>
+    </w:p>
+    <w:p>
+      <w:pPr>
+        <w:pStyle w:val="ListBullet"/>
+      </w:pPr>
+      <w:r>
+        <w:rPr>
+          <w:rFonts w:ascii="Consolas" w:hAnsi="Consolas" w:eastAsia="Consolas"/>
+          <w:color w:val="171B26"/>
+          <w:sz w:val="19"/>
+        </w:rPr>
+        <w:t>tenant-administration-en.png</w:t>
+      </w:r>
+      <w:r>
+        <w:rPr>
+          <w:rFonts w:ascii="Microsoft YaHei" w:hAnsi="Microsoft YaHei" w:eastAsia="Microsoft YaHei"/>
+          <w:sz w:val="21"/>
+        </w:rPr>
+        <w:t>：</w:t>
+      </w:r>
+      <w:r>
+        <w:rPr>
+          <w:rFonts w:ascii="Consolas" w:hAnsi="Consolas" w:eastAsia="Consolas"/>
+          <w:color w:val="171B26"/>
+          <w:sz w:val="19"/>
+        </w:rPr>
+        <w:t>6246988bd5ac1f363693e1772e0b8e9bdc17cfb1ce57c89eec7180638260904e</w:t>
+      </w:r>
+    </w:p>
+    <w:p>
+      <w:pPr>
+        <w:pStyle w:val="ListBullet"/>
+      </w:pPr>
+      <w:r>
+        <w:rPr>
+          <w:rFonts w:ascii="Consolas" w:hAnsi="Consolas" w:eastAsia="Consolas"/>
+          <w:color w:val="171B26"/>
+          <w:sz w:val="19"/>
+        </w:rPr>
+        <w:t>tenant-administration-mobile-en.png</w:t>
+      </w:r>
+      <w:r>
+        <w:rPr>
+          <w:rFonts w:ascii="Microsoft YaHei" w:hAnsi="Microsoft YaHei" w:eastAsia="Microsoft YaHei"/>
+          <w:sz w:val="21"/>
+        </w:rPr>
+        <w:t>：</w:t>
+      </w:r>
+      <w:r>
+        <w:rPr>
+          <w:rFonts w:ascii="Consolas" w:hAnsi="Consolas" w:eastAsia="Consolas"/>
+          <w:color w:val="171B26"/>
+          <w:sz w:val="19"/>
+        </w:rPr>
+        <w:t>ada46f478359bc9c81d2dd632c21ed9937dd7605d3cdba1f9996fa5cf7c4abce</w:t>
       </w:r>
     </w:p>
     <w:p>
@@ -9320,7 +10289,7 @@
                 <w:color w:val="171B26"/>
                 <w:sz w:val="17"/>
               </w:rPr>
-              <w:t>location 仍未由所有服务端链路强制注入</w:t>
+              <w:t>location 尚未完成全部交易服务攻击面证明</w:t>
             </w:r>
           </w:p>
         </w:tc>
@@ -9346,7 +10315,7 @@
                 <w:color w:val="171B26"/>
                 <w:sz w:val="17"/>
               </w:rPr>
-              <w:t>登录错租户拒绝；多数交易 key/表已 location 化</w:t>
+              <w:t>登录/注册/平台/租户管理已使用权威会话并完成双租户越权拒绝；交易 key/表已 location 化</w:t>
             </w:r>
           </w:p>
         </w:tc>
@@ -9372,7 +10341,7 @@
                 <w:color w:val="171B26"/>
                 <w:sz w:val="17"/>
               </w:rPr>
-              <w:t>完成会话权威 location、全 DAO/Topic/缓存/锁攻击测试</w:t>
+              <w:t>继续完成 Order/Trade/MD/Liq 全 DAO、Topic、缓存、锁和重放攻击测试；GW 保持可选增强而非硬编码 SaaS</w:t>
             </w:r>
           </w:p>
         </w:tc>
@@ -10184,6 +11153,222 @@
                 <w:color w:val="171B26"/>
                 <w:sz w:val="17"/>
               </w:rPr>
+              <w:t>多租户控制面仍是第一阶段</w:t>
+            </w:r>
+          </w:p>
+        </w:tc>
+        <w:tc>
+          <w:tcPr>
+            <w:tcW w:type="dxa" w:w="2438"/>
+            <w:vAlign w:val="center"/>
+            <w:tcMar>
+              <w:top w:w="90" w:type="dxa"/>
+              <w:start w:w="90" w:type="dxa"/>
+              <w:bottom w:w="90" w:type="dxa"/>
+              <w:end w:w="90" w:type="dxa"/>
+            </w:tcMar>
+          </w:tcPr>
+          <w:p>
+            <w:pPr>
+              <w:spacing w:after="0"/>
+            </w:pPr>
+            <w:r>
+              <w:rPr>
+                <w:rFonts w:ascii="Microsoft YaHei" w:hAnsi="Microsoft YaHei" w:eastAsia="Microsoft YaHei"/>
+                <w:b w:val="0"/>
+                <w:color w:val="171B26"/>
+                <w:sz w:val="17"/>
+              </w:rPr>
+              <w:t>申请、审批、URL、注册、用户、品种、API Key、Robot 配置、交易记录、设置和审计已验收</w:t>
+            </w:r>
+          </w:p>
+        </w:tc>
+        <w:tc>
+          <w:tcPr>
+            <w:tcW w:type="dxa" w:w="2438"/>
+            <w:vAlign w:val="center"/>
+            <w:tcMar>
+              <w:top w:w="90" w:type="dxa"/>
+              <w:start w:w="90" w:type="dxa"/>
+              <w:bottom w:w="90" w:type="dxa"/>
+              <w:end w:w="90" w:type="dxa"/>
+            </w:tcMar>
+          </w:tcPr>
+          <w:p>
+            <w:pPr>
+              <w:spacing w:after="0"/>
+            </w:pPr>
+            <w:r>
+              <w:rPr>
+                <w:rFonts w:ascii="Microsoft YaHei" w:hAnsi="Microsoft YaHei" w:eastAsia="Microsoft YaHei"/>
+                <w:b w:val="0"/>
+                <w:color w:val="171B26"/>
+                <w:sz w:val="17"/>
+              </w:rPr>
+              <w:t>自定义域名/证书、套餐配额、2FA、完整 RBAC、导出审批和平台分权</w:t>
+            </w:r>
+          </w:p>
+        </w:tc>
+      </w:tr>
+      <w:tr>
+        <w:tc>
+          <w:tcPr>
+            <w:tcW w:type="dxa" w:w="2438"/>
+            <w:vAlign w:val="center"/>
+            <w:tcMar>
+              <w:top w:w="90" w:type="dxa"/>
+              <w:start w:w="90" w:type="dxa"/>
+              <w:bottom w:w="90" w:type="dxa"/>
+              <w:end w:w="90" w:type="dxa"/>
+            </w:tcMar>
+            <w:shd w:fill="F2F4F7"/>
+          </w:tcPr>
+          <w:p>
+            <w:pPr>
+              <w:spacing w:after="0"/>
+            </w:pPr>
+            <w:r>
+              <w:rPr>
+                <w:rFonts w:ascii="Microsoft YaHei" w:hAnsi="Microsoft YaHei" w:eastAsia="Microsoft YaHei"/>
+                <w:b w:val="0"/>
+                <w:color w:val="171B26"/>
+                <w:sz w:val="17"/>
+              </w:rPr>
+              <w:t>P1</w:t>
+            </w:r>
+          </w:p>
+        </w:tc>
+        <w:tc>
+          <w:tcPr>
+            <w:tcW w:type="dxa" w:w="2438"/>
+            <w:vAlign w:val="center"/>
+            <w:tcMar>
+              <w:top w:w="90" w:type="dxa"/>
+              <w:start w:w="90" w:type="dxa"/>
+              <w:bottom w:w="90" w:type="dxa"/>
+              <w:end w:w="90" w:type="dxa"/>
+            </w:tcMar>
+            <w:shd w:fill="F2F4F7"/>
+          </w:tcPr>
+          <w:p>
+            <w:pPr>
+              <w:spacing w:after="0"/>
+            </w:pPr>
+            <w:r>
+              <w:rPr>
+                <w:rFonts w:ascii="Microsoft YaHei" w:hAnsi="Microsoft YaHei" w:eastAsia="Microsoft YaHei"/>
+                <w:b w:val="0"/>
+                <w:color w:val="171B26"/>
+                <w:sz w:val="17"/>
+              </w:rPr>
+              <w:t>Robot 仅完成租户配置控制面</w:t>
+            </w:r>
+          </w:p>
+        </w:tc>
+        <w:tc>
+          <w:tcPr>
+            <w:tcW w:type="dxa" w:w="2438"/>
+            <w:vAlign w:val="center"/>
+            <w:tcMar>
+              <w:top w:w="90" w:type="dxa"/>
+              <w:start w:w="90" w:type="dxa"/>
+              <w:bottom w:w="90" w:type="dxa"/>
+              <w:end w:w="90" w:type="dxa"/>
+            </w:tcMar>
+            <w:shd w:fill="F2F4F7"/>
+          </w:tcPr>
+          <w:p>
+            <w:pPr>
+              <w:spacing w:after="0"/>
+            </w:pPr>
+            <w:r>
+              <w:rPr>
+                <w:rFonts w:ascii="Microsoft YaHei" w:hAnsi="Microsoft YaHei" w:eastAsia="Microsoft YaHei"/>
+                <w:b w:val="0"/>
+                <w:color w:val="171B26"/>
+                <w:sz w:val="17"/>
+              </w:rPr>
+              <w:t>可配置 API Key、报价档位和对冲参数</w:t>
+            </w:r>
+          </w:p>
+        </w:tc>
+        <w:tc>
+          <w:tcPr>
+            <w:tcW w:type="dxa" w:w="2438"/>
+            <w:vAlign w:val="center"/>
+            <w:tcMar>
+              <w:top w:w="90" w:type="dxa"/>
+              <w:start w:w="90" w:type="dxa"/>
+              <w:bottom w:w="90" w:type="dxa"/>
+              <w:end w:w="90" w:type="dxa"/>
+            </w:tcMar>
+            <w:shd w:fill="F2F4F7"/>
+          </w:tcPr>
+          <w:p>
+            <w:pPr>
+              <w:spacing w:after="0"/>
+            </w:pPr>
+            <w:r>
+              <w:rPr>
+                <w:rFonts w:ascii="Microsoft YaHei" w:hAnsi="Microsoft YaHei" w:eastAsia="Microsoft YaHei"/>
+                <w:b w:val="0"/>
+                <w:color w:val="171B26"/>
+                <w:sz w:val="17"/>
+              </w:rPr>
+              <w:t>部署 RobotSvr，完成 APSSvr 行情、真实报单、库存风控和外部反向对冲验收</w:t>
+            </w:r>
+          </w:p>
+        </w:tc>
+      </w:tr>
+      <w:tr>
+        <w:tc>
+          <w:tcPr>
+            <w:tcW w:type="dxa" w:w="2438"/>
+            <w:vAlign w:val="center"/>
+            <w:tcMar>
+              <w:top w:w="90" w:type="dxa"/>
+              <w:start w:w="90" w:type="dxa"/>
+              <w:bottom w:w="90" w:type="dxa"/>
+              <w:end w:w="90" w:type="dxa"/>
+            </w:tcMar>
+          </w:tcPr>
+          <w:p>
+            <w:pPr>
+              <w:spacing w:after="0"/>
+            </w:pPr>
+            <w:r>
+              <w:rPr>
+                <w:rFonts w:ascii="Microsoft YaHei" w:hAnsi="Microsoft YaHei" w:eastAsia="Microsoft YaHei"/>
+                <w:b w:val="0"/>
+                <w:color w:val="171B26"/>
+                <w:sz w:val="17"/>
+              </w:rPr>
+              <w:t>P1</w:t>
+            </w:r>
+          </w:p>
+        </w:tc>
+        <w:tc>
+          <w:tcPr>
+            <w:tcW w:type="dxa" w:w="2438"/>
+            <w:vAlign w:val="center"/>
+            <w:tcMar>
+              <w:top w:w="90" w:type="dxa"/>
+              <w:start w:w="90" w:type="dxa"/>
+              <w:bottom w:w="90" w:type="dxa"/>
+              <w:end w:w="90" w:type="dxa"/>
+            </w:tcMar>
+          </w:tcPr>
+          <w:p>
+            <w:pPr>
+              <w:spacing w:after="0"/>
+            </w:pPr>
+            <w:r>
+              <w:rPr>
+                <w:rFonts w:ascii="Microsoft YaHei" w:hAnsi="Microsoft YaHei" w:eastAsia="Microsoft YaHei"/>
+                <w:b w:val="0"/>
+                <w:color w:val="171B26"/>
+                <w:sz w:val="17"/>
+              </w:rPr>
               <w:t>单机基础设施</w:t>
             </w:r>
           </w:p>
@@ -10280,7 +11465,7 @@
           <w:rFonts w:ascii="Microsoft YaHei" w:hAnsi="Microsoft YaHei" w:eastAsia="Microsoft YaHei"/>
           <w:sz w:val="21"/>
         </w:rPr>
-        <w:t>建立服务端权威 location 的可选 SaaS 安全插件，完成跨租户请求、订阅、缓存、锁和数据库攻击测试，同时保持 GW 在非 SaaS 系统中的独立性。</w:t>
+        <w:t>收口服务端权威 location：完成 Order/Trade/MD/Liq 跨租户请求、订阅、缓存、锁、重放和数据库攻击测试；如需前置防御，以可选 SaaS GW 插件实现，保持通用 GW 独立性。</w:t>
       </w:r>
     </w:p>
     <w:p>
@@ -10292,7 +11477,7 @@
           <w:rFonts w:ascii="Microsoft YaHei" w:hAnsi="Microsoft YaHei" w:eastAsia="Microsoft YaHei"/>
           <w:sz w:val="21"/>
         </w:rPr>
-        <w:t>实现租户申请/审批、独立 URL、租户内注册、租户管理员、用户/品种/费率/风控/Robot 和审计。</w:t>
+        <w:t>部署并验收 RobotSvr 的 APSSvr 行情、租户 API Key 报单、库存控制、熔断和外部反向对冲；补齐追踪止损、Close on Trigger、完整账户模式等交易产品。</w:t>
       </w:r>
     </w:p>
     <w:p>
@@ -10304,7 +11489,19 @@
           <w:rFonts w:ascii="Microsoft YaHei" w:hAnsi="Microsoft YaHei" w:eastAsia="Microsoft YaHei"/>
           <w:sz w:val="21"/>
         </w:rPr>
-        <w:t>发布版本化 REST/WebSocket API、HMAC/RSA/Ed25519、API key 权限/IP 白名单、私有流、序号恢复和分层限流。</w:t>
+        <w:t>完成多租户第二阶段：自定义域名/证书、套餐配额、2FA、平台/租户 RBAC、导出审批、品牌资产和用量计费。</w:t>
+      </w:r>
+    </w:p>
+    <w:p>
+      <w:pPr>
+        <w:pStyle w:val="ListNumber"/>
+      </w:pPr>
+      <w:r>
+        <w:rPr>
+          <w:rFonts w:ascii="Microsoft YaHei" w:hAnsi="Microsoft YaHei" w:eastAsia="Microsoft YaHei"/>
+          <w:sz w:val="21"/>
+        </w:rPr>
+        <w:t>发布版本化 REST/WebSocket API、HMAC/RSA/Ed25519、API Key 权限/IP 白名单、私有流、序号恢复和分层限流。</w:t>
       </w:r>
     </w:p>
     <w:p>

</xml_diff>